<commit_message>
feat: Adding Process analysis section
</commit_message>
<xml_diff>
--- a/01.WORKING_SPACE/duy/25410194_Nguyen_Thanh_Duy_quy_trinh_tiep_nhan_don_hang.docx
+++ b/01.WORKING_SPACE/duy/25410194_Nguyen_Thanh_Duy_quy_trinh_tiep_nhan_don_hang.docx
@@ -2143,6 +2143,2263 @@
         <w:t>hàng</w:t>
       </w:r>
       <w:proofErr w:type="spellEnd"/>
+    </w:p>
+    <w:p>
+      <w:pPr>
+        <w:pStyle w:val="Heading3"/>
+        <w:spacing w:line="240" w:lineRule="auto"/>
+      </w:pPr>
+      <w:r>
+        <w:t>1.2. Phân tích quy trình</w:t>
+      </w:r>
+    </w:p>
+    <w:p>
+      <w:r>
+        <w:t xml:space="preserve">Khách hàng chính là người gửi hoặc đối tác thương mại cần tạo một yêu cầu giao hàng; khách hàng thứ cấp là người nhận, người chịu ảnh hưởng bởi độ chính xác của địa chỉ và thời gian dự kiến. Giá trị của quy trình là biến một yêu cầu rời rạc thành bản ghi điện tử có thể theo dõi, có dịch vụ/cước minh bạch và có mã xác nhận. ORDER_NUMBER chỉ chứng minh bước tạo đơn điện tử thành công; việc Viettel Post thực sự nhận kiện và kiểm tra hàng/chứng từ là </w:t>
+      </w:r>
+      <w:proofErr w:type="spellStart"/>
+      <w:r>
+        <w:t>một</w:t>
+      </w:r>
+      <w:proofErr w:type="spellEnd"/>
+      <w:r>
+        <w:t xml:space="preserve"> </w:t>
+      </w:r>
+      <w:proofErr w:type="spellStart"/>
+      <w:r>
+        <w:t>điểm</w:t>
+      </w:r>
+      <w:proofErr w:type="spellEnd"/>
+      <w:r>
+        <w:t xml:space="preserve"> </w:t>
+      </w:r>
+      <w:proofErr w:type="spellStart"/>
+      <w:r>
+        <w:t>bàn</w:t>
+      </w:r>
+      <w:proofErr w:type="spellEnd"/>
+      <w:r>
+        <w:t xml:space="preserve"> </w:t>
+      </w:r>
+      <w:proofErr w:type="spellStart"/>
+      <w:r>
+        <w:t>giao</w:t>
+      </w:r>
+      <w:proofErr w:type="spellEnd"/>
+      <w:r>
+        <w:t xml:space="preserve"> ở </w:t>
+      </w:r>
+      <w:proofErr w:type="spellStart"/>
+      <w:r>
+        <w:t>bước</w:t>
+      </w:r>
+      <w:proofErr w:type="spellEnd"/>
+      <w:r>
+        <w:t xml:space="preserve"> </w:t>
+      </w:r>
+      <w:proofErr w:type="spellStart"/>
+      <w:r>
+        <w:t>sau</w:t>
+      </w:r>
+      <w:proofErr w:type="spellEnd"/>
+      <w:r>
+        <w:t>.</w:t>
+      </w:r>
+    </w:p>
+    <w:p>
+      <w:r>
+        <w:t xml:space="preserve">API công khai cho phép sửa khi ORDER_STATUS &lt; 200 </w:t>
+      </w:r>
+      <w:proofErr w:type="spellStart"/>
+      <w:r>
+        <w:t>và</w:t>
+      </w:r>
+      <w:proofErr w:type="spellEnd"/>
+      <w:r>
+        <w:t xml:space="preserve"> </w:t>
+      </w:r>
+      <w:proofErr w:type="spellStart"/>
+      <w:r>
+        <w:t>mô</w:t>
+      </w:r>
+      <w:proofErr w:type="spellEnd"/>
+      <w:r>
+        <w:t xml:space="preserve"> </w:t>
+      </w:r>
+      <w:proofErr w:type="spellStart"/>
+      <w:r>
+        <w:t>tả</w:t>
+      </w:r>
+      <w:proofErr w:type="spellEnd"/>
+      <w:r>
+        <w:t xml:space="preserve"> TYPE=4 </w:t>
+      </w:r>
+      <w:proofErr w:type="spellStart"/>
+      <w:r>
+        <w:t>để</w:t>
+      </w:r>
+      <w:proofErr w:type="spellEnd"/>
+      <w:r>
+        <w:t xml:space="preserve"> </w:t>
+      </w:r>
+      <w:proofErr w:type="spellStart"/>
+      <w:r>
+        <w:t>hủy</w:t>
+      </w:r>
+      <w:proofErr w:type="spellEnd"/>
+      <w:r>
+        <w:t xml:space="preserve">; </w:t>
+      </w:r>
+      <w:proofErr w:type="spellStart"/>
+      <w:r>
+        <w:t>đây</w:t>
+      </w:r>
+      <w:proofErr w:type="spellEnd"/>
+      <w:r>
+        <w:t xml:space="preserve"> </w:t>
+      </w:r>
+      <w:proofErr w:type="spellStart"/>
+      <w:r>
+        <w:t>chỉ</w:t>
+      </w:r>
+      <w:proofErr w:type="spellEnd"/>
+      <w:r>
+        <w:t xml:space="preserve"> </w:t>
+      </w:r>
+      <w:proofErr w:type="spellStart"/>
+      <w:r>
+        <w:t>là</w:t>
+      </w:r>
+      <w:proofErr w:type="spellEnd"/>
+      <w:r>
+        <w:t xml:space="preserve"> </w:t>
+      </w:r>
+      <w:proofErr w:type="spellStart"/>
+      <w:r>
+        <w:t>điều</w:t>
+      </w:r>
+      <w:proofErr w:type="spellEnd"/>
+      <w:r>
+        <w:t xml:space="preserve"> kiện kỹ thuật tham khảo, không </w:t>
+      </w:r>
+      <w:proofErr w:type="spellStart"/>
+      <w:r>
+        <w:t>suy</w:t>
+      </w:r>
+      <w:proofErr w:type="spellEnd"/>
+      <w:r>
+        <w:t xml:space="preserve"> </w:t>
+      </w:r>
+      <w:proofErr w:type="spellStart"/>
+      <w:r>
+        <w:t>rộng</w:t>
+      </w:r>
+      <w:proofErr w:type="spellEnd"/>
+      <w:r>
+        <w:t xml:space="preserve"> </w:t>
+      </w:r>
+      <w:proofErr w:type="spellStart"/>
+      <w:r>
+        <w:t>thành</w:t>
+      </w:r>
+      <w:proofErr w:type="spellEnd"/>
+      <w:r>
+        <w:t xml:space="preserve"> </w:t>
+      </w:r>
+      <w:proofErr w:type="spellStart"/>
+      <w:r>
+        <w:t>quy</w:t>
+      </w:r>
+      <w:proofErr w:type="spellEnd"/>
+      <w:r>
+        <w:t xml:space="preserve"> </w:t>
+      </w:r>
+      <w:proofErr w:type="spellStart"/>
+      <w:r>
+        <w:t>trình</w:t>
+      </w:r>
+      <w:proofErr w:type="spellEnd"/>
+      <w:r>
+        <w:t xml:space="preserve"> </w:t>
+      </w:r>
+      <w:proofErr w:type="spellStart"/>
+      <w:r>
+        <w:t>nội</w:t>
+      </w:r>
+      <w:proofErr w:type="spellEnd"/>
+      <w:r>
+        <w:t xml:space="preserve"> </w:t>
+      </w:r>
+      <w:proofErr w:type="spellStart"/>
+      <w:r>
+        <w:t>bộ</w:t>
+      </w:r>
+      <w:proofErr w:type="spellEnd"/>
+      <w:r>
+        <w:t>.</w:t>
+      </w:r>
+    </w:p>
+    <w:p>
+      <w:pPr>
+        <w:pStyle w:val="Caption1"/>
+        <w:jc w:val="both"/>
+        <w:rPr>
+          <w:rFonts w:cs="Times New Roman"/>
+        </w:rPr>
+      </w:pPr>
+    </w:p>
+    <w:tbl>
+      <w:tblPr>
+        <w:tblW w:w="8794" w:type="dxa"/>
+        <w:tblInd w:w="120" w:type="dxa"/>
+        <w:tblBorders>
+          <w:top w:val="single" w:sz="6" w:space="0" w:color="9EADBA"/>
+          <w:left w:val="single" w:sz="6" w:space="0" w:color="9EADBA"/>
+          <w:bottom w:val="single" w:sz="6" w:space="0" w:color="9EADBA"/>
+          <w:right w:val="single" w:sz="6" w:space="0" w:color="9EADBA"/>
+          <w:insideH w:val="single" w:sz="6" w:space="0" w:color="9EADBA"/>
+          <w:insideV w:val="single" w:sz="6" w:space="0" w:color="9EADBA"/>
+        </w:tblBorders>
+        <w:tblLayout w:type="fixed"/>
+        <w:tblLook w:val="04A0" w:firstRow="1" w:lastRow="0" w:firstColumn="1" w:lastColumn="0" w:noHBand="0" w:noVBand="1"/>
+      </w:tblPr>
+      <w:tblGrid>
+        <w:gridCol w:w="1532"/>
+        <w:gridCol w:w="3517"/>
+        <w:gridCol w:w="1702"/>
+        <w:gridCol w:w="2043"/>
+      </w:tblGrid>
+      <w:tr>
+        <w:trPr>
+          <w:cantSplit/>
+          <w:tblHeader/>
+        </w:trPr>
+        <w:tc>
+          <w:tcPr>
+            <w:tcW w:w="1532" w:type="dxa"/>
+            <w:shd w:val="clear" w:color="auto" w:fill="DCE6F1"/>
+            <w:tcMar>
+              <w:top w:w="80" w:type="dxa"/>
+              <w:left w:w="120" w:type="dxa"/>
+              <w:bottom w:w="80" w:type="dxa"/>
+              <w:right w:w="120" w:type="dxa"/>
+            </w:tcMar>
+            <w:vAlign w:val="center"/>
+          </w:tcPr>
+          <w:p>
+            <w:pPr>
+              <w:keepNext/>
+              <w:spacing w:after="0" w:line="240" w:lineRule="auto"/>
+              <w:jc w:val="center"/>
+            </w:pPr>
+            <w:proofErr w:type="spellStart"/>
+            <w:r>
+              <w:rPr>
+                <w:b/>
+                <w:sz w:val="22"/>
+              </w:rPr>
+              <w:t>Điểm</w:t>
+            </w:r>
+            <w:proofErr w:type="spellEnd"/>
+            <w:r>
+              <w:rPr>
+                <w:b/>
+                <w:sz w:val="22"/>
+              </w:rPr>
+              <w:t xml:space="preserve"> </w:t>
+            </w:r>
+            <w:proofErr w:type="spellStart"/>
+            <w:r>
+              <w:rPr>
+                <w:b/>
+                <w:sz w:val="22"/>
+              </w:rPr>
+              <w:t>quyết</w:t>
+            </w:r>
+            <w:proofErr w:type="spellEnd"/>
+            <w:r>
+              <w:rPr>
+                <w:b/>
+                <w:sz w:val="22"/>
+              </w:rPr>
+              <w:t xml:space="preserve"> </w:t>
+            </w:r>
+            <w:proofErr w:type="spellStart"/>
+            <w:r>
+              <w:rPr>
+                <w:b/>
+                <w:sz w:val="22"/>
+              </w:rPr>
+              <w:t>định</w:t>
+            </w:r>
+            <w:proofErr w:type="spellEnd"/>
+          </w:p>
+        </w:tc>
+        <w:tc>
+          <w:tcPr>
+            <w:tcW w:w="3517" w:type="dxa"/>
+            <w:shd w:val="clear" w:color="auto" w:fill="DCE6F1"/>
+            <w:tcMar>
+              <w:top w:w="80" w:type="dxa"/>
+              <w:left w:w="120" w:type="dxa"/>
+              <w:bottom w:w="80" w:type="dxa"/>
+              <w:right w:w="120" w:type="dxa"/>
+            </w:tcMar>
+            <w:vAlign w:val="center"/>
+          </w:tcPr>
+          <w:p>
+            <w:pPr>
+              <w:keepNext/>
+              <w:spacing w:after="0" w:line="240" w:lineRule="auto"/>
+              <w:jc w:val="center"/>
+            </w:pPr>
+            <w:r>
+              <w:rPr>
+                <w:b/>
+                <w:sz w:val="22"/>
+              </w:rPr>
+              <w:t>Điều kiện kiểm tra</w:t>
+            </w:r>
+          </w:p>
+        </w:tc>
+        <w:tc>
+          <w:tcPr>
+            <w:tcW w:w="1702" w:type="dxa"/>
+            <w:shd w:val="clear" w:color="auto" w:fill="DCE6F1"/>
+            <w:tcMar>
+              <w:top w:w="80" w:type="dxa"/>
+              <w:left w:w="120" w:type="dxa"/>
+              <w:bottom w:w="80" w:type="dxa"/>
+              <w:right w:w="120" w:type="dxa"/>
+            </w:tcMar>
+            <w:vAlign w:val="center"/>
+          </w:tcPr>
+          <w:p>
+            <w:pPr>
+              <w:keepNext/>
+              <w:spacing w:after="0" w:line="240" w:lineRule="auto"/>
+              <w:jc w:val="center"/>
+            </w:pPr>
+            <w:r>
+              <w:rPr>
+                <w:b/>
+                <w:sz w:val="22"/>
+              </w:rPr>
+              <w:t>Nhánh đạt</w:t>
+            </w:r>
+          </w:p>
+        </w:tc>
+        <w:tc>
+          <w:tcPr>
+            <w:tcW w:w="2043" w:type="dxa"/>
+            <w:shd w:val="clear" w:color="auto" w:fill="DCE6F1"/>
+            <w:tcMar>
+              <w:top w:w="80" w:type="dxa"/>
+              <w:left w:w="120" w:type="dxa"/>
+              <w:bottom w:w="80" w:type="dxa"/>
+              <w:right w:w="120" w:type="dxa"/>
+            </w:tcMar>
+            <w:vAlign w:val="center"/>
+          </w:tcPr>
+          <w:p>
+            <w:pPr>
+              <w:keepNext/>
+              <w:spacing w:after="0" w:line="240" w:lineRule="auto"/>
+              <w:jc w:val="center"/>
+            </w:pPr>
+            <w:r>
+              <w:rPr>
+                <w:b/>
+                <w:sz w:val="22"/>
+              </w:rPr>
+              <w:t>Nhánh không đạt</w:t>
+            </w:r>
+          </w:p>
+        </w:tc>
+      </w:tr>
+      <w:tr>
+        <w:trPr>
+          <w:cantSplit/>
+        </w:trPr>
+        <w:tc>
+          <w:tcPr>
+            <w:tcW w:w="1532" w:type="dxa"/>
+            <w:tcMar>
+              <w:top w:w="80" w:type="dxa"/>
+              <w:left w:w="120" w:type="dxa"/>
+              <w:bottom w:w="80" w:type="dxa"/>
+              <w:right w:w="120" w:type="dxa"/>
+            </w:tcMar>
+            <w:vAlign w:val="center"/>
+          </w:tcPr>
+          <w:p>
+            <w:pPr>
+              <w:spacing w:after="0" w:line="240" w:lineRule="auto"/>
+              <w:jc w:val="center"/>
+            </w:pPr>
+            <w:r>
+              <w:rPr>
+                <w:sz w:val="22"/>
+              </w:rPr>
+              <w:t>Dữ liệu hợp lệ?</w:t>
+            </w:r>
+          </w:p>
+        </w:tc>
+        <w:tc>
+          <w:tcPr>
+            <w:tcW w:w="3517" w:type="dxa"/>
+            <w:tcMar>
+              <w:top w:w="80" w:type="dxa"/>
+              <w:left w:w="120" w:type="dxa"/>
+              <w:bottom w:w="80" w:type="dxa"/>
+              <w:right w:w="120" w:type="dxa"/>
+            </w:tcMar>
+            <w:vAlign w:val="center"/>
+          </w:tcPr>
+          <w:p>
+            <w:pPr>
+              <w:spacing w:after="0" w:line="240" w:lineRule="auto"/>
+              <w:jc w:val="left"/>
+            </w:pPr>
+            <w:r>
+              <w:rPr>
+                <w:sz w:val="22"/>
+              </w:rPr>
+              <w:t>Đủ trường, định dạng đúng, địa chỉ/số điện thoại chuẩn hóa được.</w:t>
+            </w:r>
+          </w:p>
+        </w:tc>
+        <w:tc>
+          <w:tcPr>
+            <w:tcW w:w="1702" w:type="dxa"/>
+            <w:tcMar>
+              <w:top w:w="80" w:type="dxa"/>
+              <w:left w:w="120" w:type="dxa"/>
+              <w:bottom w:w="80" w:type="dxa"/>
+              <w:right w:w="120" w:type="dxa"/>
+            </w:tcMar>
+            <w:vAlign w:val="center"/>
+          </w:tcPr>
+          <w:p>
+            <w:pPr>
+              <w:spacing w:after="0" w:line="240" w:lineRule="auto"/>
+              <w:jc w:val="left"/>
+            </w:pPr>
+            <w:r>
+              <w:rPr>
+                <w:sz w:val="22"/>
+              </w:rPr>
+              <w:t>Tiếp tục tra dịch vụ.</w:t>
+            </w:r>
+          </w:p>
+        </w:tc>
+        <w:tc>
+          <w:tcPr>
+            <w:tcW w:w="2043" w:type="dxa"/>
+            <w:tcMar>
+              <w:top w:w="80" w:type="dxa"/>
+              <w:left w:w="120" w:type="dxa"/>
+              <w:bottom w:w="80" w:type="dxa"/>
+              <w:right w:w="120" w:type="dxa"/>
+            </w:tcMar>
+            <w:vAlign w:val="center"/>
+          </w:tcPr>
+          <w:p>
+            <w:pPr>
+              <w:spacing w:after="0" w:line="240" w:lineRule="auto"/>
+              <w:jc w:val="left"/>
+            </w:pPr>
+            <w:r>
+              <w:rPr>
+                <w:sz w:val="22"/>
+              </w:rPr>
+              <w:t>Sửa/bổ sung hoặc hủy.</w:t>
+            </w:r>
+          </w:p>
+        </w:tc>
+      </w:tr>
+      <w:tr>
+        <w:trPr>
+          <w:cantSplit/>
+        </w:trPr>
+        <w:tc>
+          <w:tcPr>
+            <w:tcW w:w="1532" w:type="dxa"/>
+            <w:tcMar>
+              <w:top w:w="80" w:type="dxa"/>
+              <w:left w:w="120" w:type="dxa"/>
+              <w:bottom w:w="80" w:type="dxa"/>
+              <w:right w:w="120" w:type="dxa"/>
+            </w:tcMar>
+            <w:vAlign w:val="center"/>
+          </w:tcPr>
+          <w:p>
+            <w:pPr>
+              <w:spacing w:after="0" w:line="240" w:lineRule="auto"/>
+              <w:jc w:val="center"/>
+            </w:pPr>
+            <w:r>
+              <w:rPr>
+                <w:sz w:val="22"/>
+              </w:rPr>
+              <w:t>Có dịch vụ/cước?</w:t>
+            </w:r>
+          </w:p>
+        </w:tc>
+        <w:tc>
+          <w:tcPr>
+            <w:tcW w:w="3517" w:type="dxa"/>
+            <w:tcMar>
+              <w:top w:w="80" w:type="dxa"/>
+              <w:left w:w="120" w:type="dxa"/>
+              <w:bottom w:w="80" w:type="dxa"/>
+              <w:right w:w="120" w:type="dxa"/>
+            </w:tcMar>
+            <w:vAlign w:val="center"/>
+          </w:tcPr>
+          <w:p>
+            <w:pPr>
+              <w:spacing w:after="0" w:line="240" w:lineRule="auto"/>
+              <w:jc w:val="left"/>
+            </w:pPr>
+            <w:r>
+              <w:rPr>
+                <w:sz w:val="22"/>
+              </w:rPr>
+              <w:t>Có dịch vụ phù hợp với cặp địa chỉ, khối lượng và điều kiện hàng.</w:t>
+            </w:r>
+          </w:p>
+        </w:tc>
+        <w:tc>
+          <w:tcPr>
+            <w:tcW w:w="1702" w:type="dxa"/>
+            <w:tcMar>
+              <w:top w:w="80" w:type="dxa"/>
+              <w:left w:w="120" w:type="dxa"/>
+              <w:bottom w:w="80" w:type="dxa"/>
+              <w:right w:w="120" w:type="dxa"/>
+            </w:tcMar>
+            <w:vAlign w:val="center"/>
+          </w:tcPr>
+          <w:p>
+            <w:pPr>
+              <w:spacing w:after="0" w:line="240" w:lineRule="auto"/>
+              <w:jc w:val="left"/>
+            </w:pPr>
+            <w:r>
+              <w:rPr>
+                <w:sz w:val="22"/>
+              </w:rPr>
+              <w:t>Hiển thị phí/thời gian.</w:t>
+            </w:r>
+          </w:p>
+        </w:tc>
+        <w:tc>
+          <w:tcPr>
+            <w:tcW w:w="2043" w:type="dxa"/>
+            <w:tcMar>
+              <w:top w:w="80" w:type="dxa"/>
+              <w:left w:w="120" w:type="dxa"/>
+              <w:bottom w:w="80" w:type="dxa"/>
+              <w:right w:w="120" w:type="dxa"/>
+            </w:tcMar>
+            <w:vAlign w:val="center"/>
+          </w:tcPr>
+          <w:p>
+            <w:pPr>
+              <w:spacing w:after="0" w:line="240" w:lineRule="auto"/>
+              <w:jc w:val="left"/>
+            </w:pPr>
+            <w:r>
+              <w:rPr>
+                <w:sz w:val="22"/>
+              </w:rPr>
+              <w:t>Chọn lại dịch vụ hoặc xử lý ngoại lệ.</w:t>
+            </w:r>
+          </w:p>
+        </w:tc>
+      </w:tr>
+      <w:tr>
+        <w:trPr>
+          <w:cantSplit/>
+        </w:trPr>
+        <w:tc>
+          <w:tcPr>
+            <w:tcW w:w="1532" w:type="dxa"/>
+            <w:tcMar>
+              <w:top w:w="80" w:type="dxa"/>
+              <w:left w:w="120" w:type="dxa"/>
+              <w:bottom w:w="80" w:type="dxa"/>
+              <w:right w:w="120" w:type="dxa"/>
+            </w:tcMar>
+            <w:vAlign w:val="center"/>
+          </w:tcPr>
+          <w:p>
+            <w:pPr>
+              <w:spacing w:after="0" w:line="240" w:lineRule="auto"/>
+              <w:jc w:val="center"/>
+            </w:pPr>
+            <w:proofErr w:type="spellStart"/>
+            <w:r>
+              <w:rPr>
+                <w:sz w:val="22"/>
+              </w:rPr>
+              <w:lastRenderedPageBreak/>
+              <w:t>Không</w:t>
+            </w:r>
+            <w:proofErr w:type="spellEnd"/>
+            <w:r>
+              <w:rPr>
+                <w:sz w:val="22"/>
+              </w:rPr>
+              <w:t xml:space="preserve"> </w:t>
+            </w:r>
+            <w:proofErr w:type="spellStart"/>
+            <w:r>
+              <w:rPr>
+                <w:sz w:val="22"/>
+              </w:rPr>
+              <w:t>phát</w:t>
+            </w:r>
+            <w:proofErr w:type="spellEnd"/>
+            <w:r>
+              <w:rPr>
+                <w:sz w:val="22"/>
+              </w:rPr>
+              <w:t xml:space="preserve"> </w:t>
+            </w:r>
+            <w:proofErr w:type="spellStart"/>
+            <w:r>
+              <w:rPr>
+                <w:sz w:val="22"/>
+              </w:rPr>
+              <w:t>hiện</w:t>
+            </w:r>
+            <w:proofErr w:type="spellEnd"/>
+            <w:r>
+              <w:rPr>
+                <w:sz w:val="22"/>
+              </w:rPr>
+              <w:t xml:space="preserve"> </w:t>
+            </w:r>
+            <w:proofErr w:type="spellStart"/>
+            <w:r>
+              <w:rPr>
+                <w:sz w:val="22"/>
+              </w:rPr>
+              <w:t>đơn</w:t>
+            </w:r>
+            <w:proofErr w:type="spellEnd"/>
+            <w:r>
+              <w:rPr>
+                <w:sz w:val="22"/>
+              </w:rPr>
+              <w:t xml:space="preserve"> </w:t>
+            </w:r>
+            <w:proofErr w:type="spellStart"/>
+            <w:r>
+              <w:rPr>
+                <w:sz w:val="22"/>
+              </w:rPr>
+              <w:t>trùng</w:t>
+            </w:r>
+            <w:proofErr w:type="spellEnd"/>
+            <w:r>
+              <w:rPr>
+                <w:sz w:val="22"/>
+              </w:rPr>
+              <w:t>?</w:t>
+            </w:r>
+          </w:p>
+        </w:tc>
+        <w:tc>
+          <w:tcPr>
+            <w:tcW w:w="3517" w:type="dxa"/>
+            <w:tcMar>
+              <w:top w:w="80" w:type="dxa"/>
+              <w:left w:w="120" w:type="dxa"/>
+              <w:bottom w:w="80" w:type="dxa"/>
+              <w:right w:w="120" w:type="dxa"/>
+            </w:tcMar>
+            <w:vAlign w:val="center"/>
+          </w:tcPr>
+          <w:p>
+            <w:pPr>
+              <w:spacing w:after="0" w:line="240" w:lineRule="auto"/>
+              <w:jc w:val="left"/>
+            </w:pPr>
+            <w:r>
+              <w:rPr>
+                <w:sz w:val="22"/>
+              </w:rPr>
+              <w:t>Kết quả CHECK_UNIQUE và khóa/idempotency của kênh tích hợp (mô hình hóa).</w:t>
+            </w:r>
+          </w:p>
+        </w:tc>
+        <w:tc>
+          <w:tcPr>
+            <w:tcW w:w="1702" w:type="dxa"/>
+            <w:tcMar>
+              <w:top w:w="80" w:type="dxa"/>
+              <w:left w:w="120" w:type="dxa"/>
+              <w:bottom w:w="80" w:type="dxa"/>
+              <w:right w:w="120" w:type="dxa"/>
+            </w:tcMar>
+            <w:vAlign w:val="center"/>
+          </w:tcPr>
+          <w:p>
+            <w:pPr>
+              <w:spacing w:after="0" w:line="240" w:lineRule="auto"/>
+              <w:jc w:val="left"/>
+            </w:pPr>
+            <w:r>
+              <w:rPr>
+                <w:sz w:val="22"/>
+              </w:rPr>
+              <w:t>Tạo mã vận đơn.</w:t>
+            </w:r>
+          </w:p>
+        </w:tc>
+        <w:tc>
+          <w:tcPr>
+            <w:tcW w:w="2043" w:type="dxa"/>
+            <w:tcMar>
+              <w:top w:w="80" w:type="dxa"/>
+              <w:left w:w="120" w:type="dxa"/>
+              <w:bottom w:w="80" w:type="dxa"/>
+              <w:right w:w="120" w:type="dxa"/>
+            </w:tcMar>
+            <w:vAlign w:val="center"/>
+          </w:tcPr>
+          <w:p>
+            <w:pPr>
+              <w:spacing w:after="0" w:line="240" w:lineRule="auto"/>
+              <w:jc w:val="left"/>
+            </w:pPr>
+            <w:r>
+              <w:rPr>
+                <w:sz w:val="22"/>
+              </w:rPr>
+              <w:t>Chặn tạo lặp, sửa hoặc hủy.</w:t>
+            </w:r>
+          </w:p>
+        </w:tc>
+      </w:tr>
+    </w:tbl>
+    <w:p>
+      <w:pPr>
+        <w:pStyle w:val="Caption1"/>
+        <w:rPr>
+          <w:rFonts w:cs="Times New Roman"/>
+        </w:rPr>
+      </w:pPr>
+      <w:proofErr w:type="spellStart"/>
+      <w:r>
+        <w:rPr>
+          <w:rFonts w:cs="Times New Roman"/>
+        </w:rPr>
+        <w:t>Bảng</w:t>
+      </w:r>
+      <w:proofErr w:type="spellEnd"/>
+      <w:r>
+        <w:rPr>
+          <w:rFonts w:cs="Times New Roman"/>
+        </w:rPr>
+        <w:t xml:space="preserve"> 1.3. Các </w:t>
+      </w:r>
+      <w:proofErr w:type="spellStart"/>
+      <w:r>
+        <w:rPr>
+          <w:rFonts w:cs="Times New Roman"/>
+        </w:rPr>
+        <w:t>điểm</w:t>
+      </w:r>
+      <w:proofErr w:type="spellEnd"/>
+      <w:r>
+        <w:rPr>
+          <w:rFonts w:cs="Times New Roman"/>
+        </w:rPr>
+        <w:t xml:space="preserve"> </w:t>
+      </w:r>
+      <w:proofErr w:type="spellStart"/>
+      <w:r>
+        <w:rPr>
+          <w:rFonts w:cs="Times New Roman"/>
+        </w:rPr>
+        <w:t>quyết</w:t>
+      </w:r>
+      <w:proofErr w:type="spellEnd"/>
+      <w:r>
+        <w:rPr>
+          <w:rFonts w:cs="Times New Roman"/>
+        </w:rPr>
+        <w:t xml:space="preserve"> </w:t>
+      </w:r>
+      <w:proofErr w:type="spellStart"/>
+      <w:r>
+        <w:rPr>
+          <w:rFonts w:cs="Times New Roman"/>
+        </w:rPr>
+        <w:t>định</w:t>
+      </w:r>
+      <w:proofErr w:type="spellEnd"/>
+      <w:r>
+        <w:rPr>
+          <w:rFonts w:cs="Times New Roman"/>
+        </w:rPr>
+        <w:t xml:space="preserve"> </w:t>
+      </w:r>
+      <w:proofErr w:type="spellStart"/>
+      <w:r>
+        <w:rPr>
+          <w:rFonts w:cs="Times New Roman"/>
+        </w:rPr>
+        <w:t>và</w:t>
+      </w:r>
+      <w:proofErr w:type="spellEnd"/>
+      <w:r>
+        <w:rPr>
+          <w:rFonts w:cs="Times New Roman"/>
+        </w:rPr>
+        <w:t xml:space="preserve"> </w:t>
+      </w:r>
+      <w:proofErr w:type="spellStart"/>
+      <w:r>
+        <w:rPr>
+          <w:rFonts w:cs="Times New Roman"/>
+        </w:rPr>
+        <w:t>kết</w:t>
+      </w:r>
+      <w:proofErr w:type="spellEnd"/>
+      <w:r>
+        <w:rPr>
+          <w:rFonts w:cs="Times New Roman"/>
+        </w:rPr>
+        <w:t xml:space="preserve"> </w:t>
+      </w:r>
+      <w:proofErr w:type="spellStart"/>
+      <w:r>
+        <w:rPr>
+          <w:rFonts w:cs="Times New Roman"/>
+        </w:rPr>
+        <w:t>quả</w:t>
+      </w:r>
+      <w:proofErr w:type="spellEnd"/>
+      <w:r>
+        <w:rPr>
+          <w:rFonts w:cs="Times New Roman"/>
+        </w:rPr>
+        <w:t xml:space="preserve"> </w:t>
+      </w:r>
+    </w:p>
+    <w:p>
+      <w:pPr>
+        <w:pStyle w:val="Caption1"/>
+        <w:rPr>
+          <w:rFonts w:cs="Times New Roman"/>
+        </w:rPr>
+      </w:pPr>
+    </w:p>
+    <w:tbl>
+      <w:tblPr>
+        <w:tblW w:w="8794" w:type="dxa"/>
+        <w:tblInd w:w="120" w:type="dxa"/>
+        <w:tblBorders>
+          <w:top w:val="single" w:sz="6" w:space="0" w:color="9EADBA"/>
+          <w:left w:val="single" w:sz="6" w:space="0" w:color="9EADBA"/>
+          <w:bottom w:val="single" w:sz="6" w:space="0" w:color="9EADBA"/>
+          <w:right w:val="single" w:sz="6" w:space="0" w:color="9EADBA"/>
+          <w:insideH w:val="single" w:sz="6" w:space="0" w:color="9EADBA"/>
+          <w:insideV w:val="single" w:sz="6" w:space="0" w:color="9EADBA"/>
+        </w:tblBorders>
+        <w:tblLayout w:type="fixed"/>
+        <w:tblLook w:val="04A0" w:firstRow="1" w:lastRow="0" w:firstColumn="1" w:lastColumn="0" w:noHBand="0" w:noVBand="1"/>
+      </w:tblPr>
+      <w:tblGrid>
+        <w:gridCol w:w="1702"/>
+        <w:gridCol w:w="1986"/>
+        <w:gridCol w:w="1986"/>
+        <w:gridCol w:w="3120"/>
+      </w:tblGrid>
+      <w:tr>
+        <w:trPr>
+          <w:cantSplit/>
+          <w:tblHeader/>
+        </w:trPr>
+        <w:tc>
+          <w:tcPr>
+            <w:tcW w:w="1702" w:type="dxa"/>
+            <w:shd w:val="clear" w:color="auto" w:fill="DCE6F1"/>
+            <w:tcMar>
+              <w:top w:w="80" w:type="dxa"/>
+              <w:left w:w="120" w:type="dxa"/>
+              <w:bottom w:w="80" w:type="dxa"/>
+              <w:right w:w="120" w:type="dxa"/>
+            </w:tcMar>
+            <w:vAlign w:val="center"/>
+          </w:tcPr>
+          <w:p>
+            <w:pPr>
+              <w:keepNext/>
+              <w:spacing w:after="0" w:line="240" w:lineRule="auto"/>
+              <w:jc w:val="center"/>
+            </w:pPr>
+            <w:r>
+              <w:rPr>
+                <w:b/>
+                <w:sz w:val="22"/>
+              </w:rPr>
+              <w:t>Bàn giao</w:t>
+            </w:r>
+          </w:p>
+        </w:tc>
+        <w:tc>
+          <w:tcPr>
+            <w:tcW w:w="1986" w:type="dxa"/>
+            <w:shd w:val="clear" w:color="auto" w:fill="DCE6F1"/>
+            <w:tcMar>
+              <w:top w:w="80" w:type="dxa"/>
+              <w:left w:w="120" w:type="dxa"/>
+              <w:bottom w:w="80" w:type="dxa"/>
+              <w:right w:w="120" w:type="dxa"/>
+            </w:tcMar>
+            <w:vAlign w:val="center"/>
+          </w:tcPr>
+          <w:p>
+            <w:pPr>
+              <w:keepNext/>
+              <w:spacing w:after="0" w:line="240" w:lineRule="auto"/>
+              <w:jc w:val="center"/>
+            </w:pPr>
+            <w:r>
+              <w:rPr>
+                <w:b/>
+                <w:sz w:val="22"/>
+              </w:rPr>
+              <w:t>Bên giao</w:t>
+            </w:r>
+          </w:p>
+        </w:tc>
+        <w:tc>
+          <w:tcPr>
+            <w:tcW w:w="1986" w:type="dxa"/>
+            <w:shd w:val="clear" w:color="auto" w:fill="DCE6F1"/>
+            <w:tcMar>
+              <w:top w:w="80" w:type="dxa"/>
+              <w:left w:w="120" w:type="dxa"/>
+              <w:bottom w:w="80" w:type="dxa"/>
+              <w:right w:w="120" w:type="dxa"/>
+            </w:tcMar>
+            <w:vAlign w:val="center"/>
+          </w:tcPr>
+          <w:p>
+            <w:pPr>
+              <w:keepNext/>
+              <w:spacing w:after="0" w:line="240" w:lineRule="auto"/>
+              <w:jc w:val="center"/>
+            </w:pPr>
+            <w:r>
+              <w:rPr>
+                <w:b/>
+                <w:sz w:val="22"/>
+              </w:rPr>
+              <w:t>Bên nhận</w:t>
+            </w:r>
+          </w:p>
+        </w:tc>
+        <w:tc>
+          <w:tcPr>
+            <w:tcW w:w="3120" w:type="dxa"/>
+            <w:shd w:val="clear" w:color="auto" w:fill="DCE6F1"/>
+            <w:tcMar>
+              <w:top w:w="80" w:type="dxa"/>
+              <w:left w:w="120" w:type="dxa"/>
+              <w:bottom w:w="80" w:type="dxa"/>
+              <w:right w:w="120" w:type="dxa"/>
+            </w:tcMar>
+            <w:vAlign w:val="center"/>
+          </w:tcPr>
+          <w:p>
+            <w:pPr>
+              <w:keepNext/>
+              <w:spacing w:after="0" w:line="240" w:lineRule="auto"/>
+              <w:jc w:val="center"/>
+            </w:pPr>
+            <w:r>
+              <w:rPr>
+                <w:b/>
+                <w:sz w:val="22"/>
+              </w:rPr>
+              <w:t>Thông tin cần giữ</w:t>
+            </w:r>
+          </w:p>
+        </w:tc>
+      </w:tr>
+      <w:tr>
+        <w:trPr>
+          <w:cantSplit/>
+        </w:trPr>
+        <w:tc>
+          <w:tcPr>
+            <w:tcW w:w="1702" w:type="dxa"/>
+            <w:tcMar>
+              <w:top w:w="80" w:type="dxa"/>
+              <w:left w:w="120" w:type="dxa"/>
+              <w:bottom w:w="80" w:type="dxa"/>
+              <w:right w:w="120" w:type="dxa"/>
+            </w:tcMar>
+            <w:vAlign w:val="center"/>
+          </w:tcPr>
+          <w:p>
+            <w:pPr>
+              <w:spacing w:after="0" w:line="240" w:lineRule="auto"/>
+              <w:jc w:val="center"/>
+            </w:pPr>
+            <w:r>
+              <w:rPr>
+                <w:sz w:val="22"/>
+              </w:rPr>
+              <w:t>Yêu cầu → OMS</w:t>
+            </w:r>
+          </w:p>
+        </w:tc>
+        <w:tc>
+          <w:tcPr>
+            <w:tcW w:w="1986" w:type="dxa"/>
+            <w:tcMar>
+              <w:top w:w="80" w:type="dxa"/>
+              <w:left w:w="120" w:type="dxa"/>
+              <w:bottom w:w="80" w:type="dxa"/>
+              <w:right w:w="120" w:type="dxa"/>
+            </w:tcMar>
+            <w:vAlign w:val="center"/>
+          </w:tcPr>
+          <w:p>
+            <w:pPr>
+              <w:spacing w:after="0" w:line="240" w:lineRule="auto"/>
+              <w:jc w:val="left"/>
+            </w:pPr>
+            <w:r>
+              <w:rPr>
+                <w:sz w:val="22"/>
+              </w:rPr>
+              <w:t>Khách hàng/kênh/API</w:t>
+            </w:r>
+          </w:p>
+        </w:tc>
+        <w:tc>
+          <w:tcPr>
+            <w:tcW w:w="1986" w:type="dxa"/>
+            <w:tcMar>
+              <w:top w:w="80" w:type="dxa"/>
+              <w:left w:w="120" w:type="dxa"/>
+              <w:bottom w:w="80" w:type="dxa"/>
+              <w:right w:w="120" w:type="dxa"/>
+            </w:tcMar>
+            <w:vAlign w:val="center"/>
+          </w:tcPr>
+          <w:p>
+            <w:pPr>
+              <w:spacing w:after="0" w:line="240" w:lineRule="auto"/>
+              <w:jc w:val="left"/>
+            </w:pPr>
+            <w:r>
+              <w:rPr>
+                <w:sz w:val="22"/>
+              </w:rPr>
+              <w:t>OMS/API</w:t>
+            </w:r>
+          </w:p>
+        </w:tc>
+        <w:tc>
+          <w:tcPr>
+            <w:tcW w:w="3120" w:type="dxa"/>
+            <w:tcMar>
+              <w:top w:w="80" w:type="dxa"/>
+              <w:left w:w="120" w:type="dxa"/>
+              <w:bottom w:w="80" w:type="dxa"/>
+              <w:right w:w="120" w:type="dxa"/>
+            </w:tcMar>
+            <w:vAlign w:val="center"/>
+          </w:tcPr>
+          <w:p>
+            <w:pPr>
+              <w:spacing w:after="0" w:line="240" w:lineRule="auto"/>
+              <w:jc w:val="left"/>
+            </w:pPr>
+            <w:r>
+              <w:rPr>
+                <w:sz w:val="22"/>
+              </w:rPr>
+              <w:t>Payload, thời điểm, mã đối tác, log xác thực.</w:t>
+            </w:r>
+          </w:p>
+        </w:tc>
+      </w:tr>
+      <w:tr>
+        <w:trPr>
+          <w:cantSplit/>
+        </w:trPr>
+        <w:tc>
+          <w:tcPr>
+            <w:tcW w:w="1702" w:type="dxa"/>
+            <w:tcMar>
+              <w:top w:w="80" w:type="dxa"/>
+              <w:left w:w="120" w:type="dxa"/>
+              <w:bottom w:w="80" w:type="dxa"/>
+              <w:right w:w="120" w:type="dxa"/>
+            </w:tcMar>
+            <w:vAlign w:val="center"/>
+          </w:tcPr>
+          <w:p>
+            <w:pPr>
+              <w:spacing w:after="0" w:line="240" w:lineRule="auto"/>
+              <w:jc w:val="center"/>
+            </w:pPr>
+            <w:r>
+              <w:rPr>
+                <w:sz w:val="22"/>
+              </w:rPr>
+              <w:t>Kết quả → khách hàng</w:t>
+            </w:r>
+          </w:p>
+        </w:tc>
+        <w:tc>
+          <w:tcPr>
+            <w:tcW w:w="1986" w:type="dxa"/>
+            <w:tcMar>
+              <w:top w:w="80" w:type="dxa"/>
+              <w:left w:w="120" w:type="dxa"/>
+              <w:bottom w:w="80" w:type="dxa"/>
+              <w:right w:w="120" w:type="dxa"/>
+            </w:tcMar>
+            <w:vAlign w:val="center"/>
+          </w:tcPr>
+          <w:p>
+            <w:pPr>
+              <w:spacing w:after="0" w:line="240" w:lineRule="auto"/>
+              <w:jc w:val="left"/>
+            </w:pPr>
+            <w:r>
+              <w:rPr>
+                <w:sz w:val="22"/>
+              </w:rPr>
+              <w:t>OMS/API</w:t>
+            </w:r>
+          </w:p>
+        </w:tc>
+        <w:tc>
+          <w:tcPr>
+            <w:tcW w:w="1986" w:type="dxa"/>
+            <w:tcMar>
+              <w:top w:w="80" w:type="dxa"/>
+              <w:left w:w="120" w:type="dxa"/>
+              <w:bottom w:w="80" w:type="dxa"/>
+              <w:right w:w="120" w:type="dxa"/>
+            </w:tcMar>
+            <w:vAlign w:val="center"/>
+          </w:tcPr>
+          <w:p>
+            <w:pPr>
+              <w:spacing w:after="0" w:line="240" w:lineRule="auto"/>
+              <w:jc w:val="left"/>
+            </w:pPr>
+            <w:r>
+              <w:rPr>
+                <w:sz w:val="22"/>
+              </w:rPr>
+              <w:t>Khách hàng/nhân viên</w:t>
+            </w:r>
+          </w:p>
+        </w:tc>
+        <w:tc>
+          <w:tcPr>
+            <w:tcW w:w="3120" w:type="dxa"/>
+            <w:tcMar>
+              <w:top w:w="80" w:type="dxa"/>
+              <w:left w:w="120" w:type="dxa"/>
+              <w:bottom w:w="80" w:type="dxa"/>
+              <w:right w:w="120" w:type="dxa"/>
+            </w:tcMar>
+            <w:vAlign w:val="center"/>
+          </w:tcPr>
+          <w:p>
+            <w:pPr>
+              <w:spacing w:after="0" w:line="240" w:lineRule="auto"/>
+              <w:jc w:val="left"/>
+            </w:pPr>
+            <w:r>
+              <w:rPr>
+                <w:sz w:val="22"/>
+              </w:rPr>
+              <w:t>ORDER_NUMBER, cước, dịch vụ, thông báo lỗi.</w:t>
+            </w:r>
+          </w:p>
+        </w:tc>
+      </w:tr>
+      <w:tr>
+        <w:trPr>
+          <w:cantSplit/>
+        </w:trPr>
+        <w:tc>
+          <w:tcPr>
+            <w:tcW w:w="1702" w:type="dxa"/>
+            <w:tcMar>
+              <w:top w:w="80" w:type="dxa"/>
+              <w:left w:w="120" w:type="dxa"/>
+              <w:bottom w:w="80" w:type="dxa"/>
+              <w:right w:w="120" w:type="dxa"/>
+            </w:tcMar>
+            <w:vAlign w:val="center"/>
+          </w:tcPr>
+          <w:p>
+            <w:pPr>
+              <w:spacing w:after="0" w:line="240" w:lineRule="auto"/>
+              <w:jc w:val="center"/>
+            </w:pPr>
+            <w:r>
+              <w:rPr>
+                <w:sz w:val="22"/>
+              </w:rPr>
+              <w:t>Đơn điện tử → kiện vật lý</w:t>
+            </w:r>
+          </w:p>
+        </w:tc>
+        <w:tc>
+          <w:tcPr>
+            <w:tcW w:w="1986" w:type="dxa"/>
+            <w:tcMar>
+              <w:top w:w="80" w:type="dxa"/>
+              <w:left w:w="120" w:type="dxa"/>
+              <w:bottom w:w="80" w:type="dxa"/>
+              <w:right w:w="120" w:type="dxa"/>
+            </w:tcMar>
+            <w:vAlign w:val="center"/>
+          </w:tcPr>
+          <w:p>
+            <w:pPr>
+              <w:spacing w:after="0" w:line="240" w:lineRule="auto"/>
+              <w:jc w:val="left"/>
+            </w:pPr>
+            <w:r>
+              <w:rPr>
+                <w:sz w:val="22"/>
+              </w:rPr>
+              <w:t>Khách hàng</w:t>
+            </w:r>
+          </w:p>
+        </w:tc>
+        <w:tc>
+          <w:tcPr>
+            <w:tcW w:w="1986" w:type="dxa"/>
+            <w:tcMar>
+              <w:top w:w="80" w:type="dxa"/>
+              <w:left w:w="120" w:type="dxa"/>
+              <w:bottom w:w="80" w:type="dxa"/>
+              <w:right w:w="120" w:type="dxa"/>
+            </w:tcMar>
+            <w:vAlign w:val="center"/>
+          </w:tcPr>
+          <w:p>
+            <w:pPr>
+              <w:spacing w:after="0" w:line="240" w:lineRule="auto"/>
+              <w:jc w:val="left"/>
+            </w:pPr>
+            <w:r>
+              <w:rPr>
+                <w:sz w:val="22"/>
+              </w:rPr>
+              <w:t>Bưu cục/thu gom</w:t>
+            </w:r>
+          </w:p>
+        </w:tc>
+        <w:tc>
+          <w:tcPr>
+            <w:tcW w:w="3120" w:type="dxa"/>
+            <w:tcMar>
+              <w:top w:w="80" w:type="dxa"/>
+              <w:left w:w="120" w:type="dxa"/>
+              <w:bottom w:w="80" w:type="dxa"/>
+              <w:right w:w="120" w:type="dxa"/>
+            </w:tcMar>
+            <w:vAlign w:val="center"/>
+          </w:tcPr>
+          <w:p>
+            <w:pPr>
+              <w:spacing w:after="0" w:line="240" w:lineRule="auto"/>
+              <w:jc w:val="left"/>
+            </w:pPr>
+            <w:r>
+              <w:rPr>
+                <w:sz w:val="22"/>
+              </w:rPr>
+              <w:t>Mã vận đơn, hàng/chứng từ, trạng thái kiểm tra.</w:t>
+            </w:r>
+          </w:p>
+        </w:tc>
+      </w:tr>
+    </w:tbl>
+    <w:p>
+      <w:pPr>
+        <w:pStyle w:val="Caption1"/>
+        <w:rPr>
+          <w:rFonts w:cs="Times New Roman"/>
+        </w:rPr>
+      </w:pPr>
+      <w:proofErr w:type="spellStart"/>
+      <w:r>
+        <w:rPr>
+          <w:rFonts w:cs="Times New Roman"/>
+        </w:rPr>
+        <w:t>Bảng</w:t>
+      </w:r>
+      <w:proofErr w:type="spellEnd"/>
+      <w:r>
+        <w:rPr>
+          <w:rFonts w:cs="Times New Roman"/>
+        </w:rPr>
+        <w:t xml:space="preserve"> 1.4. </w:t>
+      </w:r>
+      <w:proofErr w:type="spellStart"/>
+      <w:r>
+        <w:rPr>
+          <w:rFonts w:cs="Times New Roman"/>
+        </w:rPr>
+        <w:t>Điểm</w:t>
+      </w:r>
+      <w:proofErr w:type="spellEnd"/>
+      <w:r>
+        <w:rPr>
+          <w:rFonts w:cs="Times New Roman"/>
+        </w:rPr>
+        <w:t xml:space="preserve"> </w:t>
+      </w:r>
+      <w:proofErr w:type="spellStart"/>
+      <w:r>
+        <w:rPr>
+          <w:rFonts w:cs="Times New Roman"/>
+        </w:rPr>
+        <w:t>bàn</w:t>
+      </w:r>
+      <w:proofErr w:type="spellEnd"/>
+      <w:r>
+        <w:rPr>
+          <w:rFonts w:cs="Times New Roman"/>
+        </w:rPr>
+        <w:t xml:space="preserve"> </w:t>
+      </w:r>
+      <w:proofErr w:type="spellStart"/>
+      <w:r>
+        <w:rPr>
+          <w:rFonts w:cs="Times New Roman"/>
+        </w:rPr>
+        <w:t>giao</w:t>
+      </w:r>
+      <w:proofErr w:type="spellEnd"/>
+      <w:r>
+        <w:rPr>
+          <w:rFonts w:cs="Times New Roman"/>
+        </w:rPr>
+        <w:t xml:space="preserve"> </w:t>
+      </w:r>
+      <w:proofErr w:type="spellStart"/>
+      <w:r>
+        <w:rPr>
+          <w:rFonts w:cs="Times New Roman"/>
+        </w:rPr>
+        <w:t>và</w:t>
+      </w:r>
+      <w:proofErr w:type="spellEnd"/>
+      <w:r>
+        <w:rPr>
+          <w:rFonts w:cs="Times New Roman"/>
+        </w:rPr>
+        <w:t xml:space="preserve"> </w:t>
+      </w:r>
+      <w:proofErr w:type="spellStart"/>
+      <w:r>
+        <w:rPr>
+          <w:rFonts w:cs="Times New Roman"/>
+        </w:rPr>
+        <w:t>dữ</w:t>
+      </w:r>
+      <w:proofErr w:type="spellEnd"/>
+      <w:r>
+        <w:rPr>
+          <w:rFonts w:cs="Times New Roman"/>
+        </w:rPr>
+        <w:t xml:space="preserve"> </w:t>
+      </w:r>
+      <w:proofErr w:type="spellStart"/>
+      <w:r>
+        <w:rPr>
+          <w:rFonts w:cs="Times New Roman"/>
+        </w:rPr>
+        <w:t>liệu</w:t>
+      </w:r>
+      <w:proofErr w:type="spellEnd"/>
+      <w:r>
+        <w:rPr>
+          <w:rFonts w:cs="Times New Roman"/>
+        </w:rPr>
+        <w:t xml:space="preserve"> </w:t>
+      </w:r>
+      <w:proofErr w:type="spellStart"/>
+      <w:r>
+        <w:rPr>
+          <w:rFonts w:cs="Times New Roman"/>
+        </w:rPr>
+        <w:t>kiểm</w:t>
+      </w:r>
+      <w:proofErr w:type="spellEnd"/>
+      <w:r>
+        <w:rPr>
+          <w:rFonts w:cs="Times New Roman"/>
+        </w:rPr>
+        <w:t xml:space="preserve"> </w:t>
+      </w:r>
+      <w:proofErr w:type="spellStart"/>
+      <w:r>
+        <w:rPr>
+          <w:rFonts w:cs="Times New Roman"/>
+        </w:rPr>
+        <w:t>soát</w:t>
+      </w:r>
+      <w:proofErr w:type="spellEnd"/>
+    </w:p>
+    <w:p>
+      <w:pPr>
+        <w:pStyle w:val="Caption1"/>
+        <w:rPr>
+          <w:rFonts w:cs="Times New Roman"/>
+        </w:rPr>
+      </w:pPr>
+    </w:p>
+    <w:tbl>
+      <w:tblPr>
+        <w:tblW w:w="8794" w:type="dxa"/>
+        <w:tblInd w:w="120" w:type="dxa"/>
+        <w:tblBorders>
+          <w:top w:val="single" w:sz="6" w:space="0" w:color="9EADBA"/>
+          <w:left w:val="single" w:sz="6" w:space="0" w:color="9EADBA"/>
+          <w:bottom w:val="single" w:sz="6" w:space="0" w:color="9EADBA"/>
+          <w:right w:val="single" w:sz="6" w:space="0" w:color="9EADBA"/>
+          <w:insideH w:val="single" w:sz="6" w:space="0" w:color="9EADBA"/>
+          <w:insideV w:val="single" w:sz="6" w:space="0" w:color="9EADBA"/>
+        </w:tblBorders>
+        <w:tblLayout w:type="fixed"/>
+        <w:tblLook w:val="04A0" w:firstRow="1" w:lastRow="0" w:firstColumn="1" w:lastColumn="0" w:noHBand="0" w:noVBand="1"/>
+      </w:tblPr>
+      <w:tblGrid>
+        <w:gridCol w:w="1702"/>
+        <w:gridCol w:w="2383"/>
+        <w:gridCol w:w="2270"/>
+        <w:gridCol w:w="2439"/>
+      </w:tblGrid>
+      <w:tr>
+        <w:trPr>
+          <w:cantSplit/>
+          <w:tblHeader/>
+        </w:trPr>
+        <w:tc>
+          <w:tcPr>
+            <w:tcW w:w="1702" w:type="dxa"/>
+            <w:shd w:val="clear" w:color="auto" w:fill="DCE6F1"/>
+            <w:tcMar>
+              <w:top w:w="80" w:type="dxa"/>
+              <w:left w:w="120" w:type="dxa"/>
+              <w:bottom w:w="80" w:type="dxa"/>
+              <w:right w:w="120" w:type="dxa"/>
+            </w:tcMar>
+            <w:vAlign w:val="center"/>
+          </w:tcPr>
+          <w:p>
+            <w:pPr>
+              <w:keepNext/>
+              <w:spacing w:after="0" w:line="240" w:lineRule="auto"/>
+              <w:jc w:val="center"/>
+            </w:pPr>
+            <w:r>
+              <w:rPr>
+                <w:b/>
+                <w:sz w:val="21"/>
+              </w:rPr>
+              <w:t>Nút thắt/rủi ro</w:t>
+            </w:r>
+          </w:p>
+        </w:tc>
+        <w:tc>
+          <w:tcPr>
+            <w:tcW w:w="2383" w:type="dxa"/>
+            <w:shd w:val="clear" w:color="auto" w:fill="DCE6F1"/>
+            <w:tcMar>
+              <w:top w:w="80" w:type="dxa"/>
+              <w:left w:w="120" w:type="dxa"/>
+              <w:bottom w:w="80" w:type="dxa"/>
+              <w:right w:w="120" w:type="dxa"/>
+            </w:tcMar>
+            <w:vAlign w:val="center"/>
+          </w:tcPr>
+          <w:p>
+            <w:pPr>
+              <w:keepNext/>
+              <w:spacing w:after="0" w:line="240" w:lineRule="auto"/>
+              <w:jc w:val="center"/>
+            </w:pPr>
+            <w:r>
+              <w:rPr>
+                <w:b/>
+                <w:sz w:val="21"/>
+              </w:rPr>
+              <w:t>Biểu hiện</w:t>
+            </w:r>
+          </w:p>
+        </w:tc>
+        <w:tc>
+          <w:tcPr>
+            <w:tcW w:w="2270" w:type="dxa"/>
+            <w:shd w:val="clear" w:color="auto" w:fill="DCE6F1"/>
+            <w:tcMar>
+              <w:top w:w="80" w:type="dxa"/>
+              <w:left w:w="120" w:type="dxa"/>
+              <w:bottom w:w="80" w:type="dxa"/>
+              <w:right w:w="120" w:type="dxa"/>
+            </w:tcMar>
+            <w:vAlign w:val="center"/>
+          </w:tcPr>
+          <w:p>
+            <w:pPr>
+              <w:keepNext/>
+              <w:spacing w:after="0" w:line="240" w:lineRule="auto"/>
+              <w:jc w:val="center"/>
+            </w:pPr>
+            <w:r>
+              <w:rPr>
+                <w:b/>
+                <w:sz w:val="21"/>
+              </w:rPr>
+              <w:t>Tác động</w:t>
+            </w:r>
+          </w:p>
+        </w:tc>
+        <w:tc>
+          <w:tcPr>
+            <w:tcW w:w="2439" w:type="dxa"/>
+            <w:shd w:val="clear" w:color="auto" w:fill="DCE6F1"/>
+            <w:tcMar>
+              <w:top w:w="80" w:type="dxa"/>
+              <w:left w:w="120" w:type="dxa"/>
+              <w:bottom w:w="80" w:type="dxa"/>
+              <w:right w:w="120" w:type="dxa"/>
+            </w:tcMar>
+            <w:vAlign w:val="center"/>
+          </w:tcPr>
+          <w:p>
+            <w:pPr>
+              <w:keepNext/>
+              <w:spacing w:after="0" w:line="240" w:lineRule="auto"/>
+              <w:jc w:val="center"/>
+            </w:pPr>
+            <w:r>
+              <w:rPr>
+                <w:b/>
+                <w:sz w:val="21"/>
+              </w:rPr>
+              <w:t>KPI đề xuất</w:t>
+            </w:r>
+          </w:p>
+        </w:tc>
+      </w:tr>
+      <w:tr>
+        <w:trPr>
+          <w:cantSplit/>
+        </w:trPr>
+        <w:tc>
+          <w:tcPr>
+            <w:tcW w:w="1702" w:type="dxa"/>
+            <w:tcMar>
+              <w:top w:w="80" w:type="dxa"/>
+              <w:left w:w="120" w:type="dxa"/>
+              <w:bottom w:w="80" w:type="dxa"/>
+              <w:right w:w="120" w:type="dxa"/>
+            </w:tcMar>
+            <w:vAlign w:val="center"/>
+          </w:tcPr>
+          <w:p>
+            <w:pPr>
+              <w:spacing w:after="0" w:line="240" w:lineRule="auto"/>
+              <w:jc w:val="center"/>
+            </w:pPr>
+            <w:r>
+              <w:rPr>
+                <w:sz w:val="21"/>
+              </w:rPr>
+              <w:t>Nhập lặp dữ liệu</w:t>
+            </w:r>
+          </w:p>
+        </w:tc>
+        <w:tc>
+          <w:tcPr>
+            <w:tcW w:w="2383" w:type="dxa"/>
+            <w:tcMar>
+              <w:top w:w="80" w:type="dxa"/>
+              <w:left w:w="120" w:type="dxa"/>
+              <w:bottom w:w="80" w:type="dxa"/>
+              <w:right w:w="120" w:type="dxa"/>
+            </w:tcMar>
+            <w:vAlign w:val="center"/>
+          </w:tcPr>
+          <w:p>
+            <w:pPr>
+              <w:spacing w:after="0" w:line="240" w:lineRule="auto"/>
+              <w:jc w:val="left"/>
+            </w:pPr>
+            <w:r>
+              <w:rPr>
+                <w:sz w:val="21"/>
+              </w:rPr>
+              <w:t>Khách và nhân viên cùng nhập hoặc sửa nhiều lần.</w:t>
+            </w:r>
+          </w:p>
+        </w:tc>
+        <w:tc>
+          <w:tcPr>
+            <w:tcW w:w="2270" w:type="dxa"/>
+            <w:tcMar>
+              <w:top w:w="80" w:type="dxa"/>
+              <w:left w:w="120" w:type="dxa"/>
+              <w:bottom w:w="80" w:type="dxa"/>
+              <w:right w:w="120" w:type="dxa"/>
+            </w:tcMar>
+            <w:vAlign w:val="center"/>
+          </w:tcPr>
+          <w:p>
+            <w:pPr>
+              <w:spacing w:after="0" w:line="240" w:lineRule="auto"/>
+              <w:jc w:val="left"/>
+            </w:pPr>
+            <w:r>
+              <w:rPr>
+                <w:sz w:val="21"/>
+              </w:rPr>
+              <w:t>Tăng thời gian, tăng lỗi.</w:t>
+            </w:r>
+          </w:p>
+        </w:tc>
+        <w:tc>
+          <w:tcPr>
+            <w:tcW w:w="2439" w:type="dxa"/>
+            <w:tcMar>
+              <w:top w:w="80" w:type="dxa"/>
+              <w:left w:w="120" w:type="dxa"/>
+              <w:bottom w:w="80" w:type="dxa"/>
+              <w:right w:w="120" w:type="dxa"/>
+            </w:tcMar>
+            <w:vAlign w:val="center"/>
+          </w:tcPr>
+          <w:p>
+            <w:pPr>
+              <w:spacing w:after="0" w:line="240" w:lineRule="auto"/>
+              <w:jc w:val="left"/>
+            </w:pPr>
+            <w:r>
+              <w:rPr>
+                <w:sz w:val="21"/>
+              </w:rPr>
+              <w:t>First-pass yield; tỷ lệ sửa.</w:t>
+            </w:r>
+          </w:p>
+        </w:tc>
+      </w:tr>
+      <w:tr>
+        <w:trPr>
+          <w:cantSplit/>
+        </w:trPr>
+        <w:tc>
+          <w:tcPr>
+            <w:tcW w:w="1702" w:type="dxa"/>
+            <w:tcMar>
+              <w:top w:w="80" w:type="dxa"/>
+              <w:left w:w="120" w:type="dxa"/>
+              <w:bottom w:w="80" w:type="dxa"/>
+              <w:right w:w="120" w:type="dxa"/>
+            </w:tcMar>
+            <w:vAlign w:val="center"/>
+          </w:tcPr>
+          <w:p>
+            <w:pPr>
+              <w:spacing w:after="0" w:line="240" w:lineRule="auto"/>
+              <w:jc w:val="center"/>
+            </w:pPr>
+            <w:r>
+              <w:rPr>
+                <w:sz w:val="21"/>
+              </w:rPr>
+              <w:t>Địa chỉ không chuẩn hóa</w:t>
+            </w:r>
+          </w:p>
+        </w:tc>
+        <w:tc>
+          <w:tcPr>
+            <w:tcW w:w="2383" w:type="dxa"/>
+            <w:tcMar>
+              <w:top w:w="80" w:type="dxa"/>
+              <w:left w:w="120" w:type="dxa"/>
+              <w:bottom w:w="80" w:type="dxa"/>
+              <w:right w:w="120" w:type="dxa"/>
+            </w:tcMar>
+            <w:vAlign w:val="center"/>
+          </w:tcPr>
+          <w:p>
+            <w:pPr>
+              <w:spacing w:after="0" w:line="240" w:lineRule="auto"/>
+              <w:jc w:val="left"/>
+            </w:pPr>
+            <w:r>
+              <w:rPr>
+                <w:sz w:val="21"/>
+              </w:rPr>
+              <w:t>Địa chỉ tự do, thiếu phường/xã hoặc sai số điện thoại.</w:t>
+            </w:r>
+          </w:p>
+        </w:tc>
+        <w:tc>
+          <w:tcPr>
+            <w:tcW w:w="2270" w:type="dxa"/>
+            <w:tcMar>
+              <w:top w:w="80" w:type="dxa"/>
+              <w:left w:w="120" w:type="dxa"/>
+              <w:bottom w:w="80" w:type="dxa"/>
+              <w:right w:w="120" w:type="dxa"/>
+            </w:tcMar>
+            <w:vAlign w:val="center"/>
+          </w:tcPr>
+          <w:p>
+            <w:pPr>
+              <w:spacing w:after="0" w:line="240" w:lineRule="auto"/>
+              <w:jc w:val="left"/>
+            </w:pPr>
+            <w:r>
+              <w:rPr>
+                <w:sz w:val="21"/>
+              </w:rPr>
+              <w:t>Không tra được dịch vụ/cước, giao nhầm.</w:t>
+            </w:r>
+          </w:p>
+        </w:tc>
+        <w:tc>
+          <w:tcPr>
+            <w:tcW w:w="2439" w:type="dxa"/>
+            <w:tcMar>
+              <w:top w:w="80" w:type="dxa"/>
+              <w:left w:w="120" w:type="dxa"/>
+              <w:bottom w:w="80" w:type="dxa"/>
+              <w:right w:w="120" w:type="dxa"/>
+            </w:tcMar>
+            <w:vAlign w:val="center"/>
+          </w:tcPr>
+          <w:p>
+            <w:pPr>
+              <w:spacing w:after="0" w:line="240" w:lineRule="auto"/>
+              <w:jc w:val="left"/>
+            </w:pPr>
+            <w:r>
+              <w:rPr>
+                <w:sz w:val="21"/>
+              </w:rPr>
+              <w:t>Tỷ lệ chuẩn hóa thành công.</w:t>
+            </w:r>
+          </w:p>
+        </w:tc>
+      </w:tr>
+      <w:tr>
+        <w:trPr>
+          <w:cantSplit/>
+        </w:trPr>
+        <w:tc>
+          <w:tcPr>
+            <w:tcW w:w="1702" w:type="dxa"/>
+            <w:tcMar>
+              <w:top w:w="80" w:type="dxa"/>
+              <w:left w:w="120" w:type="dxa"/>
+              <w:bottom w:w="80" w:type="dxa"/>
+              <w:right w:w="120" w:type="dxa"/>
+            </w:tcMar>
+            <w:vAlign w:val="center"/>
+          </w:tcPr>
+          <w:p>
+            <w:pPr>
+              <w:spacing w:after="0" w:line="240" w:lineRule="auto"/>
+              <w:jc w:val="center"/>
+            </w:pPr>
+            <w:r>
+              <w:rPr>
+                <w:sz w:val="21"/>
+              </w:rPr>
+              <w:t>Chờ mạng/API</w:t>
+            </w:r>
+          </w:p>
+        </w:tc>
+        <w:tc>
+          <w:tcPr>
+            <w:tcW w:w="2383" w:type="dxa"/>
+            <w:tcMar>
+              <w:top w:w="80" w:type="dxa"/>
+              <w:left w:w="120" w:type="dxa"/>
+              <w:bottom w:w="80" w:type="dxa"/>
+              <w:right w:w="120" w:type="dxa"/>
+            </w:tcMar>
+            <w:vAlign w:val="center"/>
+          </w:tcPr>
+          <w:p>
+            <w:pPr>
+              <w:spacing w:after="0" w:line="240" w:lineRule="auto"/>
+              <w:jc w:val="left"/>
+            </w:pPr>
+            <w:r>
+              <w:rPr>
+                <w:sz w:val="21"/>
+              </w:rPr>
+              <w:t>Phản hồi chậm hoặc timeout khi tra cước/tạo mã.</w:t>
+            </w:r>
+          </w:p>
+        </w:tc>
+        <w:tc>
+          <w:tcPr>
+            <w:tcW w:w="2270" w:type="dxa"/>
+            <w:tcMar>
+              <w:top w:w="80" w:type="dxa"/>
+              <w:left w:w="120" w:type="dxa"/>
+              <w:bottom w:w="80" w:type="dxa"/>
+              <w:right w:w="120" w:type="dxa"/>
+            </w:tcMar>
+            <w:vAlign w:val="center"/>
+          </w:tcPr>
+          <w:p>
+            <w:pPr>
+              <w:spacing w:after="0" w:line="240" w:lineRule="auto"/>
+              <w:jc w:val="left"/>
+            </w:pPr>
+            <w:r>
+              <w:rPr>
+                <w:sz w:val="21"/>
+              </w:rPr>
+              <w:t>Tăng cycle time, tạo yêu cầu lặp.</w:t>
+            </w:r>
+          </w:p>
+        </w:tc>
+        <w:tc>
+          <w:tcPr>
+            <w:tcW w:w="2439" w:type="dxa"/>
+            <w:tcMar>
+              <w:top w:w="80" w:type="dxa"/>
+              <w:left w:w="120" w:type="dxa"/>
+              <w:bottom w:w="80" w:type="dxa"/>
+              <w:right w:w="120" w:type="dxa"/>
+            </w:tcMar>
+            <w:vAlign w:val="center"/>
+          </w:tcPr>
+          <w:p>
+            <w:pPr>
+              <w:spacing w:after="0" w:line="240" w:lineRule="auto"/>
+              <w:jc w:val="left"/>
+            </w:pPr>
+            <w:r>
+              <w:rPr>
+                <w:sz w:val="21"/>
+              </w:rPr>
+              <w:t>P95 thời gian phản hồi; timeout rate.</w:t>
+            </w:r>
+          </w:p>
+        </w:tc>
+      </w:tr>
+      <w:tr>
+        <w:trPr>
+          <w:cantSplit/>
+        </w:trPr>
+        <w:tc>
+          <w:tcPr>
+            <w:tcW w:w="1702" w:type="dxa"/>
+            <w:tcMar>
+              <w:top w:w="80" w:type="dxa"/>
+              <w:left w:w="120" w:type="dxa"/>
+              <w:bottom w:w="80" w:type="dxa"/>
+              <w:right w:w="120" w:type="dxa"/>
+            </w:tcMar>
+            <w:vAlign w:val="center"/>
+          </w:tcPr>
+          <w:p>
+            <w:pPr>
+              <w:spacing w:after="0" w:line="240" w:lineRule="auto"/>
+              <w:jc w:val="center"/>
+            </w:pPr>
+            <w:r>
+              <w:rPr>
+                <w:sz w:val="21"/>
+              </w:rPr>
+              <w:t>Sai hàng hóa/khối lượng</w:t>
+            </w:r>
+          </w:p>
+        </w:tc>
+        <w:tc>
+          <w:tcPr>
+            <w:tcW w:w="2383" w:type="dxa"/>
+            <w:tcMar>
+              <w:top w:w="80" w:type="dxa"/>
+              <w:left w:w="120" w:type="dxa"/>
+              <w:bottom w:w="80" w:type="dxa"/>
+              <w:right w:w="120" w:type="dxa"/>
+            </w:tcMar>
+            <w:vAlign w:val="center"/>
+          </w:tcPr>
+          <w:p>
+            <w:pPr>
+              <w:spacing w:after="0" w:line="240" w:lineRule="auto"/>
+              <w:jc w:val="left"/>
+            </w:pPr>
+            <w:r>
+              <w:rPr>
+                <w:sz w:val="21"/>
+              </w:rPr>
+              <w:t>Thông tin khai báo khác kiện thực tế.</w:t>
+            </w:r>
+          </w:p>
+        </w:tc>
+        <w:tc>
+          <w:tcPr>
+            <w:tcW w:w="2270" w:type="dxa"/>
+            <w:tcMar>
+              <w:top w:w="80" w:type="dxa"/>
+              <w:left w:w="120" w:type="dxa"/>
+              <w:bottom w:w="80" w:type="dxa"/>
+              <w:right w:w="120" w:type="dxa"/>
+            </w:tcMar>
+            <w:vAlign w:val="center"/>
+          </w:tcPr>
+          <w:p>
+            <w:pPr>
+              <w:spacing w:after="0" w:line="240" w:lineRule="auto"/>
+              <w:jc w:val="left"/>
+            </w:pPr>
+            <w:r>
+              <w:rPr>
+                <w:sz w:val="21"/>
+              </w:rPr>
+              <w:t>Phát sinh điều chỉnh hoặc tranh chấp.</w:t>
+            </w:r>
+          </w:p>
+        </w:tc>
+        <w:tc>
+          <w:tcPr>
+            <w:tcW w:w="2439" w:type="dxa"/>
+            <w:tcMar>
+              <w:top w:w="80" w:type="dxa"/>
+              <w:left w:w="120" w:type="dxa"/>
+              <w:bottom w:w="80" w:type="dxa"/>
+              <w:right w:w="120" w:type="dxa"/>
+            </w:tcMar>
+            <w:vAlign w:val="center"/>
+          </w:tcPr>
+          <w:p>
+            <w:pPr>
+              <w:spacing w:after="0" w:line="240" w:lineRule="auto"/>
+              <w:jc w:val="left"/>
+            </w:pPr>
+            <w:r>
+              <w:rPr>
+                <w:sz w:val="21"/>
+              </w:rPr>
+              <w:t>Tỷ lệ lệch khai báo khi nhận kiện.</w:t>
+            </w:r>
+          </w:p>
+        </w:tc>
+      </w:tr>
+      <w:tr>
+        <w:trPr>
+          <w:cantSplit/>
+        </w:trPr>
+        <w:tc>
+          <w:tcPr>
+            <w:tcW w:w="1702" w:type="dxa"/>
+            <w:tcMar>
+              <w:top w:w="80" w:type="dxa"/>
+              <w:left w:w="120" w:type="dxa"/>
+              <w:bottom w:w="80" w:type="dxa"/>
+              <w:right w:w="120" w:type="dxa"/>
+            </w:tcMar>
+            <w:vAlign w:val="center"/>
+          </w:tcPr>
+          <w:p>
+            <w:pPr>
+              <w:spacing w:after="0" w:line="240" w:lineRule="auto"/>
+              <w:jc w:val="center"/>
+            </w:pPr>
+            <w:r>
+              <w:rPr>
+                <w:sz w:val="21"/>
+              </w:rPr>
+              <w:t>Lệch mốc mã–kiện</w:t>
+            </w:r>
+          </w:p>
+        </w:tc>
+        <w:tc>
+          <w:tcPr>
+            <w:tcW w:w="2383" w:type="dxa"/>
+            <w:tcMar>
+              <w:top w:w="80" w:type="dxa"/>
+              <w:left w:w="120" w:type="dxa"/>
+              <w:bottom w:w="80" w:type="dxa"/>
+              <w:right w:w="120" w:type="dxa"/>
+            </w:tcMar>
+            <w:vAlign w:val="center"/>
+          </w:tcPr>
+          <w:p>
+            <w:pPr>
+              <w:spacing w:after="0" w:line="240" w:lineRule="auto"/>
+              <w:jc w:val="left"/>
+            </w:pPr>
+            <w:r>
+              <w:rPr>
+                <w:sz w:val="21"/>
+              </w:rPr>
+              <w:t>Đã tạo mã nhưng kiện chưa được nhận vật lý.</w:t>
+            </w:r>
+          </w:p>
+        </w:tc>
+        <w:tc>
+          <w:tcPr>
+            <w:tcW w:w="2270" w:type="dxa"/>
+            <w:tcMar>
+              <w:top w:w="80" w:type="dxa"/>
+              <w:left w:w="120" w:type="dxa"/>
+              <w:bottom w:w="80" w:type="dxa"/>
+              <w:right w:w="120" w:type="dxa"/>
+            </w:tcMar>
+            <w:vAlign w:val="center"/>
+          </w:tcPr>
+          <w:p>
+            <w:pPr>
+              <w:spacing w:after="0" w:line="240" w:lineRule="auto"/>
+              <w:jc w:val="left"/>
+            </w:pPr>
+            <w:r>
+              <w:rPr>
+                <w:sz w:val="21"/>
+              </w:rPr>
+              <w:t>Hiểu sai năng lực xử lý thực tế.</w:t>
+            </w:r>
+          </w:p>
+        </w:tc>
+        <w:tc>
+          <w:tcPr>
+            <w:tcW w:w="2439" w:type="dxa"/>
+            <w:tcMar>
+              <w:top w:w="80" w:type="dxa"/>
+              <w:left w:w="120" w:type="dxa"/>
+              <w:bottom w:w="80" w:type="dxa"/>
+              <w:right w:w="120" w:type="dxa"/>
+            </w:tcMar>
+            <w:vAlign w:val="center"/>
+          </w:tcPr>
+          <w:p>
+            <w:pPr>
+              <w:spacing w:after="0" w:line="240" w:lineRule="auto"/>
+              <w:jc w:val="left"/>
+            </w:pPr>
+            <w:r>
+              <w:rPr>
+                <w:sz w:val="21"/>
+              </w:rPr>
+              <w:t>Tỷ lệ cập nhật đúng hạn; thời gian mã→nhận kiện.</w:t>
+            </w:r>
+          </w:p>
+        </w:tc>
+      </w:tr>
+    </w:tbl>
+    <w:p>
+      <w:pPr>
+        <w:pStyle w:val="Caption1"/>
+        <w:rPr>
+          <w:rFonts w:cs="Times New Roman"/>
+        </w:rPr>
+      </w:pPr>
+      <w:proofErr w:type="spellStart"/>
+      <w:r>
+        <w:rPr>
+          <w:rFonts w:cs="Times New Roman"/>
+        </w:rPr>
+        <w:t>Bảng</w:t>
+      </w:r>
+      <w:proofErr w:type="spellEnd"/>
+      <w:r>
+        <w:rPr>
+          <w:rFonts w:cs="Times New Roman"/>
+        </w:rPr>
+        <w:t xml:space="preserve"> 1.5. </w:t>
+      </w:r>
+      <w:proofErr w:type="spellStart"/>
+      <w:r>
+        <w:rPr>
+          <w:rFonts w:cs="Times New Roman"/>
+        </w:rPr>
+        <w:t>Nút</w:t>
+      </w:r>
+      <w:proofErr w:type="spellEnd"/>
+      <w:r>
+        <w:rPr>
+          <w:rFonts w:cs="Times New Roman"/>
+        </w:rPr>
+        <w:t xml:space="preserve"> </w:t>
+      </w:r>
+      <w:proofErr w:type="spellStart"/>
+      <w:r>
+        <w:rPr>
+          <w:rFonts w:cs="Times New Roman"/>
+        </w:rPr>
+        <w:t>thắt</w:t>
+      </w:r>
+      <w:proofErr w:type="spellEnd"/>
+      <w:r>
+        <w:rPr>
+          <w:rFonts w:cs="Times New Roman"/>
+        </w:rPr>
+        <w:t xml:space="preserve">, </w:t>
+      </w:r>
+      <w:proofErr w:type="spellStart"/>
+      <w:r>
+        <w:rPr>
+          <w:rFonts w:cs="Times New Roman"/>
+        </w:rPr>
+        <w:t>rủi</w:t>
+      </w:r>
+      <w:proofErr w:type="spellEnd"/>
+      <w:r>
+        <w:rPr>
+          <w:rFonts w:cs="Times New Roman"/>
+        </w:rPr>
+        <w:t xml:space="preserve"> </w:t>
+      </w:r>
+      <w:proofErr w:type="spellStart"/>
+      <w:r>
+        <w:rPr>
+          <w:rFonts w:cs="Times New Roman"/>
+        </w:rPr>
+        <w:t>ro</w:t>
+      </w:r>
+      <w:proofErr w:type="spellEnd"/>
+      <w:r>
+        <w:rPr>
+          <w:rFonts w:cs="Times New Roman"/>
+        </w:rPr>
+        <w:t xml:space="preserve"> </w:t>
+      </w:r>
+      <w:proofErr w:type="spellStart"/>
+      <w:r>
+        <w:rPr>
+          <w:rFonts w:cs="Times New Roman"/>
+        </w:rPr>
+        <w:t>và</w:t>
+      </w:r>
+      <w:proofErr w:type="spellEnd"/>
+      <w:r>
+        <w:rPr>
+          <w:rFonts w:cs="Times New Roman"/>
+        </w:rPr>
+        <w:t xml:space="preserve"> KPI </w:t>
+      </w:r>
+      <w:proofErr w:type="spellStart"/>
+      <w:r>
+        <w:rPr>
+          <w:rFonts w:cs="Times New Roman"/>
+        </w:rPr>
+        <w:t>theo</w:t>
+      </w:r>
+      <w:proofErr w:type="spellEnd"/>
+      <w:r>
+        <w:rPr>
+          <w:rFonts w:cs="Times New Roman"/>
+        </w:rPr>
+        <w:t xml:space="preserve"> </w:t>
+      </w:r>
+      <w:proofErr w:type="spellStart"/>
+      <w:r>
+        <w:rPr>
+          <w:rFonts w:cs="Times New Roman"/>
+        </w:rPr>
+        <w:t>dõi</w:t>
+      </w:r>
+      <w:proofErr w:type="spellEnd"/>
+    </w:p>
+    <w:p/>
+    <w:p>
+      <w:proofErr w:type="spellStart"/>
+      <w:r>
+        <w:t>Ưu</w:t>
+      </w:r>
+      <w:proofErr w:type="spellEnd"/>
+      <w:r>
+        <w:t xml:space="preserve"> </w:t>
+      </w:r>
+      <w:proofErr w:type="spellStart"/>
+      <w:r>
+        <w:t>tiên</w:t>
+      </w:r>
+      <w:proofErr w:type="spellEnd"/>
+      <w:r>
+        <w:t xml:space="preserve"> </w:t>
+      </w:r>
+      <w:proofErr w:type="spellStart"/>
+      <w:r>
+        <w:t>cải</w:t>
+      </w:r>
+      <w:proofErr w:type="spellEnd"/>
+      <w:r>
+        <w:t xml:space="preserve"> </w:t>
+      </w:r>
+      <w:proofErr w:type="spellStart"/>
+      <w:r>
+        <w:t>tiến</w:t>
+      </w:r>
+      <w:proofErr w:type="spellEnd"/>
+      <w:r>
+        <w:t xml:space="preserve"> </w:t>
+      </w:r>
+      <w:proofErr w:type="spellStart"/>
+      <w:r>
+        <w:t>là</w:t>
+      </w:r>
+      <w:proofErr w:type="spellEnd"/>
+      <w:r>
+        <w:t xml:space="preserve"> </w:t>
+      </w:r>
+      <w:proofErr w:type="spellStart"/>
+      <w:r>
+        <w:t>giảm</w:t>
+      </w:r>
+      <w:proofErr w:type="spellEnd"/>
+      <w:r>
+        <w:t xml:space="preserve"> </w:t>
+      </w:r>
+      <w:proofErr w:type="spellStart"/>
+      <w:r>
+        <w:t>nhập</w:t>
+      </w:r>
+      <w:proofErr w:type="spellEnd"/>
+      <w:r>
+        <w:t xml:space="preserve"> </w:t>
+      </w:r>
+      <w:proofErr w:type="spellStart"/>
+      <w:r>
+        <w:t>lại</w:t>
+      </w:r>
+      <w:proofErr w:type="spellEnd"/>
+      <w:r>
+        <w:t xml:space="preserve"> bằng biểu mẫu có kiểm tra tức thời, chuẩn hóa địa chỉ trước khi tính cước, dùng idempotency (gọi lại không tạo đơn </w:t>
+      </w:r>
+      <w:r>
+        <w:lastRenderedPageBreak/>
+        <w:t>lặp)/CHECK_UNIQUE cho tích hợp, và tách KPI tạo mã điện tử khỏi KPI nhận kiện vật lý. Các KPI trên là đề xuất đo lường; không phải số liệu công bố của Viettel Post.</w:t>
+      </w:r>
     </w:p>
     <w:sectPr>
       <w:footerReference w:type="even" r:id="rId9"/>

</xml_diff>

<commit_message>
feat: Add qualitative analysis section with VA/BVA/NVA classification
</commit_message>
<xml_diff>
--- a/01.WORKING_SPACE/duy/25410194_Nguyen_Thanh_Duy_quy_trinh_tiep_nhan_don_hang.docx
+++ b/01.WORKING_SPACE/duy/25410194_Nguyen_Thanh_Duy_quy_trinh_tiep_nhan_don_hang.docx
@@ -4399,6 +4399,1790 @@
       <w:r>
         <w:lastRenderedPageBreak/>
         <w:t>lặp)/CHECK_UNIQUE cho tích hợp, và tách KPI tạo mã điện tử khỏi KPI nhận kiện vật lý. Các KPI trên là đề xuất đo lường; không phải số liệu công bố của Viettel Post.</w:t>
+      </w:r>
+    </w:p>
+    <w:p>
+      <w:pPr>
+        <w:pStyle w:val="Heading3"/>
+        <w:spacing w:line="240" w:lineRule="auto"/>
+      </w:pPr>
+      <w:r>
+        <w:t>1.3. Phân tích định tính</w:t>
+      </w:r>
+    </w:p>
+    <w:p>
+      <w:r>
+        <w:t>Phân loại VA/BVA/NVA được dùng để phân biệt hoạt động tạo giá trị trực tiếp, hoạt động bắt buộc để kiểm soát rủi ro/tuân thủ và hoạt động không tạo giá trị cần giảm. Trong bảng, NVA không có nghĩa là bỏ ngay kiểm soát bắt buộc; mục tiêu là loại bỏ nguyên nhân làm phát sinh NVA.</w:t>
+      </w:r>
+    </w:p>
+    <w:p>
+      <w:pPr>
+        <w:pStyle w:val="Caption1"/>
+        <w:rPr>
+          <w:rFonts w:cs="Times New Roman"/>
+        </w:rPr>
+      </w:pPr>
+    </w:p>
+    <w:tbl>
+      <w:tblPr>
+        <w:tblW w:w="8794" w:type="dxa"/>
+        <w:tblInd w:w="120" w:type="dxa"/>
+        <w:tblBorders>
+          <w:top w:val="single" w:sz="6" w:space="0" w:color="9EADBA"/>
+          <w:left w:val="single" w:sz="6" w:space="0" w:color="9EADBA"/>
+          <w:bottom w:val="single" w:sz="6" w:space="0" w:color="9EADBA"/>
+          <w:right w:val="single" w:sz="6" w:space="0" w:color="9EADBA"/>
+          <w:insideH w:val="single" w:sz="6" w:space="0" w:color="9EADBA"/>
+          <w:insideV w:val="single" w:sz="6" w:space="0" w:color="9EADBA"/>
+        </w:tblBorders>
+        <w:tblLayout w:type="fixed"/>
+        <w:tblLook w:val="04A0" w:firstRow="1" w:lastRow="0" w:firstColumn="1" w:lastColumn="0" w:noHBand="0" w:noVBand="1"/>
+      </w:tblPr>
+      <w:tblGrid>
+        <w:gridCol w:w="2269"/>
+        <w:gridCol w:w="1702"/>
+        <w:gridCol w:w="1135"/>
+        <w:gridCol w:w="3688"/>
+      </w:tblGrid>
+      <w:tr>
+        <w:trPr>
+          <w:cantSplit/>
+          <w:tblHeader/>
+        </w:trPr>
+        <w:tc>
+          <w:tcPr>
+            <w:tcW w:w="2269" w:type="dxa"/>
+            <w:shd w:val="clear" w:color="auto" w:fill="DCE6F1"/>
+            <w:tcMar>
+              <w:top w:w="80" w:type="dxa"/>
+              <w:left w:w="120" w:type="dxa"/>
+              <w:bottom w:w="80" w:type="dxa"/>
+              <w:right w:w="120" w:type="dxa"/>
+            </w:tcMar>
+            <w:vAlign w:val="center"/>
+          </w:tcPr>
+          <w:p>
+            <w:pPr>
+              <w:keepNext/>
+              <w:spacing w:after="0" w:line="240" w:lineRule="auto"/>
+              <w:jc w:val="center"/>
+            </w:pPr>
+            <w:r>
+              <w:rPr>
+                <w:b/>
+                <w:sz w:val="21"/>
+              </w:rPr>
+              <w:t>Hoạt động</w:t>
+            </w:r>
+          </w:p>
+        </w:tc>
+        <w:tc>
+          <w:tcPr>
+            <w:tcW w:w="1702" w:type="dxa"/>
+            <w:shd w:val="clear" w:color="auto" w:fill="DCE6F1"/>
+            <w:tcMar>
+              <w:top w:w="80" w:type="dxa"/>
+              <w:left w:w="120" w:type="dxa"/>
+              <w:bottom w:w="80" w:type="dxa"/>
+              <w:right w:w="120" w:type="dxa"/>
+            </w:tcMar>
+            <w:vAlign w:val="center"/>
+          </w:tcPr>
+          <w:p>
+            <w:pPr>
+              <w:keepNext/>
+              <w:spacing w:after="0" w:line="240" w:lineRule="auto"/>
+              <w:jc w:val="center"/>
+            </w:pPr>
+            <w:r>
+              <w:rPr>
+                <w:b/>
+                <w:sz w:val="21"/>
+              </w:rPr>
+              <w:t>Tác nhân</w:t>
+            </w:r>
+          </w:p>
+        </w:tc>
+        <w:tc>
+          <w:tcPr>
+            <w:tcW w:w="1135" w:type="dxa"/>
+            <w:shd w:val="clear" w:color="auto" w:fill="DCE6F1"/>
+            <w:tcMar>
+              <w:top w:w="80" w:type="dxa"/>
+              <w:left w:w="120" w:type="dxa"/>
+              <w:bottom w:w="80" w:type="dxa"/>
+              <w:right w:w="120" w:type="dxa"/>
+            </w:tcMar>
+            <w:vAlign w:val="center"/>
+          </w:tcPr>
+          <w:p>
+            <w:pPr>
+              <w:keepNext/>
+              <w:spacing w:after="0" w:line="240" w:lineRule="auto"/>
+              <w:jc w:val="center"/>
+            </w:pPr>
+            <w:r>
+              <w:rPr>
+                <w:b/>
+                <w:sz w:val="21"/>
+              </w:rPr>
+              <w:t>VA/BVA/NVA</w:t>
+            </w:r>
+          </w:p>
+        </w:tc>
+        <w:tc>
+          <w:tcPr>
+            <w:tcW w:w="3688" w:type="dxa"/>
+            <w:shd w:val="clear" w:color="auto" w:fill="DCE6F1"/>
+            <w:tcMar>
+              <w:top w:w="80" w:type="dxa"/>
+              <w:left w:w="120" w:type="dxa"/>
+              <w:bottom w:w="80" w:type="dxa"/>
+              <w:right w:w="120" w:type="dxa"/>
+            </w:tcMar>
+            <w:vAlign w:val="center"/>
+          </w:tcPr>
+          <w:p>
+            <w:pPr>
+              <w:keepNext/>
+              <w:spacing w:after="0" w:line="240" w:lineRule="auto"/>
+              <w:jc w:val="center"/>
+            </w:pPr>
+            <w:r>
+              <w:rPr>
+                <w:b/>
+                <w:sz w:val="21"/>
+              </w:rPr>
+              <w:t>Giải thích</w:t>
+            </w:r>
+          </w:p>
+        </w:tc>
+      </w:tr>
+      <w:tr>
+        <w:trPr>
+          <w:cantSplit/>
+        </w:trPr>
+        <w:tc>
+          <w:tcPr>
+            <w:tcW w:w="2269" w:type="dxa"/>
+            <w:tcMar>
+              <w:top w:w="80" w:type="dxa"/>
+              <w:left w:w="120" w:type="dxa"/>
+              <w:bottom w:w="80" w:type="dxa"/>
+              <w:right w:w="120" w:type="dxa"/>
+            </w:tcMar>
+            <w:vAlign w:val="center"/>
+          </w:tcPr>
+          <w:p>
+            <w:pPr>
+              <w:spacing w:after="0" w:line="240" w:lineRule="auto"/>
+              <w:jc w:val="center"/>
+            </w:pPr>
+            <w:r>
+              <w:rPr>
+                <w:sz w:val="21"/>
+              </w:rPr>
+              <w:t>Tiếp nhận yêu cầu</w:t>
+            </w:r>
+          </w:p>
+        </w:tc>
+        <w:tc>
+          <w:tcPr>
+            <w:tcW w:w="1702" w:type="dxa"/>
+            <w:tcMar>
+              <w:top w:w="80" w:type="dxa"/>
+              <w:left w:w="120" w:type="dxa"/>
+              <w:bottom w:w="80" w:type="dxa"/>
+              <w:right w:w="120" w:type="dxa"/>
+            </w:tcMar>
+            <w:vAlign w:val="center"/>
+          </w:tcPr>
+          <w:p>
+            <w:pPr>
+              <w:spacing w:after="0" w:line="240" w:lineRule="auto"/>
+              <w:jc w:val="left"/>
+            </w:pPr>
+            <w:r>
+              <w:rPr>
+                <w:sz w:val="21"/>
+              </w:rPr>
+              <w:t>Kênh/API</w:t>
+            </w:r>
+          </w:p>
+        </w:tc>
+        <w:tc>
+          <w:tcPr>
+            <w:tcW w:w="1135" w:type="dxa"/>
+            <w:tcMar>
+              <w:top w:w="80" w:type="dxa"/>
+              <w:left w:w="120" w:type="dxa"/>
+              <w:bottom w:w="80" w:type="dxa"/>
+              <w:right w:w="120" w:type="dxa"/>
+            </w:tcMar>
+            <w:vAlign w:val="center"/>
+          </w:tcPr>
+          <w:p>
+            <w:pPr>
+              <w:spacing w:after="0" w:line="240" w:lineRule="auto"/>
+              <w:jc w:val="left"/>
+            </w:pPr>
+            <w:r>
+              <w:rPr>
+                <w:sz w:val="21"/>
+              </w:rPr>
+              <w:t>VA</w:t>
+            </w:r>
+          </w:p>
+        </w:tc>
+        <w:tc>
+          <w:tcPr>
+            <w:tcW w:w="3688" w:type="dxa"/>
+            <w:tcMar>
+              <w:top w:w="80" w:type="dxa"/>
+              <w:left w:w="120" w:type="dxa"/>
+              <w:bottom w:w="80" w:type="dxa"/>
+              <w:right w:w="120" w:type="dxa"/>
+            </w:tcMar>
+            <w:vAlign w:val="center"/>
+          </w:tcPr>
+          <w:p>
+            <w:pPr>
+              <w:spacing w:after="0" w:line="240" w:lineRule="auto"/>
+              <w:jc w:val="left"/>
+            </w:pPr>
+            <w:r>
+              <w:rPr>
+                <w:sz w:val="21"/>
+              </w:rPr>
+              <w:t>Khởi tạo nhu cầu dịch vụ và tạo điểm bắt đầu có thể truy vết.</w:t>
+            </w:r>
+          </w:p>
+        </w:tc>
+      </w:tr>
+      <w:tr>
+        <w:trPr>
+          <w:cantSplit/>
+        </w:trPr>
+        <w:tc>
+          <w:tcPr>
+            <w:tcW w:w="2269" w:type="dxa"/>
+            <w:tcMar>
+              <w:top w:w="80" w:type="dxa"/>
+              <w:left w:w="120" w:type="dxa"/>
+              <w:bottom w:w="80" w:type="dxa"/>
+              <w:right w:w="120" w:type="dxa"/>
+            </w:tcMar>
+            <w:vAlign w:val="center"/>
+          </w:tcPr>
+          <w:p>
+            <w:pPr>
+              <w:spacing w:after="0" w:line="240" w:lineRule="auto"/>
+              <w:jc w:val="center"/>
+            </w:pPr>
+            <w:r>
+              <w:rPr>
+                <w:sz w:val="21"/>
+              </w:rPr>
+              <w:t>Nhập thông tin</w:t>
+            </w:r>
+          </w:p>
+        </w:tc>
+        <w:tc>
+          <w:tcPr>
+            <w:tcW w:w="1702" w:type="dxa"/>
+            <w:tcMar>
+              <w:top w:w="80" w:type="dxa"/>
+              <w:left w:w="120" w:type="dxa"/>
+              <w:bottom w:w="80" w:type="dxa"/>
+              <w:right w:w="120" w:type="dxa"/>
+            </w:tcMar>
+            <w:vAlign w:val="center"/>
+          </w:tcPr>
+          <w:p>
+            <w:pPr>
+              <w:spacing w:after="0" w:line="240" w:lineRule="auto"/>
+              <w:jc w:val="left"/>
+            </w:pPr>
+            <w:r>
+              <w:rPr>
+                <w:sz w:val="21"/>
+              </w:rPr>
+              <w:t>Khách hàng/nhân viên</w:t>
+            </w:r>
+          </w:p>
+        </w:tc>
+        <w:tc>
+          <w:tcPr>
+            <w:tcW w:w="1135" w:type="dxa"/>
+            <w:tcMar>
+              <w:top w:w="80" w:type="dxa"/>
+              <w:left w:w="120" w:type="dxa"/>
+              <w:bottom w:w="80" w:type="dxa"/>
+              <w:right w:w="120" w:type="dxa"/>
+            </w:tcMar>
+            <w:vAlign w:val="center"/>
+          </w:tcPr>
+          <w:p>
+            <w:pPr>
+              <w:spacing w:after="0" w:line="240" w:lineRule="auto"/>
+              <w:jc w:val="left"/>
+            </w:pPr>
+            <w:r>
+              <w:rPr>
+                <w:sz w:val="21"/>
+              </w:rPr>
+              <w:t>VA</w:t>
+            </w:r>
+          </w:p>
+        </w:tc>
+        <w:tc>
+          <w:tcPr>
+            <w:tcW w:w="3688" w:type="dxa"/>
+            <w:tcMar>
+              <w:top w:w="80" w:type="dxa"/>
+              <w:left w:w="120" w:type="dxa"/>
+              <w:bottom w:w="80" w:type="dxa"/>
+              <w:right w:w="120" w:type="dxa"/>
+            </w:tcMar>
+            <w:vAlign w:val="center"/>
+          </w:tcPr>
+          <w:p>
+            <w:pPr>
+              <w:spacing w:after="0" w:line="240" w:lineRule="auto"/>
+              <w:jc w:val="left"/>
+            </w:pPr>
+            <w:r>
+              <w:rPr>
+                <w:sz w:val="21"/>
+              </w:rPr>
+              <w:t>Tạo dữ liệu giao nhận để hệ thống xử lý.</w:t>
+            </w:r>
+          </w:p>
+        </w:tc>
+      </w:tr>
+      <w:tr>
+        <w:trPr>
+          <w:cantSplit/>
+        </w:trPr>
+        <w:tc>
+          <w:tcPr>
+            <w:tcW w:w="2269" w:type="dxa"/>
+            <w:tcMar>
+              <w:top w:w="80" w:type="dxa"/>
+              <w:left w:w="120" w:type="dxa"/>
+              <w:bottom w:w="80" w:type="dxa"/>
+              <w:right w:w="120" w:type="dxa"/>
+            </w:tcMar>
+            <w:vAlign w:val="center"/>
+          </w:tcPr>
+          <w:p>
+            <w:pPr>
+              <w:spacing w:after="0" w:line="240" w:lineRule="auto"/>
+              <w:jc w:val="center"/>
+            </w:pPr>
+            <w:r>
+              <w:rPr>
+                <w:sz w:val="21"/>
+              </w:rPr>
+              <w:t>Chuẩn hóa và kiểm tra</w:t>
+            </w:r>
+          </w:p>
+        </w:tc>
+        <w:tc>
+          <w:tcPr>
+            <w:tcW w:w="1702" w:type="dxa"/>
+            <w:tcMar>
+              <w:top w:w="80" w:type="dxa"/>
+              <w:left w:w="120" w:type="dxa"/>
+              <w:bottom w:w="80" w:type="dxa"/>
+              <w:right w:w="120" w:type="dxa"/>
+            </w:tcMar>
+            <w:vAlign w:val="center"/>
+          </w:tcPr>
+          <w:p>
+            <w:pPr>
+              <w:spacing w:after="0" w:line="240" w:lineRule="auto"/>
+              <w:jc w:val="left"/>
+            </w:pPr>
+            <w:r>
+              <w:rPr>
+                <w:sz w:val="21"/>
+              </w:rPr>
+              <w:t>OMS/API</w:t>
+            </w:r>
+          </w:p>
+        </w:tc>
+        <w:tc>
+          <w:tcPr>
+            <w:tcW w:w="1135" w:type="dxa"/>
+            <w:tcMar>
+              <w:top w:w="80" w:type="dxa"/>
+              <w:left w:w="120" w:type="dxa"/>
+              <w:bottom w:w="80" w:type="dxa"/>
+              <w:right w:w="120" w:type="dxa"/>
+            </w:tcMar>
+            <w:vAlign w:val="center"/>
+          </w:tcPr>
+          <w:p>
+            <w:pPr>
+              <w:spacing w:after="0" w:line="240" w:lineRule="auto"/>
+              <w:jc w:val="left"/>
+            </w:pPr>
+            <w:r>
+              <w:rPr>
+                <w:sz w:val="21"/>
+              </w:rPr>
+              <w:t>BVA</w:t>
+            </w:r>
+          </w:p>
+        </w:tc>
+        <w:tc>
+          <w:tcPr>
+            <w:tcW w:w="3688" w:type="dxa"/>
+            <w:tcMar>
+              <w:top w:w="80" w:type="dxa"/>
+              <w:left w:w="120" w:type="dxa"/>
+              <w:bottom w:w="80" w:type="dxa"/>
+              <w:right w:w="120" w:type="dxa"/>
+            </w:tcMar>
+            <w:vAlign w:val="center"/>
+          </w:tcPr>
+          <w:p>
+            <w:pPr>
+              <w:spacing w:after="0" w:line="240" w:lineRule="auto"/>
+              <w:jc w:val="left"/>
+            </w:pPr>
+            <w:r>
+              <w:rPr>
+                <w:sz w:val="21"/>
+              </w:rPr>
+              <w:t>Giảm sai địa chỉ/số điện thoại và bảo vệ chất lượng dữ liệu.</w:t>
+            </w:r>
+          </w:p>
+        </w:tc>
+      </w:tr>
+      <w:tr>
+        <w:trPr>
+          <w:cantSplit/>
+        </w:trPr>
+        <w:tc>
+          <w:tcPr>
+            <w:tcW w:w="2269" w:type="dxa"/>
+            <w:tcMar>
+              <w:top w:w="80" w:type="dxa"/>
+              <w:left w:w="120" w:type="dxa"/>
+              <w:bottom w:w="80" w:type="dxa"/>
+              <w:right w:w="120" w:type="dxa"/>
+            </w:tcMar>
+            <w:vAlign w:val="center"/>
+          </w:tcPr>
+          <w:p>
+            <w:pPr>
+              <w:spacing w:after="0" w:line="240" w:lineRule="auto"/>
+              <w:jc w:val="center"/>
+            </w:pPr>
+            <w:r>
+              <w:rPr>
+                <w:sz w:val="21"/>
+              </w:rPr>
+              <w:t>Tra dịch vụ và tính cước</w:t>
+            </w:r>
+          </w:p>
+        </w:tc>
+        <w:tc>
+          <w:tcPr>
+            <w:tcW w:w="1702" w:type="dxa"/>
+            <w:tcMar>
+              <w:top w:w="80" w:type="dxa"/>
+              <w:left w:w="120" w:type="dxa"/>
+              <w:bottom w:w="80" w:type="dxa"/>
+              <w:right w:w="120" w:type="dxa"/>
+            </w:tcMar>
+            <w:vAlign w:val="center"/>
+          </w:tcPr>
+          <w:p>
+            <w:pPr>
+              <w:spacing w:after="0" w:line="240" w:lineRule="auto"/>
+              <w:jc w:val="left"/>
+            </w:pPr>
+            <w:r>
+              <w:rPr>
+                <w:sz w:val="21"/>
+              </w:rPr>
+              <w:t>OMS/API</w:t>
+            </w:r>
+          </w:p>
+        </w:tc>
+        <w:tc>
+          <w:tcPr>
+            <w:tcW w:w="1135" w:type="dxa"/>
+            <w:tcMar>
+              <w:top w:w="80" w:type="dxa"/>
+              <w:left w:w="120" w:type="dxa"/>
+              <w:bottom w:w="80" w:type="dxa"/>
+              <w:right w:w="120" w:type="dxa"/>
+            </w:tcMar>
+            <w:vAlign w:val="center"/>
+          </w:tcPr>
+          <w:p>
+            <w:pPr>
+              <w:spacing w:after="0" w:line="240" w:lineRule="auto"/>
+              <w:jc w:val="left"/>
+            </w:pPr>
+            <w:r>
+              <w:rPr>
+                <w:sz w:val="21"/>
+              </w:rPr>
+              <w:t>VA</w:t>
+            </w:r>
+          </w:p>
+        </w:tc>
+        <w:tc>
+          <w:tcPr>
+            <w:tcW w:w="3688" w:type="dxa"/>
+            <w:tcMar>
+              <w:top w:w="80" w:type="dxa"/>
+              <w:left w:w="120" w:type="dxa"/>
+              <w:bottom w:w="80" w:type="dxa"/>
+              <w:right w:w="120" w:type="dxa"/>
+            </w:tcMar>
+            <w:vAlign w:val="center"/>
+          </w:tcPr>
+          <w:p>
+            <w:pPr>
+              <w:spacing w:after="0" w:line="240" w:lineRule="auto"/>
+              <w:jc w:val="left"/>
+            </w:pPr>
+            <w:r>
+              <w:rPr>
+                <w:sz w:val="21"/>
+              </w:rPr>
+              <w:t>Xác định phương án, phí và thời gian dự kiến cho khách.</w:t>
+            </w:r>
+          </w:p>
+        </w:tc>
+      </w:tr>
+      <w:tr>
+        <w:trPr>
+          <w:cantSplit/>
+        </w:trPr>
+        <w:tc>
+          <w:tcPr>
+            <w:tcW w:w="2269" w:type="dxa"/>
+            <w:tcMar>
+              <w:top w:w="80" w:type="dxa"/>
+              <w:left w:w="120" w:type="dxa"/>
+              <w:bottom w:w="80" w:type="dxa"/>
+              <w:right w:w="120" w:type="dxa"/>
+            </w:tcMar>
+            <w:vAlign w:val="center"/>
+          </w:tcPr>
+          <w:p>
+            <w:pPr>
+              <w:spacing w:after="0" w:line="240" w:lineRule="auto"/>
+              <w:jc w:val="center"/>
+            </w:pPr>
+            <w:r>
+              <w:rPr>
+                <w:sz w:val="21"/>
+              </w:rPr>
+              <w:t>Kiểm tra trùng</w:t>
+            </w:r>
+          </w:p>
+        </w:tc>
+        <w:tc>
+          <w:tcPr>
+            <w:tcW w:w="1702" w:type="dxa"/>
+            <w:tcMar>
+              <w:top w:w="80" w:type="dxa"/>
+              <w:left w:w="120" w:type="dxa"/>
+              <w:bottom w:w="80" w:type="dxa"/>
+              <w:right w:w="120" w:type="dxa"/>
+            </w:tcMar>
+            <w:vAlign w:val="center"/>
+          </w:tcPr>
+          <w:p>
+            <w:pPr>
+              <w:spacing w:after="0" w:line="240" w:lineRule="auto"/>
+              <w:jc w:val="left"/>
+            </w:pPr>
+            <w:r>
+              <w:rPr>
+                <w:sz w:val="21"/>
+              </w:rPr>
+              <w:t>OMS/API</w:t>
+            </w:r>
+          </w:p>
+        </w:tc>
+        <w:tc>
+          <w:tcPr>
+            <w:tcW w:w="1135" w:type="dxa"/>
+            <w:tcMar>
+              <w:top w:w="80" w:type="dxa"/>
+              <w:left w:w="120" w:type="dxa"/>
+              <w:bottom w:w="80" w:type="dxa"/>
+              <w:right w:w="120" w:type="dxa"/>
+            </w:tcMar>
+            <w:vAlign w:val="center"/>
+          </w:tcPr>
+          <w:p>
+            <w:pPr>
+              <w:spacing w:after="0" w:line="240" w:lineRule="auto"/>
+              <w:jc w:val="left"/>
+            </w:pPr>
+            <w:r>
+              <w:rPr>
+                <w:sz w:val="21"/>
+              </w:rPr>
+              <w:t>BVA</w:t>
+            </w:r>
+          </w:p>
+        </w:tc>
+        <w:tc>
+          <w:tcPr>
+            <w:tcW w:w="3688" w:type="dxa"/>
+            <w:tcMar>
+              <w:top w:w="80" w:type="dxa"/>
+              <w:left w:w="120" w:type="dxa"/>
+              <w:bottom w:w="80" w:type="dxa"/>
+              <w:right w:w="120" w:type="dxa"/>
+            </w:tcMar>
+            <w:vAlign w:val="center"/>
+          </w:tcPr>
+          <w:p>
+            <w:pPr>
+              <w:spacing w:after="0" w:line="240" w:lineRule="auto"/>
+              <w:jc w:val="left"/>
+            </w:pPr>
+            <w:r>
+              <w:rPr>
+                <w:sz w:val="21"/>
+              </w:rPr>
+              <w:t>Ngăn tạo đơn lặp và chi phí xử lý không cần thiết.</w:t>
+            </w:r>
+          </w:p>
+        </w:tc>
+      </w:tr>
+      <w:tr>
+        <w:trPr>
+          <w:cantSplit/>
+        </w:trPr>
+        <w:tc>
+          <w:tcPr>
+            <w:tcW w:w="2269" w:type="dxa"/>
+            <w:tcMar>
+              <w:top w:w="80" w:type="dxa"/>
+              <w:left w:w="120" w:type="dxa"/>
+              <w:bottom w:w="80" w:type="dxa"/>
+              <w:right w:w="120" w:type="dxa"/>
+            </w:tcMar>
+            <w:vAlign w:val="center"/>
+          </w:tcPr>
+          <w:p>
+            <w:pPr>
+              <w:spacing w:after="0" w:line="240" w:lineRule="auto"/>
+              <w:jc w:val="center"/>
+            </w:pPr>
+            <w:r>
+              <w:rPr>
+                <w:sz w:val="21"/>
+              </w:rPr>
+              <w:t>Sửa thông tin hoặc hủy do lỗi đầu vào</w:t>
+            </w:r>
+          </w:p>
+        </w:tc>
+        <w:tc>
+          <w:tcPr>
+            <w:tcW w:w="1702" w:type="dxa"/>
+            <w:tcMar>
+              <w:top w:w="80" w:type="dxa"/>
+              <w:left w:w="120" w:type="dxa"/>
+              <w:bottom w:w="80" w:type="dxa"/>
+              <w:right w:w="120" w:type="dxa"/>
+            </w:tcMar>
+            <w:vAlign w:val="center"/>
+          </w:tcPr>
+          <w:p>
+            <w:pPr>
+              <w:spacing w:after="0" w:line="240" w:lineRule="auto"/>
+              <w:jc w:val="left"/>
+            </w:pPr>
+            <w:r>
+              <w:rPr>
+                <w:sz w:val="21"/>
+              </w:rPr>
+              <w:t>Khách hàng/hỗ trợ</w:t>
+            </w:r>
+          </w:p>
+        </w:tc>
+        <w:tc>
+          <w:tcPr>
+            <w:tcW w:w="1135" w:type="dxa"/>
+            <w:tcMar>
+              <w:top w:w="80" w:type="dxa"/>
+              <w:left w:w="120" w:type="dxa"/>
+              <w:bottom w:w="80" w:type="dxa"/>
+              <w:right w:w="120" w:type="dxa"/>
+            </w:tcMar>
+            <w:vAlign w:val="center"/>
+          </w:tcPr>
+          <w:p>
+            <w:pPr>
+              <w:spacing w:after="0" w:line="240" w:lineRule="auto"/>
+              <w:jc w:val="left"/>
+            </w:pPr>
+            <w:r>
+              <w:rPr>
+                <w:sz w:val="21"/>
+              </w:rPr>
+              <w:t>NVA</w:t>
+            </w:r>
+          </w:p>
+        </w:tc>
+        <w:tc>
+          <w:tcPr>
+            <w:tcW w:w="3688" w:type="dxa"/>
+            <w:tcMar>
+              <w:top w:w="80" w:type="dxa"/>
+              <w:left w:w="120" w:type="dxa"/>
+              <w:bottom w:w="80" w:type="dxa"/>
+              <w:right w:w="120" w:type="dxa"/>
+            </w:tcMar>
+            <w:vAlign w:val="center"/>
+          </w:tcPr>
+          <w:p>
+            <w:pPr>
+              <w:spacing w:after="0" w:line="240" w:lineRule="auto"/>
+              <w:jc w:val="left"/>
+            </w:pPr>
+            <w:r>
+              <w:rPr>
+                <w:sz w:val="21"/>
+              </w:rPr>
+              <w:t>Vòng làm lại phát sinh do lỗi đầu vào; nên giảm bằng xác thực sớm. Hủy chủ động do đổi ý là kết quả ngoại lệ, không mặc định là lãng phí.</w:t>
+            </w:r>
+          </w:p>
+        </w:tc>
+      </w:tr>
+      <w:tr>
+        <w:trPr>
+          <w:cantSplit/>
+        </w:trPr>
+        <w:tc>
+          <w:tcPr>
+            <w:tcW w:w="2269" w:type="dxa"/>
+            <w:tcMar>
+              <w:top w:w="80" w:type="dxa"/>
+              <w:left w:w="120" w:type="dxa"/>
+              <w:bottom w:w="80" w:type="dxa"/>
+              <w:right w:w="120" w:type="dxa"/>
+            </w:tcMar>
+            <w:vAlign w:val="center"/>
+          </w:tcPr>
+          <w:p>
+            <w:pPr>
+              <w:spacing w:after="0" w:line="240" w:lineRule="auto"/>
+              <w:jc w:val="center"/>
+            </w:pPr>
+            <w:r>
+              <w:rPr>
+                <w:sz w:val="21"/>
+              </w:rPr>
+              <w:t>Tạo mã và thông báo</w:t>
+            </w:r>
+          </w:p>
+        </w:tc>
+        <w:tc>
+          <w:tcPr>
+            <w:tcW w:w="1702" w:type="dxa"/>
+            <w:tcMar>
+              <w:top w:w="80" w:type="dxa"/>
+              <w:left w:w="120" w:type="dxa"/>
+              <w:bottom w:w="80" w:type="dxa"/>
+              <w:right w:w="120" w:type="dxa"/>
+            </w:tcMar>
+            <w:vAlign w:val="center"/>
+          </w:tcPr>
+          <w:p>
+            <w:pPr>
+              <w:spacing w:after="0" w:line="240" w:lineRule="auto"/>
+              <w:jc w:val="left"/>
+            </w:pPr>
+            <w:r>
+              <w:rPr>
+                <w:sz w:val="21"/>
+              </w:rPr>
+              <w:t>OMS/API</w:t>
+            </w:r>
+          </w:p>
+        </w:tc>
+        <w:tc>
+          <w:tcPr>
+            <w:tcW w:w="1135" w:type="dxa"/>
+            <w:tcMar>
+              <w:top w:w="80" w:type="dxa"/>
+              <w:left w:w="120" w:type="dxa"/>
+              <w:bottom w:w="80" w:type="dxa"/>
+              <w:right w:w="120" w:type="dxa"/>
+            </w:tcMar>
+            <w:vAlign w:val="center"/>
+          </w:tcPr>
+          <w:p>
+            <w:pPr>
+              <w:spacing w:after="0" w:line="240" w:lineRule="auto"/>
+              <w:jc w:val="left"/>
+            </w:pPr>
+            <w:r>
+              <w:rPr>
+                <w:sz w:val="21"/>
+              </w:rPr>
+              <w:t>VA</w:t>
+            </w:r>
+          </w:p>
+        </w:tc>
+        <w:tc>
+          <w:tcPr>
+            <w:tcW w:w="3688" w:type="dxa"/>
+            <w:tcMar>
+              <w:top w:w="80" w:type="dxa"/>
+              <w:left w:w="120" w:type="dxa"/>
+              <w:bottom w:w="80" w:type="dxa"/>
+              <w:right w:w="120" w:type="dxa"/>
+            </w:tcMar>
+            <w:vAlign w:val="center"/>
+          </w:tcPr>
+          <w:p>
+            <w:pPr>
+              <w:spacing w:after="0" w:line="240" w:lineRule="auto"/>
+              <w:jc w:val="left"/>
+            </w:pPr>
+            <w:r>
+              <w:rPr>
+                <w:sz w:val="21"/>
+              </w:rPr>
+              <w:t>Cho phép theo dõi và xác nhận kết quả tạo đơn.</w:t>
+            </w:r>
+          </w:p>
+        </w:tc>
+      </w:tr>
+    </w:tbl>
+    <w:p>
+      <w:pPr>
+        <w:pStyle w:val="Caption1"/>
+        <w:rPr>
+          <w:rFonts w:cs="Times New Roman"/>
+        </w:rPr>
+      </w:pPr>
+      <w:proofErr w:type="spellStart"/>
+      <w:r>
+        <w:rPr>
+          <w:rFonts w:cs="Times New Roman"/>
+        </w:rPr>
+        <w:t>Bảng</w:t>
+      </w:r>
+      <w:proofErr w:type="spellEnd"/>
+      <w:r>
+        <w:rPr>
+          <w:rFonts w:cs="Times New Roman"/>
+        </w:rPr>
+        <w:t xml:space="preserve"> 1.6. </w:t>
+      </w:r>
+      <w:proofErr w:type="spellStart"/>
+      <w:r>
+        <w:rPr>
+          <w:rFonts w:cs="Times New Roman"/>
+        </w:rPr>
+        <w:t>Phân</w:t>
+      </w:r>
+      <w:proofErr w:type="spellEnd"/>
+      <w:r>
+        <w:rPr>
+          <w:rFonts w:cs="Times New Roman"/>
+        </w:rPr>
+        <w:t xml:space="preserve"> </w:t>
+      </w:r>
+      <w:proofErr w:type="spellStart"/>
+      <w:r>
+        <w:rPr>
+          <w:rFonts w:cs="Times New Roman"/>
+        </w:rPr>
+        <w:t>loại</w:t>
+      </w:r>
+      <w:proofErr w:type="spellEnd"/>
+      <w:r>
+        <w:rPr>
+          <w:rFonts w:cs="Times New Roman"/>
+        </w:rPr>
+        <w:t xml:space="preserve"> </w:t>
+      </w:r>
+      <w:proofErr w:type="spellStart"/>
+      <w:r>
+        <w:rPr>
+          <w:rFonts w:cs="Times New Roman"/>
+        </w:rPr>
+        <w:t>giá</w:t>
+      </w:r>
+      <w:proofErr w:type="spellEnd"/>
+      <w:r>
+        <w:rPr>
+          <w:rFonts w:cs="Times New Roman"/>
+        </w:rPr>
+        <w:t xml:space="preserve"> </w:t>
+      </w:r>
+      <w:proofErr w:type="spellStart"/>
+      <w:r>
+        <w:rPr>
+          <w:rFonts w:cs="Times New Roman"/>
+        </w:rPr>
+        <w:t>trị</w:t>
+      </w:r>
+      <w:proofErr w:type="spellEnd"/>
+      <w:r>
+        <w:rPr>
+          <w:rFonts w:cs="Times New Roman"/>
+        </w:rPr>
+        <w:t xml:space="preserve"> VA/BVA/NVA </w:t>
+      </w:r>
+    </w:p>
+    <w:p>
+      <w:pPr>
+        <w:pStyle w:val="Caption1"/>
+        <w:rPr>
+          <w:rFonts w:cs="Times New Roman"/>
+        </w:rPr>
+      </w:pPr>
+    </w:p>
+    <w:tbl>
+      <w:tblPr>
+        <w:tblW w:w="8794" w:type="dxa"/>
+        <w:tblInd w:w="120" w:type="dxa"/>
+        <w:tblBorders>
+          <w:top w:val="single" w:sz="6" w:space="0" w:color="9EADBA"/>
+          <w:left w:val="single" w:sz="6" w:space="0" w:color="9EADBA"/>
+          <w:bottom w:val="single" w:sz="6" w:space="0" w:color="9EADBA"/>
+          <w:right w:val="single" w:sz="6" w:space="0" w:color="9EADBA"/>
+          <w:insideH w:val="single" w:sz="6" w:space="0" w:color="9EADBA"/>
+          <w:insideV w:val="single" w:sz="6" w:space="0" w:color="9EADBA"/>
+        </w:tblBorders>
+        <w:tblLayout w:type="fixed"/>
+        <w:tblLook w:val="04A0" w:firstRow="1" w:lastRow="0" w:firstColumn="1" w:lastColumn="0" w:noHBand="0" w:noVBand="1"/>
+      </w:tblPr>
+      <w:tblGrid>
+        <w:gridCol w:w="1702"/>
+        <w:gridCol w:w="2269"/>
+        <w:gridCol w:w="2553"/>
+        <w:gridCol w:w="2270"/>
+      </w:tblGrid>
+      <w:tr>
+        <w:trPr>
+          <w:cantSplit/>
+          <w:tblHeader/>
+        </w:trPr>
+        <w:tc>
+          <w:tcPr>
+            <w:tcW w:w="1702" w:type="dxa"/>
+            <w:shd w:val="clear" w:color="auto" w:fill="DCE6F1"/>
+            <w:tcMar>
+              <w:top w:w="80" w:type="dxa"/>
+              <w:left w:w="120" w:type="dxa"/>
+              <w:bottom w:w="80" w:type="dxa"/>
+              <w:right w:w="120" w:type="dxa"/>
+            </w:tcMar>
+            <w:vAlign w:val="center"/>
+          </w:tcPr>
+          <w:p>
+            <w:pPr>
+              <w:keepNext/>
+              <w:spacing w:after="0" w:line="240" w:lineRule="auto"/>
+              <w:jc w:val="center"/>
+            </w:pPr>
+            <w:r>
+              <w:rPr>
+                <w:b/>
+                <w:sz w:val="21"/>
+              </w:rPr>
+              <w:t>Loại lãng phí</w:t>
+            </w:r>
+          </w:p>
+        </w:tc>
+        <w:tc>
+          <w:tcPr>
+            <w:tcW w:w="2269" w:type="dxa"/>
+            <w:shd w:val="clear" w:color="auto" w:fill="DCE6F1"/>
+            <w:tcMar>
+              <w:top w:w="80" w:type="dxa"/>
+              <w:left w:w="120" w:type="dxa"/>
+              <w:bottom w:w="80" w:type="dxa"/>
+              <w:right w:w="120" w:type="dxa"/>
+            </w:tcMar>
+            <w:vAlign w:val="center"/>
+          </w:tcPr>
+          <w:p>
+            <w:pPr>
+              <w:keepNext/>
+              <w:spacing w:after="0" w:line="240" w:lineRule="auto"/>
+              <w:jc w:val="center"/>
+            </w:pPr>
+            <w:r>
+              <w:rPr>
+                <w:b/>
+                <w:sz w:val="21"/>
+              </w:rPr>
+              <w:t>Biểu hiện</w:t>
+            </w:r>
+          </w:p>
+        </w:tc>
+        <w:tc>
+          <w:tcPr>
+            <w:tcW w:w="2553" w:type="dxa"/>
+            <w:shd w:val="clear" w:color="auto" w:fill="DCE6F1"/>
+            <w:tcMar>
+              <w:top w:w="80" w:type="dxa"/>
+              <w:left w:w="120" w:type="dxa"/>
+              <w:bottom w:w="80" w:type="dxa"/>
+              <w:right w:w="120" w:type="dxa"/>
+            </w:tcMar>
+            <w:vAlign w:val="center"/>
+          </w:tcPr>
+          <w:p>
+            <w:pPr>
+              <w:keepNext/>
+              <w:spacing w:after="0" w:line="240" w:lineRule="auto"/>
+              <w:jc w:val="center"/>
+            </w:pPr>
+            <w:r>
+              <w:rPr>
+                <w:b/>
+                <w:sz w:val="21"/>
+              </w:rPr>
+              <w:t>Nguyên nhân/tác động</w:t>
+            </w:r>
+          </w:p>
+        </w:tc>
+        <w:tc>
+          <w:tcPr>
+            <w:tcW w:w="2270" w:type="dxa"/>
+            <w:shd w:val="clear" w:color="auto" w:fill="DCE6F1"/>
+            <w:tcMar>
+              <w:top w:w="80" w:type="dxa"/>
+              <w:left w:w="120" w:type="dxa"/>
+              <w:bottom w:w="80" w:type="dxa"/>
+              <w:right w:w="120" w:type="dxa"/>
+            </w:tcMar>
+            <w:vAlign w:val="center"/>
+          </w:tcPr>
+          <w:p>
+            <w:pPr>
+              <w:keepNext/>
+              <w:spacing w:after="0" w:line="240" w:lineRule="auto"/>
+              <w:jc w:val="center"/>
+            </w:pPr>
+            <w:r>
+              <w:rPr>
+                <w:b/>
+                <w:sz w:val="21"/>
+              </w:rPr>
+              <w:t>Khắc phục</w:t>
+            </w:r>
+          </w:p>
+        </w:tc>
+      </w:tr>
+      <w:tr>
+        <w:trPr>
+          <w:cantSplit/>
+        </w:trPr>
+        <w:tc>
+          <w:tcPr>
+            <w:tcW w:w="1702" w:type="dxa"/>
+            <w:tcMar>
+              <w:top w:w="80" w:type="dxa"/>
+              <w:left w:w="120" w:type="dxa"/>
+              <w:bottom w:w="80" w:type="dxa"/>
+              <w:right w:w="120" w:type="dxa"/>
+            </w:tcMar>
+            <w:vAlign w:val="center"/>
+          </w:tcPr>
+          <w:p>
+            <w:pPr>
+              <w:spacing w:after="0" w:line="240" w:lineRule="auto"/>
+              <w:jc w:val="center"/>
+            </w:pPr>
+            <w:r>
+              <w:rPr>
+                <w:sz w:val="21"/>
+              </w:rPr>
+              <w:t>Chờ đợi</w:t>
+            </w:r>
+          </w:p>
+        </w:tc>
+        <w:tc>
+          <w:tcPr>
+            <w:tcW w:w="2269" w:type="dxa"/>
+            <w:tcMar>
+              <w:top w:w="80" w:type="dxa"/>
+              <w:left w:w="120" w:type="dxa"/>
+              <w:bottom w:w="80" w:type="dxa"/>
+              <w:right w:w="120" w:type="dxa"/>
+            </w:tcMar>
+            <w:vAlign w:val="center"/>
+          </w:tcPr>
+          <w:p>
+            <w:pPr>
+              <w:spacing w:after="0" w:line="240" w:lineRule="auto"/>
+              <w:jc w:val="left"/>
+            </w:pPr>
+            <w:r>
+              <w:rPr>
+                <w:sz w:val="21"/>
+              </w:rPr>
+              <w:t>Chờ phản hồi API hoặc nhân viên hỗ trợ.</w:t>
+            </w:r>
+          </w:p>
+        </w:tc>
+        <w:tc>
+          <w:tcPr>
+            <w:tcW w:w="2553" w:type="dxa"/>
+            <w:tcMar>
+              <w:top w:w="80" w:type="dxa"/>
+              <w:left w:w="120" w:type="dxa"/>
+              <w:bottom w:w="80" w:type="dxa"/>
+              <w:right w:w="120" w:type="dxa"/>
+            </w:tcMar>
+            <w:vAlign w:val="center"/>
+          </w:tcPr>
+          <w:p>
+            <w:pPr>
+              <w:spacing w:after="0" w:line="240" w:lineRule="auto"/>
+              <w:jc w:val="left"/>
+            </w:pPr>
+            <w:r>
+              <w:rPr>
+                <w:sz w:val="21"/>
+              </w:rPr>
+              <w:t>Timeout, hàng đợi tăng cycle time.</w:t>
+            </w:r>
+          </w:p>
+        </w:tc>
+        <w:tc>
+          <w:tcPr>
+            <w:tcW w:w="2270" w:type="dxa"/>
+            <w:tcMar>
+              <w:top w:w="80" w:type="dxa"/>
+              <w:left w:w="120" w:type="dxa"/>
+              <w:bottom w:w="80" w:type="dxa"/>
+              <w:right w:w="120" w:type="dxa"/>
+            </w:tcMar>
+            <w:vAlign w:val="center"/>
+          </w:tcPr>
+          <w:p>
+            <w:pPr>
+              <w:spacing w:after="0" w:line="240" w:lineRule="auto"/>
+              <w:jc w:val="left"/>
+            </w:pPr>
+            <w:r>
+              <w:rPr>
+                <w:sz w:val="21"/>
+              </w:rPr>
+              <w:t>Theo dõi P95, retry có kiểm soát, cảnh báo sớm.</w:t>
+            </w:r>
+          </w:p>
+        </w:tc>
+      </w:tr>
+      <w:tr>
+        <w:trPr>
+          <w:cantSplit/>
+        </w:trPr>
+        <w:tc>
+          <w:tcPr>
+            <w:tcW w:w="1702" w:type="dxa"/>
+            <w:tcMar>
+              <w:top w:w="80" w:type="dxa"/>
+              <w:left w:w="120" w:type="dxa"/>
+              <w:bottom w:w="80" w:type="dxa"/>
+              <w:right w:w="120" w:type="dxa"/>
+            </w:tcMar>
+            <w:vAlign w:val="center"/>
+          </w:tcPr>
+          <w:p>
+            <w:pPr>
+              <w:spacing w:after="0" w:line="240" w:lineRule="auto"/>
+              <w:jc w:val="center"/>
+            </w:pPr>
+            <w:r>
+              <w:rPr>
+                <w:sz w:val="21"/>
+              </w:rPr>
+              <w:t>Sửa lỗi</w:t>
+            </w:r>
+          </w:p>
+        </w:tc>
+        <w:tc>
+          <w:tcPr>
+            <w:tcW w:w="2269" w:type="dxa"/>
+            <w:tcMar>
+              <w:top w:w="80" w:type="dxa"/>
+              <w:left w:w="120" w:type="dxa"/>
+              <w:bottom w:w="80" w:type="dxa"/>
+              <w:right w:w="120" w:type="dxa"/>
+            </w:tcMar>
+            <w:vAlign w:val="center"/>
+          </w:tcPr>
+          <w:p>
+            <w:pPr>
+              <w:spacing w:after="0" w:line="240" w:lineRule="auto"/>
+              <w:jc w:val="left"/>
+            </w:pPr>
+            <w:r>
+              <w:rPr>
+                <w:sz w:val="21"/>
+              </w:rPr>
+              <w:t>Bổ sung địa chỉ/số điện thoại sau khi gửi.</w:t>
+            </w:r>
+          </w:p>
+        </w:tc>
+        <w:tc>
+          <w:tcPr>
+            <w:tcW w:w="2553" w:type="dxa"/>
+            <w:tcMar>
+              <w:top w:w="80" w:type="dxa"/>
+              <w:left w:w="120" w:type="dxa"/>
+              <w:bottom w:w="80" w:type="dxa"/>
+              <w:right w:w="120" w:type="dxa"/>
+            </w:tcMar>
+            <w:vAlign w:val="center"/>
+          </w:tcPr>
+          <w:p>
+            <w:pPr>
+              <w:spacing w:after="0" w:line="240" w:lineRule="auto"/>
+              <w:jc w:val="left"/>
+            </w:pPr>
+            <w:r>
+              <w:rPr>
+                <w:sz w:val="21"/>
+              </w:rPr>
+              <w:t>Thiếu trường bắt buộc, làm lại và tăng tỷ lệ hủy.</w:t>
+            </w:r>
+          </w:p>
+        </w:tc>
+        <w:tc>
+          <w:tcPr>
+            <w:tcW w:w="2270" w:type="dxa"/>
+            <w:tcMar>
+              <w:top w:w="80" w:type="dxa"/>
+              <w:left w:w="120" w:type="dxa"/>
+              <w:bottom w:w="80" w:type="dxa"/>
+              <w:right w:w="120" w:type="dxa"/>
+            </w:tcMar>
+            <w:vAlign w:val="center"/>
+          </w:tcPr>
+          <w:p>
+            <w:pPr>
+              <w:spacing w:after="0" w:line="240" w:lineRule="auto"/>
+              <w:jc w:val="left"/>
+            </w:pPr>
+            <w:r>
+              <w:rPr>
+                <w:sz w:val="21"/>
+              </w:rPr>
+              <w:t>Validation ngay trên form và gợi ý địa chỉ chuẩn.</w:t>
+            </w:r>
+          </w:p>
+        </w:tc>
+      </w:tr>
+      <w:tr>
+        <w:trPr>
+          <w:cantSplit/>
+        </w:trPr>
+        <w:tc>
+          <w:tcPr>
+            <w:tcW w:w="1702" w:type="dxa"/>
+            <w:tcMar>
+              <w:top w:w="80" w:type="dxa"/>
+              <w:left w:w="120" w:type="dxa"/>
+              <w:bottom w:w="80" w:type="dxa"/>
+              <w:right w:w="120" w:type="dxa"/>
+            </w:tcMar>
+            <w:vAlign w:val="center"/>
+          </w:tcPr>
+          <w:p>
+            <w:pPr>
+              <w:spacing w:after="0" w:line="240" w:lineRule="auto"/>
+              <w:jc w:val="center"/>
+            </w:pPr>
+            <w:r>
+              <w:rPr>
+                <w:sz w:val="21"/>
+              </w:rPr>
+              <w:lastRenderedPageBreak/>
+              <w:t>Thao tác lặp lại</w:t>
+            </w:r>
+          </w:p>
+        </w:tc>
+        <w:tc>
+          <w:tcPr>
+            <w:tcW w:w="2269" w:type="dxa"/>
+            <w:tcMar>
+              <w:top w:w="80" w:type="dxa"/>
+              <w:left w:w="120" w:type="dxa"/>
+              <w:bottom w:w="80" w:type="dxa"/>
+              <w:right w:w="120" w:type="dxa"/>
+            </w:tcMar>
+            <w:vAlign w:val="center"/>
+          </w:tcPr>
+          <w:p>
+            <w:pPr>
+              <w:spacing w:after="0" w:line="240" w:lineRule="auto"/>
+              <w:jc w:val="left"/>
+            </w:pPr>
+            <w:r>
+              <w:rPr>
+                <w:sz w:val="21"/>
+              </w:rPr>
+              <w:t>Nhập cùng dữ liệu ở nhiều kênh/bảng.</w:t>
+            </w:r>
+          </w:p>
+        </w:tc>
+        <w:tc>
+          <w:tcPr>
+            <w:tcW w:w="2553" w:type="dxa"/>
+            <w:tcMar>
+              <w:top w:w="80" w:type="dxa"/>
+              <w:left w:w="120" w:type="dxa"/>
+              <w:bottom w:w="80" w:type="dxa"/>
+              <w:right w:w="120" w:type="dxa"/>
+            </w:tcMar>
+            <w:vAlign w:val="center"/>
+          </w:tcPr>
+          <w:p>
+            <w:pPr>
+              <w:spacing w:after="0" w:line="240" w:lineRule="auto"/>
+              <w:jc w:val="left"/>
+            </w:pPr>
+            <w:r>
+              <w:rPr>
+                <w:sz w:val="21"/>
+              </w:rPr>
+              <w:t>Thiếu tái sử dụng dữ liệu và idempotency (gọi lại không tạo đơn lặp).</w:t>
+            </w:r>
+          </w:p>
+        </w:tc>
+        <w:tc>
+          <w:tcPr>
+            <w:tcW w:w="2270" w:type="dxa"/>
+            <w:tcMar>
+              <w:top w:w="80" w:type="dxa"/>
+              <w:left w:w="120" w:type="dxa"/>
+              <w:bottom w:w="80" w:type="dxa"/>
+              <w:right w:w="120" w:type="dxa"/>
+            </w:tcMar>
+            <w:vAlign w:val="center"/>
+          </w:tcPr>
+          <w:p>
+            <w:pPr>
+              <w:spacing w:after="0" w:line="240" w:lineRule="auto"/>
+              <w:jc w:val="left"/>
+            </w:pPr>
+            <w:r>
+              <w:rPr>
+                <w:sz w:val="21"/>
+              </w:rPr>
+              <w:t>Mẫu dùng lại, mã tham chiếu và CHECK_UNIQUE.</w:t>
+            </w:r>
+          </w:p>
+        </w:tc>
+      </w:tr>
+      <w:tr>
+        <w:trPr>
+          <w:cantSplit/>
+        </w:trPr>
+        <w:tc>
+          <w:tcPr>
+            <w:tcW w:w="1702" w:type="dxa"/>
+            <w:tcMar>
+              <w:top w:w="80" w:type="dxa"/>
+              <w:left w:w="120" w:type="dxa"/>
+              <w:bottom w:w="80" w:type="dxa"/>
+              <w:right w:w="120" w:type="dxa"/>
+            </w:tcMar>
+            <w:vAlign w:val="center"/>
+          </w:tcPr>
+          <w:p>
+            <w:pPr>
+              <w:spacing w:after="0" w:line="240" w:lineRule="auto"/>
+              <w:jc w:val="center"/>
+            </w:pPr>
+            <w:r>
+              <w:rPr>
+                <w:sz w:val="21"/>
+              </w:rPr>
+              <w:t>Xử lý ngoại lệ</w:t>
+            </w:r>
+          </w:p>
+        </w:tc>
+        <w:tc>
+          <w:tcPr>
+            <w:tcW w:w="2269" w:type="dxa"/>
+            <w:tcMar>
+              <w:top w:w="80" w:type="dxa"/>
+              <w:left w:w="120" w:type="dxa"/>
+              <w:bottom w:w="80" w:type="dxa"/>
+              <w:right w:w="120" w:type="dxa"/>
+            </w:tcMar>
+            <w:vAlign w:val="center"/>
+          </w:tcPr>
+          <w:p>
+            <w:pPr>
+              <w:spacing w:after="0" w:line="240" w:lineRule="auto"/>
+              <w:jc w:val="left"/>
+            </w:pPr>
+            <w:r>
+              <w:rPr>
+                <w:sz w:val="21"/>
+              </w:rPr>
+              <w:t>Chuyển tay giữa quầy, hỗ trợ và tích hợp.</w:t>
+            </w:r>
+          </w:p>
+        </w:tc>
+        <w:tc>
+          <w:tcPr>
+            <w:tcW w:w="2553" w:type="dxa"/>
+            <w:tcMar>
+              <w:top w:w="80" w:type="dxa"/>
+              <w:left w:w="120" w:type="dxa"/>
+              <w:bottom w:w="80" w:type="dxa"/>
+              <w:right w:w="120" w:type="dxa"/>
+            </w:tcMar>
+            <w:vAlign w:val="center"/>
+          </w:tcPr>
+          <w:p>
+            <w:pPr>
+              <w:spacing w:after="0" w:line="240" w:lineRule="auto"/>
+              <w:jc w:val="left"/>
+            </w:pPr>
+            <w:r>
+              <w:rPr>
+                <w:sz w:val="21"/>
+              </w:rPr>
+              <w:t>Không có hàng đợi lỗi tập trung, khó truy vết.</w:t>
+            </w:r>
+          </w:p>
+        </w:tc>
+        <w:tc>
+          <w:tcPr>
+            <w:tcW w:w="2270" w:type="dxa"/>
+            <w:tcMar>
+              <w:top w:w="80" w:type="dxa"/>
+              <w:left w:w="120" w:type="dxa"/>
+              <w:bottom w:w="80" w:type="dxa"/>
+              <w:right w:w="120" w:type="dxa"/>
+            </w:tcMar>
+            <w:vAlign w:val="center"/>
+          </w:tcPr>
+          <w:p>
+            <w:pPr>
+              <w:spacing w:after="0" w:line="240" w:lineRule="auto"/>
+              <w:jc w:val="left"/>
+            </w:pPr>
+            <w:r>
+              <w:rPr>
+                <w:sz w:val="21"/>
+              </w:rPr>
+              <w:t>Mã lỗi thống nhất, owner và SLA cho từng ngoại lệ.</w:t>
+            </w:r>
+          </w:p>
+        </w:tc>
+      </w:tr>
+      <w:tr>
+        <w:trPr>
+          <w:cantSplit/>
+        </w:trPr>
+        <w:tc>
+          <w:tcPr>
+            <w:tcW w:w="1702" w:type="dxa"/>
+            <w:tcMar>
+              <w:top w:w="80" w:type="dxa"/>
+              <w:left w:w="120" w:type="dxa"/>
+              <w:bottom w:w="80" w:type="dxa"/>
+              <w:right w:w="120" w:type="dxa"/>
+            </w:tcMar>
+            <w:vAlign w:val="center"/>
+          </w:tcPr>
+          <w:p>
+            <w:pPr>
+              <w:spacing w:after="0" w:line="240" w:lineRule="auto"/>
+              <w:jc w:val="center"/>
+            </w:pPr>
+            <w:r>
+              <w:rPr>
+                <w:sz w:val="21"/>
+              </w:rPr>
+              <w:t>Di chuyển không cần thiết</w:t>
+            </w:r>
+          </w:p>
+        </w:tc>
+        <w:tc>
+          <w:tcPr>
+            <w:tcW w:w="2269" w:type="dxa"/>
+            <w:tcMar>
+              <w:top w:w="80" w:type="dxa"/>
+              <w:left w:w="120" w:type="dxa"/>
+              <w:bottom w:w="80" w:type="dxa"/>
+              <w:right w:w="120" w:type="dxa"/>
+            </w:tcMar>
+            <w:vAlign w:val="center"/>
+          </w:tcPr>
+          <w:p>
+            <w:pPr>
+              <w:spacing w:after="0" w:line="240" w:lineRule="auto"/>
+              <w:jc w:val="left"/>
+            </w:pPr>
+            <w:r>
+              <w:rPr>
+                <w:sz w:val="21"/>
+              </w:rPr>
+              <w:t>Khách đi lại chỉ để bổ sung thông tin.</w:t>
+            </w:r>
+          </w:p>
+        </w:tc>
+        <w:tc>
+          <w:tcPr>
+            <w:tcW w:w="2553" w:type="dxa"/>
+            <w:tcMar>
+              <w:top w:w="80" w:type="dxa"/>
+              <w:left w:w="120" w:type="dxa"/>
+              <w:bottom w:w="80" w:type="dxa"/>
+              <w:right w:w="120" w:type="dxa"/>
+            </w:tcMar>
+            <w:vAlign w:val="center"/>
+          </w:tcPr>
+          <w:p>
+            <w:pPr>
+              <w:spacing w:after="0" w:line="240" w:lineRule="auto"/>
+              <w:jc w:val="left"/>
+            </w:pPr>
+            <w:r>
+              <w:rPr>
+                <w:sz w:val="21"/>
+              </w:rPr>
+              <w:t>Kênh điện tử chưa hiển thị đủ yêu cầu.</w:t>
+            </w:r>
+          </w:p>
+        </w:tc>
+        <w:tc>
+          <w:tcPr>
+            <w:tcW w:w="2270" w:type="dxa"/>
+            <w:tcMar>
+              <w:top w:w="80" w:type="dxa"/>
+              <w:left w:w="120" w:type="dxa"/>
+              <w:bottom w:w="80" w:type="dxa"/>
+              <w:right w:w="120" w:type="dxa"/>
+            </w:tcMar>
+            <w:vAlign w:val="center"/>
+          </w:tcPr>
+          <w:p>
+            <w:pPr>
+              <w:spacing w:after="0" w:line="240" w:lineRule="auto"/>
+              <w:jc w:val="left"/>
+            </w:pPr>
+            <w:r>
+              <w:rPr>
+                <w:sz w:val="21"/>
+              </w:rPr>
+              <w:t>Thông báo rõ điều kiện, cho phép sửa từ xa.</w:t>
+            </w:r>
+          </w:p>
+        </w:tc>
+      </w:tr>
+    </w:tbl>
+    <w:p>
+      <w:pPr>
+        <w:jc w:val="center"/>
+      </w:pPr>
+      <w:proofErr w:type="spellStart"/>
+      <w:r>
+        <w:rPr>
+          <w:sz w:val="24"/>
+        </w:rPr>
+        <w:t>Bảng</w:t>
+      </w:r>
+      <w:proofErr w:type="spellEnd"/>
+      <w:r>
+        <w:rPr>
+          <w:sz w:val="24"/>
+        </w:rPr>
+        <w:t xml:space="preserve"> 1.7. </w:t>
+      </w:r>
+      <w:proofErr w:type="spellStart"/>
+      <w:r>
+        <w:rPr>
+          <w:sz w:val="24"/>
+        </w:rPr>
+        <w:t>Nhận</w:t>
+      </w:r>
+      <w:proofErr w:type="spellEnd"/>
+      <w:r>
+        <w:rPr>
+          <w:sz w:val="24"/>
+        </w:rPr>
+        <w:t xml:space="preserve"> </w:t>
+      </w:r>
+      <w:proofErr w:type="spellStart"/>
+      <w:r>
+        <w:rPr>
+          <w:sz w:val="24"/>
+        </w:rPr>
+        <w:t>diện</w:t>
+      </w:r>
+      <w:proofErr w:type="spellEnd"/>
+      <w:r>
+        <w:rPr>
+          <w:sz w:val="24"/>
+        </w:rPr>
+        <w:t xml:space="preserve"> </w:t>
+      </w:r>
+      <w:proofErr w:type="spellStart"/>
+      <w:r>
+        <w:rPr>
+          <w:sz w:val="24"/>
+        </w:rPr>
+        <w:t>lãng</w:t>
+      </w:r>
+      <w:proofErr w:type="spellEnd"/>
+      <w:r>
+        <w:rPr>
+          <w:sz w:val="24"/>
+        </w:rPr>
+        <w:t xml:space="preserve"> </w:t>
+      </w:r>
+      <w:proofErr w:type="spellStart"/>
+      <w:r>
+        <w:rPr>
+          <w:sz w:val="24"/>
+        </w:rPr>
+        <w:t>phí</w:t>
+      </w:r>
+      <w:proofErr w:type="spellEnd"/>
+      <w:r>
+        <w:rPr>
+          <w:sz w:val="24"/>
+        </w:rPr>
+        <w:t xml:space="preserve"> </w:t>
+      </w:r>
+      <w:proofErr w:type="spellStart"/>
+      <w:r>
+        <w:rPr>
+          <w:sz w:val="24"/>
+        </w:rPr>
+        <w:t>và</w:t>
+      </w:r>
+      <w:proofErr w:type="spellEnd"/>
+      <w:r>
+        <w:rPr>
+          <w:sz w:val="24"/>
+        </w:rPr>
+        <w:t xml:space="preserve"> </w:t>
+      </w:r>
+      <w:proofErr w:type="spellStart"/>
+      <w:r>
+        <w:rPr>
+          <w:sz w:val="24"/>
+        </w:rPr>
+        <w:t>hướng</w:t>
+      </w:r>
+      <w:proofErr w:type="spellEnd"/>
+      <w:r>
+        <w:rPr>
+          <w:sz w:val="24"/>
+        </w:rPr>
+        <w:t xml:space="preserve"> </w:t>
+      </w:r>
+      <w:proofErr w:type="spellStart"/>
+      <w:r>
+        <w:rPr>
+          <w:sz w:val="24"/>
+        </w:rPr>
+        <w:t>giảm</w:t>
+      </w:r>
+      <w:proofErr w:type="spellEnd"/>
+      <w:r>
+        <w:rPr>
+          <w:sz w:val="24"/>
+        </w:rPr>
+        <w:t xml:space="preserve"> </w:t>
+      </w:r>
+      <w:proofErr w:type="spellStart"/>
+      <w:r>
+        <w:rPr>
+          <w:sz w:val="24"/>
+        </w:rPr>
+        <w:t>thiểu</w:t>
+      </w:r>
+      <w:proofErr w:type="spellEnd"/>
+    </w:p>
+    <w:p>
+      <w:proofErr w:type="spellStart"/>
+      <w:r>
+        <w:t>Kết</w:t>
+      </w:r>
+      <w:proofErr w:type="spellEnd"/>
+      <w:r>
+        <w:t xml:space="preserve"> </w:t>
+      </w:r>
+      <w:proofErr w:type="spellStart"/>
+      <w:r>
+        <w:t>luận</w:t>
+      </w:r>
+      <w:proofErr w:type="spellEnd"/>
+      <w:r>
+        <w:t xml:space="preserve"> </w:t>
+      </w:r>
+      <w:proofErr w:type="spellStart"/>
+      <w:r>
+        <w:t>định</w:t>
+      </w:r>
+      <w:proofErr w:type="spellEnd"/>
+      <w:r>
+        <w:t xml:space="preserve"> </w:t>
+      </w:r>
+      <w:proofErr w:type="spellStart"/>
+      <w:r>
+        <w:t>tính</w:t>
+      </w:r>
+      <w:proofErr w:type="spellEnd"/>
+      <w:r>
+        <w:t xml:space="preserve">: </w:t>
+      </w:r>
+      <w:proofErr w:type="spellStart"/>
+      <w:r>
+        <w:t>các</w:t>
+      </w:r>
+      <w:proofErr w:type="spellEnd"/>
+      <w:r>
+        <w:t xml:space="preserve"> </w:t>
+      </w:r>
+      <w:proofErr w:type="spellStart"/>
+      <w:r>
+        <w:t>bước</w:t>
+      </w:r>
+      <w:proofErr w:type="spellEnd"/>
+      <w:r>
+        <w:t xml:space="preserve"> </w:t>
+      </w:r>
+      <w:proofErr w:type="spellStart"/>
+      <w:r>
+        <w:t>chuẩn</w:t>
+      </w:r>
+      <w:proofErr w:type="spellEnd"/>
+      <w:r>
+        <w:t xml:space="preserve"> </w:t>
+      </w:r>
+      <w:proofErr w:type="spellStart"/>
+      <w:r>
+        <w:t>hóa</w:t>
+      </w:r>
+      <w:proofErr w:type="spellEnd"/>
+      <w:r>
+        <w:t>, tra dịch vụ và kiểm tra trùng là BVA/VA cần giữ, nhưng phải chuyển từ kiểm tra muộn sang kiểm tra sớm. NVA tập trung ở vòng sửa/hủy và chờ ngoại lệ; đây là nơi nên ưu tiên tự động hóa và hiển thị phản hồi theo thời gian thực.</w:t>
       </w:r>
     </w:p>
     <w:sectPr>

</xml_diff>

<commit_message>
feat: Add quantitative analysis section with processing time and cycle time calculations
</commit_message>
<xml_diff>
--- a/01.WORKING_SPACE/duy/25410194_Nguyen_Thanh_Duy_quy_trinh_tiep_nhan_don_hang.docx
+++ b/01.WORKING_SPACE/duy/25410194_Nguyen_Thanh_Duy_quy_trinh_tiep_nhan_don_hang.docx
@@ -6185,10 +6185,1980 @@
         <w:t>, tra dịch vụ và kiểm tra trùng là BVA/VA cần giữ, nhưng phải chuyển từ kiểm tra muộn sang kiểm tra sớm. NVA tập trung ở vòng sửa/hủy và chờ ngoại lệ; đây là nơi nên ưu tiên tự động hóa và hiển thị phản hồi theo thời gian thực.</w:t>
       </w:r>
     </w:p>
+    <w:p>
+      <w:pPr>
+        <w:pStyle w:val="Heading3"/>
+        <w:spacing w:line="240" w:lineRule="auto"/>
+      </w:pPr>
+      <w:r>
+        <w:t>1.4. Phân tích định lượng</w:t>
+      </w:r>
+    </w:p>
+    <w:p>
+      <w:r>
+        <w:t>Do Viettel Post không công bố bộ dữ liệu vận hành đủ cho từng bước tiếp nhận trong các nguồn đã kiểm tra, mô hình dưới đây là giả định mô phỏng học thuật. Mục tiêu là minh họa cách tính thời gian xử lý và độ nhạy với hàng đợi; không dùng để khẳng định KPI thực tế của doanh nghiệp.</w:t>
+      </w:r>
+    </w:p>
+    <w:p>
+      <w:pPr>
+        <w:pStyle w:val="Caption1"/>
+        <w:rPr>
+          <w:rFonts w:cs="Times New Roman"/>
+        </w:rPr>
+      </w:pPr>
+    </w:p>
+    <w:tbl>
+      <w:tblPr>
+        <w:tblW w:w="8794" w:type="dxa"/>
+        <w:tblInd w:w="120" w:type="dxa"/>
+        <w:tblBorders>
+          <w:top w:val="single" w:sz="6" w:space="0" w:color="9EADBA"/>
+          <w:left w:val="single" w:sz="6" w:space="0" w:color="9EADBA"/>
+          <w:bottom w:val="single" w:sz="6" w:space="0" w:color="9EADBA"/>
+          <w:right w:val="single" w:sz="6" w:space="0" w:color="9EADBA"/>
+          <w:insideH w:val="single" w:sz="6" w:space="0" w:color="9EADBA"/>
+          <w:insideV w:val="single" w:sz="6" w:space="0" w:color="9EADBA"/>
+        </w:tblBorders>
+        <w:tblLayout w:type="fixed"/>
+        <w:tblLook w:val="04A0" w:firstRow="1" w:lastRow="0" w:firstColumn="1" w:lastColumn="0" w:noHBand="0" w:noVBand="1"/>
+      </w:tblPr>
+      <w:tblGrid>
+        <w:gridCol w:w="2269"/>
+        <w:gridCol w:w="1702"/>
+        <w:gridCol w:w="4823"/>
+      </w:tblGrid>
+      <w:tr>
+        <w:trPr>
+          <w:cantSplit/>
+          <w:tblHeader/>
+        </w:trPr>
+        <w:tc>
+          <w:tcPr>
+            <w:tcW w:w="2269" w:type="dxa"/>
+            <w:shd w:val="clear" w:color="auto" w:fill="DCE6F1"/>
+            <w:tcMar>
+              <w:top w:w="80" w:type="dxa"/>
+              <w:left w:w="120" w:type="dxa"/>
+              <w:bottom w:w="80" w:type="dxa"/>
+              <w:right w:w="120" w:type="dxa"/>
+            </w:tcMar>
+            <w:vAlign w:val="center"/>
+          </w:tcPr>
+          <w:p>
+            <w:pPr>
+              <w:keepNext/>
+              <w:spacing w:after="0" w:line="240" w:lineRule="auto"/>
+              <w:jc w:val="center"/>
+            </w:pPr>
+            <w:r>
+              <w:rPr>
+                <w:b/>
+                <w:sz w:val="21"/>
+              </w:rPr>
+              <w:t>Tham số</w:t>
+            </w:r>
+          </w:p>
+        </w:tc>
+        <w:tc>
+          <w:tcPr>
+            <w:tcW w:w="1702" w:type="dxa"/>
+            <w:shd w:val="clear" w:color="auto" w:fill="DCE6F1"/>
+            <w:tcMar>
+              <w:top w:w="80" w:type="dxa"/>
+              <w:left w:w="120" w:type="dxa"/>
+              <w:bottom w:w="80" w:type="dxa"/>
+              <w:right w:w="120" w:type="dxa"/>
+            </w:tcMar>
+            <w:vAlign w:val="center"/>
+          </w:tcPr>
+          <w:p>
+            <w:pPr>
+              <w:keepNext/>
+              <w:spacing w:after="0" w:line="240" w:lineRule="auto"/>
+              <w:jc w:val="center"/>
+            </w:pPr>
+            <w:r>
+              <w:rPr>
+                <w:b/>
+                <w:sz w:val="21"/>
+              </w:rPr>
+              <w:t>Giá trị giả định</w:t>
+            </w:r>
+          </w:p>
+        </w:tc>
+        <w:tc>
+          <w:tcPr>
+            <w:tcW w:w="4823" w:type="dxa"/>
+            <w:shd w:val="clear" w:color="auto" w:fill="DCE6F1"/>
+            <w:tcMar>
+              <w:top w:w="80" w:type="dxa"/>
+              <w:left w:w="120" w:type="dxa"/>
+              <w:bottom w:w="80" w:type="dxa"/>
+              <w:right w:w="120" w:type="dxa"/>
+            </w:tcMar>
+            <w:vAlign w:val="center"/>
+          </w:tcPr>
+          <w:p>
+            <w:pPr>
+              <w:keepNext/>
+              <w:spacing w:after="0" w:line="240" w:lineRule="auto"/>
+              <w:jc w:val="center"/>
+            </w:pPr>
+            <w:r>
+              <w:rPr>
+                <w:b/>
+                <w:sz w:val="21"/>
+              </w:rPr>
+              <w:t>Cách dùng/cơ sở</w:t>
+            </w:r>
+          </w:p>
+        </w:tc>
+      </w:tr>
+      <w:tr>
+        <w:trPr>
+          <w:cantSplit/>
+        </w:trPr>
+        <w:tc>
+          <w:tcPr>
+            <w:tcW w:w="2269" w:type="dxa"/>
+            <w:tcMar>
+              <w:top w:w="80" w:type="dxa"/>
+              <w:left w:w="120" w:type="dxa"/>
+              <w:bottom w:w="80" w:type="dxa"/>
+              <w:right w:w="120" w:type="dxa"/>
+            </w:tcMar>
+            <w:vAlign w:val="center"/>
+          </w:tcPr>
+          <w:p>
+            <w:pPr>
+              <w:spacing w:after="0" w:line="240" w:lineRule="auto"/>
+              <w:jc w:val="center"/>
+            </w:pPr>
+            <w:r>
+              <w:rPr>
+                <w:sz w:val="21"/>
+              </w:rPr>
+              <w:t>Kênh điện tử</w:t>
+            </w:r>
+          </w:p>
+        </w:tc>
+        <w:tc>
+          <w:tcPr>
+            <w:tcW w:w="1702" w:type="dxa"/>
+            <w:tcMar>
+              <w:top w:w="80" w:type="dxa"/>
+              <w:left w:w="120" w:type="dxa"/>
+              <w:bottom w:w="80" w:type="dxa"/>
+              <w:right w:w="120" w:type="dxa"/>
+            </w:tcMar>
+            <w:vAlign w:val="center"/>
+          </w:tcPr>
+          <w:p>
+            <w:pPr>
+              <w:spacing w:after="0" w:line="240" w:lineRule="auto"/>
+              <w:jc w:val="left"/>
+            </w:pPr>
+            <w:r>
+              <w:rPr>
+                <w:sz w:val="21"/>
+              </w:rPr>
+              <w:t>80% đơn; 3 phút</w:t>
+            </w:r>
+          </w:p>
+        </w:tc>
+        <w:tc>
+          <w:tcPr>
+            <w:tcW w:w="4823" w:type="dxa"/>
+            <w:tcMar>
+              <w:top w:w="80" w:type="dxa"/>
+              <w:left w:w="120" w:type="dxa"/>
+              <w:bottom w:w="80" w:type="dxa"/>
+              <w:right w:w="120" w:type="dxa"/>
+            </w:tcMar>
+            <w:vAlign w:val="center"/>
+          </w:tcPr>
+          <w:p>
+            <w:pPr>
+              <w:spacing w:after="0" w:line="240" w:lineRule="auto"/>
+              <w:jc w:val="left"/>
+            </w:pPr>
+            <w:r>
+              <w:rPr>
+                <w:sz w:val="21"/>
+              </w:rPr>
+              <w:t>Thời gian nhập/gửi giả định.</w:t>
+            </w:r>
+          </w:p>
+        </w:tc>
+      </w:tr>
+      <w:tr>
+        <w:trPr>
+          <w:cantSplit/>
+        </w:trPr>
+        <w:tc>
+          <w:tcPr>
+            <w:tcW w:w="2269" w:type="dxa"/>
+            <w:tcMar>
+              <w:top w:w="80" w:type="dxa"/>
+              <w:left w:w="120" w:type="dxa"/>
+              <w:bottom w:w="80" w:type="dxa"/>
+              <w:right w:w="120" w:type="dxa"/>
+            </w:tcMar>
+            <w:vAlign w:val="center"/>
+          </w:tcPr>
+          <w:p>
+            <w:pPr>
+              <w:spacing w:after="0" w:line="240" w:lineRule="auto"/>
+              <w:jc w:val="center"/>
+            </w:pPr>
+            <w:r>
+              <w:rPr>
+                <w:sz w:val="21"/>
+              </w:rPr>
+              <w:t>Quầy/nhân viên hỗ trợ</w:t>
+            </w:r>
+          </w:p>
+        </w:tc>
+        <w:tc>
+          <w:tcPr>
+            <w:tcW w:w="1702" w:type="dxa"/>
+            <w:tcMar>
+              <w:top w:w="80" w:type="dxa"/>
+              <w:left w:w="120" w:type="dxa"/>
+              <w:bottom w:w="80" w:type="dxa"/>
+              <w:right w:w="120" w:type="dxa"/>
+            </w:tcMar>
+            <w:vAlign w:val="center"/>
+          </w:tcPr>
+          <w:p>
+            <w:pPr>
+              <w:spacing w:after="0" w:line="240" w:lineRule="auto"/>
+              <w:jc w:val="left"/>
+            </w:pPr>
+            <w:r>
+              <w:rPr>
+                <w:sz w:val="21"/>
+              </w:rPr>
+              <w:t>20% đơn; 8 phút</w:t>
+            </w:r>
+          </w:p>
+        </w:tc>
+        <w:tc>
+          <w:tcPr>
+            <w:tcW w:w="4823" w:type="dxa"/>
+            <w:tcMar>
+              <w:top w:w="80" w:type="dxa"/>
+              <w:left w:w="120" w:type="dxa"/>
+              <w:bottom w:w="80" w:type="dxa"/>
+              <w:right w:w="120" w:type="dxa"/>
+            </w:tcMar>
+            <w:vAlign w:val="center"/>
+          </w:tcPr>
+          <w:p>
+            <w:pPr>
+              <w:spacing w:after="0" w:line="240" w:lineRule="auto"/>
+              <w:jc w:val="left"/>
+            </w:pPr>
+            <w:r>
+              <w:rPr>
+                <w:sz w:val="21"/>
+              </w:rPr>
+              <w:t>Thời gian nhập/gửi giả định.</w:t>
+            </w:r>
+          </w:p>
+        </w:tc>
+      </w:tr>
+      <w:tr>
+        <w:trPr>
+          <w:cantSplit/>
+        </w:trPr>
+        <w:tc>
+          <w:tcPr>
+            <w:tcW w:w="2269" w:type="dxa"/>
+            <w:tcMar>
+              <w:top w:w="80" w:type="dxa"/>
+              <w:left w:w="120" w:type="dxa"/>
+              <w:bottom w:w="80" w:type="dxa"/>
+              <w:right w:w="120" w:type="dxa"/>
+            </w:tcMar>
+            <w:vAlign w:val="center"/>
+          </w:tcPr>
+          <w:p>
+            <w:pPr>
+              <w:spacing w:after="0" w:line="240" w:lineRule="auto"/>
+              <w:jc w:val="center"/>
+            </w:pPr>
+            <w:r>
+              <w:rPr>
+                <w:sz w:val="21"/>
+              </w:rPr>
+              <w:t>Nhận yêu cầu kỳ vọng</w:t>
+            </w:r>
+          </w:p>
+        </w:tc>
+        <w:tc>
+          <w:tcPr>
+            <w:tcW w:w="1702" w:type="dxa"/>
+            <w:tcMar>
+              <w:top w:w="80" w:type="dxa"/>
+              <w:left w:w="120" w:type="dxa"/>
+              <w:bottom w:w="80" w:type="dxa"/>
+              <w:right w:w="120" w:type="dxa"/>
+            </w:tcMar>
+            <w:vAlign w:val="center"/>
+          </w:tcPr>
+          <w:p>
+            <w:pPr>
+              <w:spacing w:after="0" w:line="240" w:lineRule="auto"/>
+              <w:jc w:val="left"/>
+            </w:pPr>
+            <w:r>
+              <w:rPr>
+                <w:sz w:val="21"/>
+              </w:rPr>
+              <w:t>4 phút</w:t>
+            </w:r>
+          </w:p>
+        </w:tc>
+        <w:tc>
+          <w:tcPr>
+            <w:tcW w:w="4823" w:type="dxa"/>
+            <w:tcMar>
+              <w:top w:w="80" w:type="dxa"/>
+              <w:left w:w="120" w:type="dxa"/>
+              <w:bottom w:w="80" w:type="dxa"/>
+              <w:right w:w="120" w:type="dxa"/>
+            </w:tcMar>
+            <w:vAlign w:val="center"/>
+          </w:tcPr>
+          <w:p>
+            <w:pPr>
+              <w:spacing w:after="0" w:line="240" w:lineRule="auto"/>
+              <w:jc w:val="left"/>
+            </w:pPr>
+            <w:r>
+              <w:rPr>
+                <w:sz w:val="21"/>
+              </w:rPr>
+              <w:t>0,8×3 + 0,2×8.</w:t>
+            </w:r>
+          </w:p>
+        </w:tc>
+      </w:tr>
+      <w:tr>
+        <w:trPr>
+          <w:cantSplit/>
+        </w:trPr>
+        <w:tc>
+          <w:tcPr>
+            <w:tcW w:w="2269" w:type="dxa"/>
+            <w:tcMar>
+              <w:top w:w="80" w:type="dxa"/>
+              <w:left w:w="120" w:type="dxa"/>
+              <w:bottom w:w="80" w:type="dxa"/>
+              <w:right w:w="120" w:type="dxa"/>
+            </w:tcMar>
+            <w:vAlign w:val="center"/>
+          </w:tcPr>
+          <w:p>
+            <w:pPr>
+              <w:spacing w:after="0" w:line="240" w:lineRule="auto"/>
+              <w:jc w:val="center"/>
+            </w:pPr>
+            <w:r>
+              <w:rPr>
+                <w:sz w:val="21"/>
+              </w:rPr>
+              <w:t>Kiểm tra và chuẩn hóa</w:t>
+            </w:r>
+          </w:p>
+        </w:tc>
+        <w:tc>
+          <w:tcPr>
+            <w:tcW w:w="1702" w:type="dxa"/>
+            <w:tcMar>
+              <w:top w:w="80" w:type="dxa"/>
+              <w:left w:w="120" w:type="dxa"/>
+              <w:bottom w:w="80" w:type="dxa"/>
+              <w:right w:w="120" w:type="dxa"/>
+            </w:tcMar>
+            <w:vAlign w:val="center"/>
+          </w:tcPr>
+          <w:p>
+            <w:pPr>
+              <w:spacing w:after="0" w:line="240" w:lineRule="auto"/>
+              <w:jc w:val="left"/>
+            </w:pPr>
+            <w:r>
+              <w:rPr>
+                <w:sz w:val="21"/>
+              </w:rPr>
+              <w:t>2 phút</w:t>
+            </w:r>
+          </w:p>
+        </w:tc>
+        <w:tc>
+          <w:tcPr>
+            <w:tcW w:w="4823" w:type="dxa"/>
+            <w:tcMar>
+              <w:top w:w="80" w:type="dxa"/>
+              <w:left w:w="120" w:type="dxa"/>
+              <w:bottom w:w="80" w:type="dxa"/>
+              <w:right w:w="120" w:type="dxa"/>
+            </w:tcMar>
+            <w:vAlign w:val="center"/>
+          </w:tcPr>
+          <w:p>
+            <w:pPr>
+              <w:spacing w:after="0" w:line="240" w:lineRule="auto"/>
+              <w:jc w:val="left"/>
+            </w:pPr>
+            <w:r>
+              <w:rPr>
+                <w:sz w:val="21"/>
+              </w:rPr>
+              <w:t>Hoạt động được PDF/API xác nhận; thời gian là giả định.</w:t>
+            </w:r>
+          </w:p>
+        </w:tc>
+      </w:tr>
+      <w:tr>
+        <w:trPr>
+          <w:cantSplit/>
+        </w:trPr>
+        <w:tc>
+          <w:tcPr>
+            <w:tcW w:w="2269" w:type="dxa"/>
+            <w:tcMar>
+              <w:top w:w="80" w:type="dxa"/>
+              <w:left w:w="120" w:type="dxa"/>
+              <w:bottom w:w="80" w:type="dxa"/>
+              <w:right w:w="120" w:type="dxa"/>
+            </w:tcMar>
+            <w:vAlign w:val="center"/>
+          </w:tcPr>
+          <w:p>
+            <w:pPr>
+              <w:spacing w:after="0" w:line="240" w:lineRule="auto"/>
+              <w:jc w:val="center"/>
+            </w:pPr>
+            <w:r>
+              <w:rPr>
+                <w:sz w:val="21"/>
+              </w:rPr>
+              <w:t>Tỷ lệ cần sửa</w:t>
+            </w:r>
+          </w:p>
+        </w:tc>
+        <w:tc>
+          <w:tcPr>
+            <w:tcW w:w="1702" w:type="dxa"/>
+            <w:tcMar>
+              <w:top w:w="80" w:type="dxa"/>
+              <w:left w:w="120" w:type="dxa"/>
+              <w:bottom w:w="80" w:type="dxa"/>
+              <w:right w:w="120" w:type="dxa"/>
+            </w:tcMar>
+            <w:vAlign w:val="center"/>
+          </w:tcPr>
+          <w:p>
+            <w:pPr>
+              <w:spacing w:after="0" w:line="240" w:lineRule="auto"/>
+              <w:jc w:val="left"/>
+            </w:pPr>
+            <w:r>
+              <w:rPr>
+                <w:sz w:val="21"/>
+              </w:rPr>
+              <w:t>8%</w:t>
+            </w:r>
+          </w:p>
+        </w:tc>
+        <w:tc>
+          <w:tcPr>
+            <w:tcW w:w="4823" w:type="dxa"/>
+            <w:tcMar>
+              <w:top w:w="80" w:type="dxa"/>
+              <w:left w:w="120" w:type="dxa"/>
+              <w:bottom w:w="80" w:type="dxa"/>
+              <w:right w:w="120" w:type="dxa"/>
+            </w:tcMar>
+            <w:vAlign w:val="center"/>
+          </w:tcPr>
+          <w:p>
+            <w:pPr>
+              <w:spacing w:after="0" w:line="240" w:lineRule="auto"/>
+              <w:jc w:val="left"/>
+            </w:pPr>
+            <w:r>
+              <w:rPr>
+                <w:sz w:val="21"/>
+              </w:rPr>
+              <w:t>Giả định; cần kiểm định bằng log thực tế.</w:t>
+            </w:r>
+          </w:p>
+        </w:tc>
+      </w:tr>
+      <w:tr>
+        <w:trPr>
+          <w:cantSplit/>
+        </w:trPr>
+        <w:tc>
+          <w:tcPr>
+            <w:tcW w:w="2269" w:type="dxa"/>
+            <w:tcMar>
+              <w:top w:w="80" w:type="dxa"/>
+              <w:left w:w="120" w:type="dxa"/>
+              <w:bottom w:w="80" w:type="dxa"/>
+              <w:right w:w="120" w:type="dxa"/>
+            </w:tcMar>
+            <w:vAlign w:val="center"/>
+          </w:tcPr>
+          <w:p>
+            <w:pPr>
+              <w:spacing w:after="0" w:line="240" w:lineRule="auto"/>
+              <w:jc w:val="center"/>
+            </w:pPr>
+            <w:r>
+              <w:rPr>
+                <w:sz w:val="21"/>
+              </w:rPr>
+              <w:t>Sửa + kiểm tra lại</w:t>
+            </w:r>
+          </w:p>
+        </w:tc>
+        <w:tc>
+          <w:tcPr>
+            <w:tcW w:w="1702" w:type="dxa"/>
+            <w:tcMar>
+              <w:top w:w="80" w:type="dxa"/>
+              <w:left w:w="120" w:type="dxa"/>
+              <w:bottom w:w="80" w:type="dxa"/>
+              <w:right w:w="120" w:type="dxa"/>
+            </w:tcMar>
+            <w:vAlign w:val="center"/>
+          </w:tcPr>
+          <w:p>
+            <w:pPr>
+              <w:spacing w:after="0" w:line="240" w:lineRule="auto"/>
+              <w:jc w:val="left"/>
+            </w:pPr>
+            <w:r>
+              <w:rPr>
+                <w:sz w:val="21"/>
+              </w:rPr>
+              <w:t>4 + 2 phút</w:t>
+            </w:r>
+          </w:p>
+        </w:tc>
+        <w:tc>
+          <w:tcPr>
+            <w:tcW w:w="4823" w:type="dxa"/>
+            <w:tcMar>
+              <w:top w:w="80" w:type="dxa"/>
+              <w:left w:w="120" w:type="dxa"/>
+              <w:bottom w:w="80" w:type="dxa"/>
+              <w:right w:w="120" w:type="dxa"/>
+            </w:tcMar>
+            <w:vAlign w:val="center"/>
+          </w:tcPr>
+          <w:p>
+            <w:pPr>
+              <w:spacing w:after="0" w:line="240" w:lineRule="auto"/>
+              <w:jc w:val="left"/>
+            </w:pPr>
+            <w:r>
+              <w:rPr>
+                <w:sz w:val="21"/>
+              </w:rPr>
+              <w:t>Giả định cho một vòng sửa tối đa.</w:t>
+            </w:r>
+          </w:p>
+        </w:tc>
+      </w:tr>
+      <w:tr>
+        <w:trPr>
+          <w:cantSplit/>
+        </w:trPr>
+        <w:tc>
+          <w:tcPr>
+            <w:tcW w:w="2269" w:type="dxa"/>
+            <w:tcMar>
+              <w:top w:w="80" w:type="dxa"/>
+              <w:left w:w="120" w:type="dxa"/>
+              <w:bottom w:w="80" w:type="dxa"/>
+              <w:right w:w="120" w:type="dxa"/>
+            </w:tcMar>
+            <w:vAlign w:val="center"/>
+          </w:tcPr>
+          <w:p>
+            <w:pPr>
+              <w:spacing w:after="0" w:line="240" w:lineRule="auto"/>
+              <w:jc w:val="center"/>
+            </w:pPr>
+            <w:r>
+              <w:rPr>
+                <w:sz w:val="21"/>
+              </w:rPr>
+              <w:t>Tra dịch vụ/tính cước</w:t>
+            </w:r>
+          </w:p>
+        </w:tc>
+        <w:tc>
+          <w:tcPr>
+            <w:tcW w:w="1702" w:type="dxa"/>
+            <w:tcMar>
+              <w:top w:w="80" w:type="dxa"/>
+              <w:left w:w="120" w:type="dxa"/>
+              <w:bottom w:w="80" w:type="dxa"/>
+              <w:right w:w="120" w:type="dxa"/>
+            </w:tcMar>
+            <w:vAlign w:val="center"/>
+          </w:tcPr>
+          <w:p>
+            <w:pPr>
+              <w:spacing w:after="0" w:line="240" w:lineRule="auto"/>
+              <w:jc w:val="left"/>
+            </w:pPr>
+            <w:r>
+              <w:rPr>
+                <w:sz w:val="21"/>
+              </w:rPr>
+              <w:t>1,5 phút</w:t>
+            </w:r>
+          </w:p>
+        </w:tc>
+        <w:tc>
+          <w:tcPr>
+            <w:tcW w:w="4823" w:type="dxa"/>
+            <w:tcMar>
+              <w:top w:w="80" w:type="dxa"/>
+              <w:left w:w="120" w:type="dxa"/>
+              <w:bottom w:w="80" w:type="dxa"/>
+              <w:right w:w="120" w:type="dxa"/>
+            </w:tcMar>
+            <w:vAlign w:val="center"/>
+          </w:tcPr>
+          <w:p>
+            <w:pPr>
+              <w:spacing w:after="0" w:line="240" w:lineRule="auto"/>
+              <w:jc w:val="left"/>
+            </w:pPr>
+            <w:r>
+              <w:rPr>
+                <w:sz w:val="21"/>
+              </w:rPr>
+              <w:t>Giả định mô phỏng.</w:t>
+            </w:r>
+          </w:p>
+        </w:tc>
+      </w:tr>
+      <w:tr>
+        <w:trPr>
+          <w:cantSplit/>
+        </w:trPr>
+        <w:tc>
+          <w:tcPr>
+            <w:tcW w:w="2269" w:type="dxa"/>
+            <w:tcMar>
+              <w:top w:w="80" w:type="dxa"/>
+              <w:left w:w="120" w:type="dxa"/>
+              <w:bottom w:w="80" w:type="dxa"/>
+              <w:right w:w="120" w:type="dxa"/>
+            </w:tcMar>
+            <w:vAlign w:val="center"/>
+          </w:tcPr>
+          <w:p>
+            <w:pPr>
+              <w:spacing w:after="0" w:line="240" w:lineRule="auto"/>
+              <w:jc w:val="center"/>
+            </w:pPr>
+            <w:r>
+              <w:rPr>
+                <w:sz w:val="21"/>
+              </w:rPr>
+              <w:t>Kiểm tra trùng</w:t>
+            </w:r>
+          </w:p>
+        </w:tc>
+        <w:tc>
+          <w:tcPr>
+            <w:tcW w:w="1702" w:type="dxa"/>
+            <w:tcMar>
+              <w:top w:w="80" w:type="dxa"/>
+              <w:left w:w="120" w:type="dxa"/>
+              <w:bottom w:w="80" w:type="dxa"/>
+              <w:right w:w="120" w:type="dxa"/>
+            </w:tcMar>
+            <w:vAlign w:val="center"/>
+          </w:tcPr>
+          <w:p>
+            <w:pPr>
+              <w:spacing w:after="0" w:line="240" w:lineRule="auto"/>
+              <w:jc w:val="left"/>
+            </w:pPr>
+            <w:r>
+              <w:rPr>
+                <w:sz w:val="21"/>
+              </w:rPr>
+              <w:t>0,5 phút</w:t>
+            </w:r>
+          </w:p>
+        </w:tc>
+        <w:tc>
+          <w:tcPr>
+            <w:tcW w:w="4823" w:type="dxa"/>
+            <w:tcMar>
+              <w:top w:w="80" w:type="dxa"/>
+              <w:left w:w="120" w:type="dxa"/>
+              <w:bottom w:w="80" w:type="dxa"/>
+              <w:right w:w="120" w:type="dxa"/>
+            </w:tcMar>
+            <w:vAlign w:val="center"/>
+          </w:tcPr>
+          <w:p>
+            <w:pPr>
+              <w:spacing w:after="0" w:line="240" w:lineRule="auto"/>
+              <w:jc w:val="left"/>
+            </w:pPr>
+            <w:proofErr w:type="spellStart"/>
+            <w:r>
+              <w:rPr>
+                <w:sz w:val="21"/>
+              </w:rPr>
+              <w:t>Giả</w:t>
+            </w:r>
+            <w:proofErr w:type="spellEnd"/>
+            <w:r>
+              <w:rPr>
+                <w:sz w:val="21"/>
+              </w:rPr>
+              <w:t xml:space="preserve"> </w:t>
+            </w:r>
+            <w:proofErr w:type="spellStart"/>
+            <w:r>
+              <w:rPr>
+                <w:sz w:val="21"/>
+              </w:rPr>
+              <w:t>định</w:t>
+            </w:r>
+            <w:proofErr w:type="spellEnd"/>
+            <w:r>
+              <w:rPr>
+                <w:sz w:val="21"/>
+              </w:rPr>
+              <w:t xml:space="preserve">; API </w:t>
+            </w:r>
+            <w:proofErr w:type="spellStart"/>
+            <w:r>
+              <w:rPr>
+                <w:sz w:val="21"/>
+              </w:rPr>
+              <w:t>có</w:t>
+            </w:r>
+            <w:proofErr w:type="spellEnd"/>
+            <w:r>
+              <w:rPr>
+                <w:sz w:val="21"/>
+              </w:rPr>
+              <w:t xml:space="preserve"> </w:t>
+            </w:r>
+            <w:proofErr w:type="spellStart"/>
+            <w:r>
+              <w:rPr>
+                <w:sz w:val="21"/>
+              </w:rPr>
+              <w:t>tùy</w:t>
+            </w:r>
+            <w:proofErr w:type="spellEnd"/>
+            <w:r>
+              <w:rPr>
+                <w:sz w:val="21"/>
+              </w:rPr>
+              <w:t xml:space="preserve"> </w:t>
+            </w:r>
+            <w:proofErr w:type="spellStart"/>
+            <w:r>
+              <w:rPr>
+                <w:sz w:val="21"/>
+              </w:rPr>
+              <w:t>chọn</w:t>
+            </w:r>
+            <w:proofErr w:type="spellEnd"/>
+            <w:r>
+              <w:rPr>
+                <w:sz w:val="21"/>
+              </w:rPr>
+              <w:t xml:space="preserve"> CHECK_UNIQUE.</w:t>
+            </w:r>
+          </w:p>
+        </w:tc>
+      </w:tr>
+      <w:tr>
+        <w:trPr>
+          <w:cantSplit/>
+        </w:trPr>
+        <w:tc>
+          <w:tcPr>
+            <w:tcW w:w="2269" w:type="dxa"/>
+            <w:tcMar>
+              <w:top w:w="80" w:type="dxa"/>
+              <w:left w:w="120" w:type="dxa"/>
+              <w:bottom w:w="80" w:type="dxa"/>
+              <w:right w:w="120" w:type="dxa"/>
+            </w:tcMar>
+            <w:vAlign w:val="center"/>
+          </w:tcPr>
+          <w:p>
+            <w:pPr>
+              <w:spacing w:after="0" w:line="240" w:lineRule="auto"/>
+              <w:jc w:val="center"/>
+            </w:pPr>
+            <w:r>
+              <w:rPr>
+                <w:sz w:val="21"/>
+              </w:rPr>
+              <w:t>Tạo mã + xác nhận</w:t>
+            </w:r>
+          </w:p>
+        </w:tc>
+        <w:tc>
+          <w:tcPr>
+            <w:tcW w:w="1702" w:type="dxa"/>
+            <w:tcMar>
+              <w:top w:w="80" w:type="dxa"/>
+              <w:left w:w="120" w:type="dxa"/>
+              <w:bottom w:w="80" w:type="dxa"/>
+              <w:right w:w="120" w:type="dxa"/>
+            </w:tcMar>
+            <w:vAlign w:val="center"/>
+          </w:tcPr>
+          <w:p>
+            <w:pPr>
+              <w:spacing w:after="0" w:line="240" w:lineRule="auto"/>
+              <w:jc w:val="left"/>
+            </w:pPr>
+            <w:r>
+              <w:rPr>
+                <w:sz w:val="21"/>
+              </w:rPr>
+              <w:t>1 phút</w:t>
+            </w:r>
+          </w:p>
+        </w:tc>
+        <w:tc>
+          <w:tcPr>
+            <w:tcW w:w="4823" w:type="dxa"/>
+            <w:tcMar>
+              <w:top w:w="80" w:type="dxa"/>
+              <w:left w:w="120" w:type="dxa"/>
+              <w:bottom w:w="80" w:type="dxa"/>
+              <w:right w:w="120" w:type="dxa"/>
+            </w:tcMar>
+            <w:vAlign w:val="center"/>
+          </w:tcPr>
+          <w:p>
+            <w:pPr>
+              <w:spacing w:after="0" w:line="240" w:lineRule="auto"/>
+              <w:jc w:val="left"/>
+            </w:pPr>
+            <w:r>
+              <w:rPr>
+                <w:sz w:val="21"/>
+              </w:rPr>
+              <w:t>Giả định mô phỏng.</w:t>
+            </w:r>
+          </w:p>
+        </w:tc>
+      </w:tr>
+      <w:tr>
+        <w:trPr>
+          <w:cantSplit/>
+        </w:trPr>
+        <w:tc>
+          <w:tcPr>
+            <w:tcW w:w="2269" w:type="dxa"/>
+            <w:tcMar>
+              <w:top w:w="80" w:type="dxa"/>
+              <w:left w:w="120" w:type="dxa"/>
+              <w:bottom w:w="80" w:type="dxa"/>
+              <w:right w:w="120" w:type="dxa"/>
+            </w:tcMar>
+            <w:vAlign w:val="center"/>
+          </w:tcPr>
+          <w:p>
+            <w:pPr>
+              <w:spacing w:after="0" w:line="240" w:lineRule="auto"/>
+              <w:jc w:val="center"/>
+            </w:pPr>
+            <w:r>
+              <w:rPr>
+                <w:sz w:val="21"/>
+              </w:rPr>
+              <w:lastRenderedPageBreak/>
+              <w:t>Chờ hàng đợi/kỹ thuật</w:t>
+            </w:r>
+          </w:p>
+        </w:tc>
+        <w:tc>
+          <w:tcPr>
+            <w:tcW w:w="1702" w:type="dxa"/>
+            <w:tcMar>
+              <w:top w:w="80" w:type="dxa"/>
+              <w:left w:w="120" w:type="dxa"/>
+              <w:bottom w:w="80" w:type="dxa"/>
+              <w:right w:w="120" w:type="dxa"/>
+            </w:tcMar>
+            <w:vAlign w:val="center"/>
+          </w:tcPr>
+          <w:p>
+            <w:pPr>
+              <w:spacing w:after="0" w:line="240" w:lineRule="auto"/>
+              <w:jc w:val="left"/>
+            </w:pPr>
+            <w:r>
+              <w:rPr>
+                <w:sz w:val="21"/>
+              </w:rPr>
+              <w:t>3 phút</w:t>
+            </w:r>
+          </w:p>
+        </w:tc>
+        <w:tc>
+          <w:tcPr>
+            <w:tcW w:w="4823" w:type="dxa"/>
+            <w:tcMar>
+              <w:top w:w="80" w:type="dxa"/>
+              <w:left w:w="120" w:type="dxa"/>
+              <w:bottom w:w="80" w:type="dxa"/>
+              <w:right w:w="120" w:type="dxa"/>
+            </w:tcMar>
+            <w:vAlign w:val="center"/>
+          </w:tcPr>
+          <w:p>
+            <w:pPr>
+              <w:spacing w:after="0" w:line="240" w:lineRule="auto"/>
+              <w:jc w:val="left"/>
+            </w:pPr>
+            <w:r>
+              <w:rPr>
+                <w:sz w:val="21"/>
+              </w:rPr>
+              <w:t>Giả định mô phỏng dùng cho cycle time.</w:t>
+            </w:r>
+          </w:p>
+        </w:tc>
+      </w:tr>
+    </w:tbl>
+    <w:p>
+      <w:pPr>
+        <w:jc w:val="center"/>
+        <w:rPr>
+          <w:sz w:val="24"/>
+        </w:rPr>
+      </w:pPr>
+      <w:proofErr w:type="spellStart"/>
+      <w:r>
+        <w:rPr>
+          <w:sz w:val="24"/>
+        </w:rPr>
+        <w:t>Bảng</w:t>
+      </w:r>
+      <w:proofErr w:type="spellEnd"/>
+      <w:r>
+        <w:rPr>
+          <w:sz w:val="24"/>
+        </w:rPr>
+        <w:t xml:space="preserve"> </w:t>
+      </w:r>
+      <w:r>
+        <w:t>1</w:t>
+      </w:r>
+      <w:r>
+        <w:rPr>
+          <w:sz w:val="24"/>
+        </w:rPr>
+        <w:t xml:space="preserve">.8. Tham </w:t>
+      </w:r>
+      <w:proofErr w:type="spellStart"/>
+      <w:r>
+        <w:rPr>
+          <w:sz w:val="24"/>
+        </w:rPr>
+        <w:t>số</w:t>
+      </w:r>
+      <w:proofErr w:type="spellEnd"/>
+      <w:r>
+        <w:rPr>
+          <w:sz w:val="24"/>
+        </w:rPr>
+        <w:t xml:space="preserve"> </w:t>
+      </w:r>
+      <w:proofErr w:type="spellStart"/>
+      <w:r>
+        <w:rPr>
+          <w:sz w:val="24"/>
+        </w:rPr>
+        <w:t>mô</w:t>
+      </w:r>
+      <w:proofErr w:type="spellEnd"/>
+      <w:r>
+        <w:rPr>
+          <w:sz w:val="24"/>
+        </w:rPr>
+        <w:t xml:space="preserve"> </w:t>
+      </w:r>
+      <w:proofErr w:type="spellStart"/>
+      <w:r>
+        <w:rPr>
+          <w:sz w:val="24"/>
+        </w:rPr>
+        <w:t>hình</w:t>
+      </w:r>
+      <w:proofErr w:type="spellEnd"/>
+      <w:r>
+        <w:rPr>
+          <w:sz w:val="24"/>
+        </w:rPr>
+        <w:t xml:space="preserve"> </w:t>
+      </w:r>
+      <w:proofErr w:type="spellStart"/>
+      <w:r>
+        <w:rPr>
+          <w:sz w:val="24"/>
+        </w:rPr>
+        <w:t>cơ</w:t>
+      </w:r>
+      <w:proofErr w:type="spellEnd"/>
+      <w:r>
+        <w:rPr>
+          <w:sz w:val="24"/>
+        </w:rPr>
+        <w:t xml:space="preserve"> </w:t>
+      </w:r>
+      <w:proofErr w:type="spellStart"/>
+      <w:r>
+        <w:rPr>
+          <w:sz w:val="24"/>
+        </w:rPr>
+        <w:t>sở</w:t>
+      </w:r>
+      <w:proofErr w:type="spellEnd"/>
+      <w:r>
+        <w:rPr>
+          <w:sz w:val="24"/>
+        </w:rPr>
+        <w:t xml:space="preserve"> (</w:t>
+      </w:r>
+      <w:proofErr w:type="spellStart"/>
+      <w:r>
+        <w:rPr>
+          <w:sz w:val="24"/>
+        </w:rPr>
+        <w:t>giả</w:t>
+      </w:r>
+      <w:proofErr w:type="spellEnd"/>
+      <w:r>
+        <w:rPr>
+          <w:sz w:val="24"/>
+        </w:rPr>
+        <w:t xml:space="preserve"> </w:t>
+      </w:r>
+      <w:proofErr w:type="spellStart"/>
+      <w:r>
+        <w:rPr>
+          <w:sz w:val="24"/>
+        </w:rPr>
+        <w:t>định</w:t>
+      </w:r>
+      <w:proofErr w:type="spellEnd"/>
+      <w:r>
+        <w:rPr>
+          <w:sz w:val="24"/>
+        </w:rPr>
+        <w:t xml:space="preserve"> </w:t>
+      </w:r>
+      <w:proofErr w:type="spellStart"/>
+      <w:r>
+        <w:rPr>
+          <w:sz w:val="24"/>
+        </w:rPr>
+        <w:t>học</w:t>
+      </w:r>
+      <w:proofErr w:type="spellEnd"/>
+      <w:r>
+        <w:rPr>
+          <w:sz w:val="24"/>
+        </w:rPr>
+        <w:t xml:space="preserve"> </w:t>
+      </w:r>
+      <w:proofErr w:type="spellStart"/>
+      <w:r>
+        <w:rPr>
+          <w:sz w:val="24"/>
+        </w:rPr>
+        <w:t>thuật</w:t>
+      </w:r>
+      <w:proofErr w:type="spellEnd"/>
+      <w:r>
+        <w:rPr>
+          <w:sz w:val="24"/>
+        </w:rPr>
+        <w:t>)</w:t>
+      </w:r>
+    </w:p>
+    <w:p>
+      <w:pPr>
+        <w:jc w:val="center"/>
+      </w:pPr>
+    </w:p>
+    <w:p>
+      <w:proofErr w:type="spellStart"/>
+      <w:r>
+        <w:t>Với</w:t>
+      </w:r>
+      <w:proofErr w:type="spellEnd"/>
+      <w:r>
+        <w:t xml:space="preserve"> </w:t>
+      </w:r>
+      <w:proofErr w:type="spellStart"/>
+      <w:r>
+        <w:t>một</w:t>
+      </w:r>
+      <w:proofErr w:type="spellEnd"/>
+      <w:r>
+        <w:t xml:space="preserve"> </w:t>
+      </w:r>
+      <w:proofErr w:type="spellStart"/>
+      <w:r>
+        <w:t>vòng</w:t>
+      </w:r>
+      <w:proofErr w:type="spellEnd"/>
+      <w:r>
+        <w:t xml:space="preserve"> </w:t>
+      </w:r>
+      <w:proofErr w:type="spellStart"/>
+      <w:r>
+        <w:t>sửa</w:t>
+      </w:r>
+      <w:proofErr w:type="spellEnd"/>
+      <w:r>
+        <w:t xml:space="preserve"> </w:t>
+      </w:r>
+      <w:proofErr w:type="spellStart"/>
+      <w:r>
+        <w:t>tối</w:t>
+      </w:r>
+      <w:proofErr w:type="spellEnd"/>
+      <w:r>
+        <w:t xml:space="preserve"> </w:t>
+      </w:r>
+      <w:proofErr w:type="spellStart"/>
+      <w:r>
+        <w:t>đa</w:t>
+      </w:r>
+      <w:proofErr w:type="spellEnd"/>
+      <w:r>
+        <w:t>, processing time kỳ vọng và cycle time được tính trên cùng một mẫu số đơn hàng:</w:t>
+      </w:r>
+    </w:p>
+    <w:p>
+      <w:pPr>
+        <w:keepNext/>
+        <w:spacing w:before="40" w:after="40" w:line="240" w:lineRule="auto"/>
+        <w:jc w:val="center"/>
+      </w:pPr>
+      <w:r>
+        <w:t>PT = 4 + 2 + 0,08×(4 + 2) + 1,5 + 0,5 + 1 = 9,48 phút</w:t>
+      </w:r>
+    </w:p>
+    <w:p>
+      <w:pPr>
+        <w:keepNext/>
+        <w:spacing w:after="40" w:line="240" w:lineRule="auto"/>
+        <w:jc w:val="center"/>
+      </w:pPr>
+      <w:r>
+        <w:t>CT = PT + 3 = 12,48 phút</w:t>
+      </w:r>
+    </w:p>
+    <w:p>
+      <w:pPr>
+        <w:keepNext/>
+        <w:spacing w:after="120" w:line="240" w:lineRule="auto"/>
+        <w:jc w:val="center"/>
+      </w:pPr>
+      <w:r>
+        <w:t>Efficiency = PT / CT × 100% = 9,48 / 12,48 × 100% = 75,96%</w:t>
+      </w:r>
+    </w:p>
+    <w:p>
+      <w:pPr>
+        <w:spacing w:after="120" w:line="240" w:lineRule="auto"/>
+        <w:jc w:val="center"/>
+      </w:pPr>
+      <w:r>
+        <w:rPr>
+          <w:noProof/>
+        </w:rPr>
+        <w:drawing>
+          <wp:inline distT="0" distB="0" distL="0" distR="0" wp14:anchorId="5DF8AE9C" wp14:editId="284F8EB5">
+            <wp:extent cx="4752000" cy="2561948"/>
+            <wp:effectExtent l="0" t="0" r="0" b="0"/>
+            <wp:docPr id="3" name="Picture 3" descr="Sơ đồ định lượng hiển thị giả định kênh, công thức PT, CT, hiệu suất và ba kịch bản thời gian chờ." title="Hình 3.2.3. Mô hình thời gian và độ nhạy hàng đợi"/>
+            <wp:cNvGraphicFramePr>
+              <a:graphicFrameLocks xmlns:a="http://schemas.openxmlformats.org/drawingml/2006/main" noChangeAspect="1"/>
+            </wp:cNvGraphicFramePr>
+            <a:graphic xmlns:a="http://schemas.openxmlformats.org/drawingml/2006/main">
+              <a:graphicData uri="http://schemas.openxmlformats.org/drawingml/2006/picture">
+                <pic:pic xmlns:pic="http://schemas.openxmlformats.org/drawingml/2006/picture">
+                  <pic:nvPicPr>
+                    <pic:cNvPr id="0" name="quantitative_order_intake.png"/>
+                    <pic:cNvPicPr/>
+                  </pic:nvPicPr>
+                  <pic:blipFill>
+                    <a:blip r:embed="rId9"/>
+                    <a:stretch>
+                      <a:fillRect/>
+                    </a:stretch>
+                  </pic:blipFill>
+                  <pic:spPr>
+                    <a:xfrm>
+                      <a:off x="0" y="0"/>
+                      <a:ext cx="4752000" cy="2561948"/>
+                    </a:xfrm>
+                    <a:prstGeom prst="rect">
+                      <a:avLst/>
+                    </a:prstGeom>
+                  </pic:spPr>
+                </pic:pic>
+              </a:graphicData>
+            </a:graphic>
+          </wp:inline>
+        </w:drawing>
+      </w:r>
+    </w:p>
+    <w:p>
+      <w:pPr>
+        <w:pStyle w:val="Caption1"/>
+        <w:rPr>
+          <w:rFonts w:cs="Times New Roman"/>
+        </w:rPr>
+      </w:pPr>
+      <w:proofErr w:type="spellStart"/>
+      <w:r>
+        <w:rPr>
+          <w:rFonts w:cs="Times New Roman"/>
+        </w:rPr>
+        <w:t>Hình</w:t>
+      </w:r>
+      <w:proofErr w:type="spellEnd"/>
+      <w:r>
+        <w:rPr>
+          <w:rFonts w:cs="Times New Roman"/>
+        </w:rPr>
+        <w:t xml:space="preserve"> 1.3. </w:t>
+      </w:r>
+      <w:proofErr w:type="spellStart"/>
+      <w:r>
+        <w:rPr>
+          <w:rFonts w:cs="Times New Roman"/>
+        </w:rPr>
+        <w:t>Mô</w:t>
+      </w:r>
+      <w:proofErr w:type="spellEnd"/>
+      <w:r>
+        <w:rPr>
+          <w:rFonts w:cs="Times New Roman"/>
+        </w:rPr>
+        <w:t xml:space="preserve"> </w:t>
+      </w:r>
+      <w:proofErr w:type="spellStart"/>
+      <w:r>
+        <w:rPr>
+          <w:rFonts w:cs="Times New Roman"/>
+        </w:rPr>
+        <w:t>hình</w:t>
+      </w:r>
+      <w:proofErr w:type="spellEnd"/>
+      <w:r>
+        <w:rPr>
+          <w:rFonts w:cs="Times New Roman"/>
+        </w:rPr>
+        <w:t xml:space="preserve"> </w:t>
+      </w:r>
+      <w:proofErr w:type="spellStart"/>
+      <w:r>
+        <w:rPr>
+          <w:rFonts w:cs="Times New Roman"/>
+        </w:rPr>
+        <w:t>thời</w:t>
+      </w:r>
+      <w:proofErr w:type="spellEnd"/>
+      <w:r>
+        <w:rPr>
+          <w:rFonts w:cs="Times New Roman"/>
+        </w:rPr>
+        <w:t xml:space="preserve"> </w:t>
+      </w:r>
+      <w:proofErr w:type="spellStart"/>
+      <w:r>
+        <w:rPr>
+          <w:rFonts w:cs="Times New Roman"/>
+        </w:rPr>
+        <w:t>gian</w:t>
+      </w:r>
+      <w:proofErr w:type="spellEnd"/>
+      <w:r>
+        <w:rPr>
+          <w:rFonts w:cs="Times New Roman"/>
+        </w:rPr>
+        <w:t xml:space="preserve"> </w:t>
+      </w:r>
+      <w:proofErr w:type="spellStart"/>
+      <w:r>
+        <w:rPr>
+          <w:rFonts w:cs="Times New Roman"/>
+        </w:rPr>
+        <w:t>và</w:t>
+      </w:r>
+      <w:proofErr w:type="spellEnd"/>
+      <w:r>
+        <w:rPr>
+          <w:rFonts w:cs="Times New Roman"/>
+        </w:rPr>
+        <w:t xml:space="preserve"> </w:t>
+      </w:r>
+      <w:proofErr w:type="spellStart"/>
+      <w:r>
+        <w:rPr>
+          <w:rFonts w:cs="Times New Roman"/>
+        </w:rPr>
+        <w:t>độ</w:t>
+      </w:r>
+      <w:proofErr w:type="spellEnd"/>
+      <w:r>
+        <w:rPr>
+          <w:rFonts w:cs="Times New Roman"/>
+        </w:rPr>
+        <w:t xml:space="preserve"> </w:t>
+      </w:r>
+      <w:proofErr w:type="spellStart"/>
+      <w:r>
+        <w:rPr>
+          <w:rFonts w:cs="Times New Roman"/>
+        </w:rPr>
+        <w:t>nhạy</w:t>
+      </w:r>
+      <w:proofErr w:type="spellEnd"/>
+      <w:r>
+        <w:rPr>
+          <w:rFonts w:cs="Times New Roman"/>
+        </w:rPr>
+        <w:t xml:space="preserve"> </w:t>
+      </w:r>
+      <w:proofErr w:type="spellStart"/>
+      <w:r>
+        <w:rPr>
+          <w:rFonts w:cs="Times New Roman"/>
+        </w:rPr>
+        <w:t>hàng</w:t>
+      </w:r>
+      <w:proofErr w:type="spellEnd"/>
+      <w:r>
+        <w:rPr>
+          <w:rFonts w:cs="Times New Roman"/>
+        </w:rPr>
+        <w:t xml:space="preserve"> </w:t>
+      </w:r>
+      <w:proofErr w:type="spellStart"/>
+      <w:r>
+        <w:rPr>
+          <w:rFonts w:cs="Times New Roman"/>
+        </w:rPr>
+        <w:t>đợi</w:t>
+      </w:r>
+      <w:proofErr w:type="spellEnd"/>
+    </w:p>
+    <w:p>
+      <w:pPr>
+        <w:pStyle w:val="Caption1"/>
+        <w:jc w:val="both"/>
+        <w:rPr>
+          <w:rFonts w:cs="Times New Roman"/>
+        </w:rPr>
+      </w:pPr>
+    </w:p>
+    <w:tbl>
+      <w:tblPr>
+        <w:tblW w:w="8794" w:type="dxa"/>
+        <w:tblInd w:w="120" w:type="dxa"/>
+        <w:tblBorders>
+          <w:top w:val="single" w:sz="6" w:space="0" w:color="9EADBA"/>
+          <w:left w:val="single" w:sz="6" w:space="0" w:color="9EADBA"/>
+          <w:bottom w:val="single" w:sz="6" w:space="0" w:color="9EADBA"/>
+          <w:right w:val="single" w:sz="6" w:space="0" w:color="9EADBA"/>
+          <w:insideH w:val="single" w:sz="6" w:space="0" w:color="9EADBA"/>
+          <w:insideV w:val="single" w:sz="6" w:space="0" w:color="9EADBA"/>
+        </w:tblBorders>
+        <w:tblLayout w:type="fixed"/>
+        <w:tblLook w:val="04A0" w:firstRow="1" w:lastRow="0" w:firstColumn="1" w:lastColumn="0" w:noHBand="0" w:noVBand="1"/>
+      </w:tblPr>
+      <w:tblGrid>
+        <w:gridCol w:w="2950"/>
+        <w:gridCol w:w="2837"/>
+        <w:gridCol w:w="3007"/>
+      </w:tblGrid>
+      <w:tr>
+        <w:trPr>
+          <w:cantSplit/>
+          <w:tblHeader/>
+        </w:trPr>
+        <w:tc>
+          <w:tcPr>
+            <w:tcW w:w="2950" w:type="dxa"/>
+            <w:shd w:val="clear" w:color="auto" w:fill="DCE6F1"/>
+            <w:tcMar>
+              <w:top w:w="80" w:type="dxa"/>
+              <w:left w:w="120" w:type="dxa"/>
+              <w:bottom w:w="80" w:type="dxa"/>
+              <w:right w:w="120" w:type="dxa"/>
+            </w:tcMar>
+            <w:vAlign w:val="center"/>
+          </w:tcPr>
+          <w:p>
+            <w:pPr>
+              <w:keepNext/>
+              <w:spacing w:after="0" w:line="240" w:lineRule="auto"/>
+              <w:jc w:val="center"/>
+            </w:pPr>
+            <w:r>
+              <w:rPr>
+                <w:b/>
+                <w:sz w:val="22"/>
+              </w:rPr>
+              <w:t>Thời gian chờ giả định</w:t>
+            </w:r>
+          </w:p>
+        </w:tc>
+        <w:tc>
+          <w:tcPr>
+            <w:tcW w:w="2837" w:type="dxa"/>
+            <w:shd w:val="clear" w:color="auto" w:fill="DCE6F1"/>
+            <w:tcMar>
+              <w:top w:w="80" w:type="dxa"/>
+              <w:left w:w="120" w:type="dxa"/>
+              <w:bottom w:w="80" w:type="dxa"/>
+              <w:right w:w="120" w:type="dxa"/>
+            </w:tcMar>
+            <w:vAlign w:val="center"/>
+          </w:tcPr>
+          <w:p>
+            <w:pPr>
+              <w:keepNext/>
+              <w:spacing w:after="0" w:line="240" w:lineRule="auto"/>
+              <w:jc w:val="center"/>
+            </w:pPr>
+            <w:r>
+              <w:rPr>
+                <w:b/>
+                <w:sz w:val="22"/>
+              </w:rPr>
+              <w:t>CT (phút)</w:t>
+            </w:r>
+          </w:p>
+        </w:tc>
+        <w:tc>
+          <w:tcPr>
+            <w:tcW w:w="3007" w:type="dxa"/>
+            <w:shd w:val="clear" w:color="auto" w:fill="DCE6F1"/>
+            <w:tcMar>
+              <w:top w:w="80" w:type="dxa"/>
+              <w:left w:w="120" w:type="dxa"/>
+              <w:bottom w:w="80" w:type="dxa"/>
+              <w:right w:w="120" w:type="dxa"/>
+            </w:tcMar>
+            <w:vAlign w:val="center"/>
+          </w:tcPr>
+          <w:p>
+            <w:pPr>
+              <w:keepNext/>
+              <w:spacing w:after="0" w:line="240" w:lineRule="auto"/>
+              <w:jc w:val="center"/>
+            </w:pPr>
+            <w:r>
+              <w:rPr>
+                <w:b/>
+                <w:sz w:val="22"/>
+              </w:rPr>
+              <w:t>Hiệu suất PT/CT</w:t>
+            </w:r>
+          </w:p>
+        </w:tc>
+      </w:tr>
+      <w:tr>
+        <w:trPr>
+          <w:cantSplit/>
+        </w:trPr>
+        <w:tc>
+          <w:tcPr>
+            <w:tcW w:w="2950" w:type="dxa"/>
+            <w:tcMar>
+              <w:top w:w="80" w:type="dxa"/>
+              <w:left w:w="120" w:type="dxa"/>
+              <w:bottom w:w="80" w:type="dxa"/>
+              <w:right w:w="120" w:type="dxa"/>
+            </w:tcMar>
+            <w:vAlign w:val="center"/>
+          </w:tcPr>
+          <w:p>
+            <w:pPr>
+              <w:spacing w:after="0" w:line="240" w:lineRule="auto"/>
+              <w:jc w:val="center"/>
+            </w:pPr>
+            <w:r>
+              <w:rPr>
+                <w:sz w:val="22"/>
+              </w:rPr>
+              <w:t>1 phút</w:t>
+            </w:r>
+          </w:p>
+        </w:tc>
+        <w:tc>
+          <w:tcPr>
+            <w:tcW w:w="2837" w:type="dxa"/>
+            <w:tcMar>
+              <w:top w:w="80" w:type="dxa"/>
+              <w:left w:w="120" w:type="dxa"/>
+              <w:bottom w:w="80" w:type="dxa"/>
+              <w:right w:w="120" w:type="dxa"/>
+            </w:tcMar>
+            <w:vAlign w:val="center"/>
+          </w:tcPr>
+          <w:p>
+            <w:pPr>
+              <w:spacing w:after="0" w:line="240" w:lineRule="auto"/>
+              <w:jc w:val="left"/>
+            </w:pPr>
+            <w:r>
+              <w:rPr>
+                <w:sz w:val="22"/>
+              </w:rPr>
+              <w:t>10,48</w:t>
+            </w:r>
+          </w:p>
+        </w:tc>
+        <w:tc>
+          <w:tcPr>
+            <w:tcW w:w="3007" w:type="dxa"/>
+            <w:tcMar>
+              <w:top w:w="80" w:type="dxa"/>
+              <w:left w:w="120" w:type="dxa"/>
+              <w:bottom w:w="80" w:type="dxa"/>
+              <w:right w:w="120" w:type="dxa"/>
+            </w:tcMar>
+            <w:vAlign w:val="center"/>
+          </w:tcPr>
+          <w:p>
+            <w:pPr>
+              <w:spacing w:after="0" w:line="240" w:lineRule="auto"/>
+              <w:jc w:val="left"/>
+            </w:pPr>
+            <w:r>
+              <w:rPr>
+                <w:sz w:val="22"/>
+              </w:rPr>
+              <w:t>90,46%</w:t>
+            </w:r>
+          </w:p>
+        </w:tc>
+      </w:tr>
+      <w:tr>
+        <w:trPr>
+          <w:cantSplit/>
+        </w:trPr>
+        <w:tc>
+          <w:tcPr>
+            <w:tcW w:w="2950" w:type="dxa"/>
+            <w:tcMar>
+              <w:top w:w="80" w:type="dxa"/>
+              <w:left w:w="120" w:type="dxa"/>
+              <w:bottom w:w="80" w:type="dxa"/>
+              <w:right w:w="120" w:type="dxa"/>
+            </w:tcMar>
+            <w:vAlign w:val="center"/>
+          </w:tcPr>
+          <w:p>
+            <w:pPr>
+              <w:spacing w:after="0" w:line="240" w:lineRule="auto"/>
+              <w:jc w:val="center"/>
+            </w:pPr>
+            <w:r>
+              <w:rPr>
+                <w:sz w:val="22"/>
+              </w:rPr>
+              <w:t>3 phút (cơ sở)</w:t>
+            </w:r>
+          </w:p>
+        </w:tc>
+        <w:tc>
+          <w:tcPr>
+            <w:tcW w:w="2837" w:type="dxa"/>
+            <w:tcMar>
+              <w:top w:w="80" w:type="dxa"/>
+              <w:left w:w="120" w:type="dxa"/>
+              <w:bottom w:w="80" w:type="dxa"/>
+              <w:right w:w="120" w:type="dxa"/>
+            </w:tcMar>
+            <w:vAlign w:val="center"/>
+          </w:tcPr>
+          <w:p>
+            <w:pPr>
+              <w:spacing w:after="0" w:line="240" w:lineRule="auto"/>
+              <w:jc w:val="left"/>
+            </w:pPr>
+            <w:r>
+              <w:rPr>
+                <w:sz w:val="22"/>
+              </w:rPr>
+              <w:t>12,48</w:t>
+            </w:r>
+          </w:p>
+        </w:tc>
+        <w:tc>
+          <w:tcPr>
+            <w:tcW w:w="3007" w:type="dxa"/>
+            <w:tcMar>
+              <w:top w:w="80" w:type="dxa"/>
+              <w:left w:w="120" w:type="dxa"/>
+              <w:bottom w:w="80" w:type="dxa"/>
+              <w:right w:w="120" w:type="dxa"/>
+            </w:tcMar>
+            <w:vAlign w:val="center"/>
+          </w:tcPr>
+          <w:p>
+            <w:pPr>
+              <w:spacing w:after="0" w:line="240" w:lineRule="auto"/>
+              <w:jc w:val="left"/>
+            </w:pPr>
+            <w:r>
+              <w:rPr>
+                <w:sz w:val="22"/>
+              </w:rPr>
+              <w:t>75,96%</w:t>
+            </w:r>
+          </w:p>
+        </w:tc>
+      </w:tr>
+      <w:tr>
+        <w:trPr>
+          <w:cantSplit/>
+        </w:trPr>
+        <w:tc>
+          <w:tcPr>
+            <w:tcW w:w="2950" w:type="dxa"/>
+            <w:tcMar>
+              <w:top w:w="80" w:type="dxa"/>
+              <w:left w:w="120" w:type="dxa"/>
+              <w:bottom w:w="80" w:type="dxa"/>
+              <w:right w:w="120" w:type="dxa"/>
+            </w:tcMar>
+            <w:vAlign w:val="center"/>
+          </w:tcPr>
+          <w:p>
+            <w:pPr>
+              <w:spacing w:after="0" w:line="240" w:lineRule="auto"/>
+              <w:jc w:val="center"/>
+            </w:pPr>
+            <w:r>
+              <w:rPr>
+                <w:sz w:val="22"/>
+              </w:rPr>
+              <w:t>10 phút</w:t>
+            </w:r>
+          </w:p>
+        </w:tc>
+        <w:tc>
+          <w:tcPr>
+            <w:tcW w:w="2837" w:type="dxa"/>
+            <w:tcMar>
+              <w:top w:w="80" w:type="dxa"/>
+              <w:left w:w="120" w:type="dxa"/>
+              <w:bottom w:w="80" w:type="dxa"/>
+              <w:right w:w="120" w:type="dxa"/>
+            </w:tcMar>
+            <w:vAlign w:val="center"/>
+          </w:tcPr>
+          <w:p>
+            <w:pPr>
+              <w:spacing w:after="0" w:line="240" w:lineRule="auto"/>
+              <w:jc w:val="left"/>
+            </w:pPr>
+            <w:r>
+              <w:rPr>
+                <w:sz w:val="22"/>
+              </w:rPr>
+              <w:t>19,48</w:t>
+            </w:r>
+          </w:p>
+        </w:tc>
+        <w:tc>
+          <w:tcPr>
+            <w:tcW w:w="3007" w:type="dxa"/>
+            <w:tcMar>
+              <w:top w:w="80" w:type="dxa"/>
+              <w:left w:w="120" w:type="dxa"/>
+              <w:bottom w:w="80" w:type="dxa"/>
+              <w:right w:w="120" w:type="dxa"/>
+            </w:tcMar>
+            <w:vAlign w:val="center"/>
+          </w:tcPr>
+          <w:p>
+            <w:pPr>
+              <w:spacing w:after="0" w:line="240" w:lineRule="auto"/>
+              <w:jc w:val="left"/>
+            </w:pPr>
+            <w:r>
+              <w:rPr>
+                <w:sz w:val="22"/>
+              </w:rPr>
+              <w:t>48,67%</w:t>
+            </w:r>
+          </w:p>
+        </w:tc>
+      </w:tr>
+    </w:tbl>
+    <w:p>
+      <w:pPr>
+        <w:jc w:val="center"/>
+      </w:pPr>
+      <w:proofErr w:type="spellStart"/>
+      <w:r>
+        <w:rPr>
+          <w:sz w:val="24"/>
+        </w:rPr>
+        <w:t>Bảng</w:t>
+      </w:r>
+      <w:proofErr w:type="spellEnd"/>
+      <w:r>
+        <w:rPr>
+          <w:sz w:val="24"/>
+        </w:rPr>
+        <w:t xml:space="preserve"> </w:t>
+      </w:r>
+      <w:r>
+        <w:t>1</w:t>
+      </w:r>
+      <w:r>
+        <w:rPr>
+          <w:sz w:val="24"/>
+        </w:rPr>
+        <w:t xml:space="preserve">.9. </w:t>
+      </w:r>
+      <w:proofErr w:type="spellStart"/>
+      <w:r>
+        <w:rPr>
+          <w:sz w:val="24"/>
+        </w:rPr>
+        <w:t>Phân</w:t>
+      </w:r>
+      <w:proofErr w:type="spellEnd"/>
+      <w:r>
+        <w:rPr>
+          <w:sz w:val="24"/>
+        </w:rPr>
+        <w:t xml:space="preserve"> </w:t>
+      </w:r>
+      <w:proofErr w:type="spellStart"/>
+      <w:r>
+        <w:rPr>
+          <w:sz w:val="24"/>
+        </w:rPr>
+        <w:t>tích</w:t>
+      </w:r>
+      <w:proofErr w:type="spellEnd"/>
+      <w:r>
+        <w:rPr>
+          <w:sz w:val="24"/>
+        </w:rPr>
+        <w:t xml:space="preserve"> </w:t>
+      </w:r>
+      <w:proofErr w:type="spellStart"/>
+      <w:r>
+        <w:rPr>
+          <w:sz w:val="24"/>
+        </w:rPr>
+        <w:t>nhạy</w:t>
+      </w:r>
+      <w:proofErr w:type="spellEnd"/>
+      <w:r>
+        <w:rPr>
+          <w:sz w:val="24"/>
+        </w:rPr>
+        <w:t xml:space="preserve"> </w:t>
+      </w:r>
+      <w:proofErr w:type="spellStart"/>
+      <w:r>
+        <w:rPr>
+          <w:sz w:val="24"/>
+        </w:rPr>
+        <w:t>cảm</w:t>
+      </w:r>
+      <w:proofErr w:type="spellEnd"/>
+      <w:r>
+        <w:rPr>
+          <w:sz w:val="24"/>
+        </w:rPr>
+        <w:t xml:space="preserve"> </w:t>
+      </w:r>
+      <w:proofErr w:type="spellStart"/>
+      <w:r>
+        <w:rPr>
+          <w:sz w:val="24"/>
+        </w:rPr>
+        <w:t>theo</w:t>
+      </w:r>
+      <w:proofErr w:type="spellEnd"/>
+      <w:r>
+        <w:rPr>
+          <w:sz w:val="24"/>
+        </w:rPr>
+        <w:t xml:space="preserve"> </w:t>
+      </w:r>
+      <w:proofErr w:type="spellStart"/>
+      <w:r>
+        <w:rPr>
+          <w:sz w:val="24"/>
+        </w:rPr>
+        <w:t>thời</w:t>
+      </w:r>
+      <w:proofErr w:type="spellEnd"/>
+      <w:r>
+        <w:rPr>
+          <w:sz w:val="24"/>
+        </w:rPr>
+        <w:t xml:space="preserve"> </w:t>
+      </w:r>
+      <w:proofErr w:type="spellStart"/>
+      <w:r>
+        <w:rPr>
+          <w:sz w:val="24"/>
+        </w:rPr>
+        <w:t>gian</w:t>
+      </w:r>
+      <w:proofErr w:type="spellEnd"/>
+      <w:r>
+        <w:rPr>
+          <w:sz w:val="24"/>
+        </w:rPr>
+        <w:t xml:space="preserve"> </w:t>
+      </w:r>
+      <w:proofErr w:type="spellStart"/>
+      <w:r>
+        <w:rPr>
+          <w:sz w:val="24"/>
+        </w:rPr>
+        <w:t>chờ</w:t>
+      </w:r>
+      <w:proofErr w:type="spellEnd"/>
+    </w:p>
+    <w:p>
+      <w:r>
+        <w:t xml:space="preserve">Khi </w:t>
+      </w:r>
+      <w:proofErr w:type="spellStart"/>
+      <w:r>
+        <w:t>thời</w:t>
+      </w:r>
+      <w:proofErr w:type="spellEnd"/>
+      <w:r>
+        <w:t xml:space="preserve"> </w:t>
+      </w:r>
+      <w:proofErr w:type="spellStart"/>
+      <w:r>
+        <w:t>gian</w:t>
+      </w:r>
+      <w:proofErr w:type="spellEnd"/>
+      <w:r>
+        <w:t xml:space="preserve"> </w:t>
+      </w:r>
+      <w:proofErr w:type="spellStart"/>
+      <w:r>
+        <w:t>chờ</w:t>
+      </w:r>
+      <w:proofErr w:type="spellEnd"/>
+      <w:r>
+        <w:t xml:space="preserve"> </w:t>
+      </w:r>
+      <w:proofErr w:type="spellStart"/>
+      <w:r>
+        <w:t>tăng</w:t>
+      </w:r>
+      <w:proofErr w:type="spellEnd"/>
+      <w:r>
+        <w:t xml:space="preserve"> từ 3 lên 10 phút, cycle time tăng 7 phút và hiệu suất giảm mạnh. Mô hình chưa tính vận chuyển, nhận kiện, ca nhân sự hay lỗi thực tế; cần thay giả định bằng log OMS/API và dữ liệu quầy trước </w:t>
+      </w:r>
+      <w:proofErr w:type="spellStart"/>
+      <w:r>
+        <w:t>khi</w:t>
+      </w:r>
+      <w:proofErr w:type="spellEnd"/>
+      <w:r>
+        <w:t xml:space="preserve"> </w:t>
+      </w:r>
+      <w:proofErr w:type="spellStart"/>
+      <w:r>
+        <w:t>dùng</w:t>
+      </w:r>
+      <w:proofErr w:type="spellEnd"/>
+      <w:r>
+        <w:t xml:space="preserve"> </w:t>
+      </w:r>
+      <w:proofErr w:type="spellStart"/>
+      <w:r>
+        <w:t>cho</w:t>
+      </w:r>
+      <w:proofErr w:type="spellEnd"/>
+      <w:r>
+        <w:t xml:space="preserve"> </w:t>
+      </w:r>
+      <w:proofErr w:type="spellStart"/>
+      <w:r>
+        <w:t>quyết</w:t>
+      </w:r>
+      <w:proofErr w:type="spellEnd"/>
+      <w:r>
+        <w:t xml:space="preserve"> </w:t>
+      </w:r>
+      <w:proofErr w:type="spellStart"/>
+      <w:r>
+        <w:t>định</w:t>
+      </w:r>
+      <w:proofErr w:type="spellEnd"/>
+      <w:r>
+        <w:t xml:space="preserve"> </w:t>
+      </w:r>
+      <w:proofErr w:type="spellStart"/>
+      <w:r>
+        <w:t>vận</w:t>
+      </w:r>
+      <w:proofErr w:type="spellEnd"/>
+      <w:r>
+        <w:t xml:space="preserve"> </w:t>
+      </w:r>
+      <w:proofErr w:type="spellStart"/>
+      <w:r>
+        <w:t>hành</w:t>
+      </w:r>
+      <w:proofErr w:type="spellEnd"/>
+      <w:r>
+        <w:t>.</w:t>
+      </w:r>
+    </w:p>
     <w:sectPr>
-      <w:footerReference w:type="even" r:id="rId9"/>
-      <w:footerReference w:type="default" r:id="rId10"/>
-      <w:footerReference w:type="first" r:id="rId11"/>
+      <w:footerReference w:type="even" r:id="rId10"/>
+      <w:footerReference w:type="default" r:id="rId11"/>
+      <w:footerReference w:type="first" r:id="rId12"/>
       <w:pgSz w:w="11906" w:h="16838"/>
       <w:pgMar w:top="1712" w:right="1128" w:bottom="1599" w:left="1984" w:header="720" w:footer="697" w:gutter="0"/>
       <w:pgNumType w:start="1"/>

</xml_diff>